<commit_message>
añadidos colores de autoevaluacion
</commit_message>
<xml_diff>
--- a/Fase 1/Evidencias Individuales/Castro_Pablo_1.3_APT122_AutoevaluaciónFase1.docx
+++ b/Fase 1/Evidencias Individuales/Castro_Pablo_1.3_APT122_AutoevaluaciónFase1.docx
@@ -82,8 +82,8 @@
       <w:tblGrid>
         <w:gridCol w:w="1836"/>
         <w:gridCol w:w="6244"/>
-        <w:gridCol w:w="2695"/>
-        <w:gridCol w:w="2228"/>
+        <w:gridCol w:w="2696"/>
+        <w:gridCol w:w="2227"/>
       </w:tblGrid>
       <w:tr>
         <w:trPr>
@@ -167,7 +167,7 @@
         </w:tc>
         <w:tc>
           <w:tcPr>
-            <w:tcW w:w="2695" w:type="dxa"/>
+            <w:tcW w:w="2696" w:type="dxa"/>
             <w:tcBorders>
               <w:top w:val="single" w:sz="4" w:space="0" w:color="7F7F7F"/>
               <w:left w:val="single" w:sz="4" w:space="0" w:color="7F7F7F"/>
@@ -205,7 +205,7 @@
         </w:tc>
         <w:tc>
           <w:tcPr>
-            <w:tcW w:w="2228" w:type="dxa"/>
+            <w:tcW w:w="2227" w:type="dxa"/>
             <w:tcBorders>
               <w:top w:val="single" w:sz="4" w:space="0" w:color="7F7F7F"/>
               <w:left w:val="single" w:sz="4" w:space="0" w:color="7F7F7F"/>
@@ -320,7 +320,7 @@
         </w:tc>
         <w:tc>
           <w:tcPr>
-            <w:tcW w:w="2695" w:type="dxa"/>
+            <w:tcW w:w="2696" w:type="dxa"/>
             <w:tcBorders>
               <w:top w:val="single" w:sz="4" w:space="0" w:color="7F7F7F"/>
               <w:left w:val="single" w:sz="4" w:space="0" w:color="7F7F7F"/>
@@ -357,7 +357,7 @@
         </w:tc>
         <w:tc>
           <w:tcPr>
-            <w:tcW w:w="2228" w:type="dxa"/>
+            <w:tcW w:w="2227" w:type="dxa"/>
             <w:tcBorders>
               <w:top w:val="single" w:sz="4" w:space="0" w:color="7F7F7F"/>
               <w:left w:val="single" w:sz="4" w:space="0" w:color="7F7F7F"/>
@@ -474,8 +474,8 @@
       <w:tblGrid>
         <w:gridCol w:w="561"/>
         <w:gridCol w:w="2052"/>
-        <w:gridCol w:w="566"/>
-        <w:gridCol w:w="568"/>
+        <w:gridCol w:w="565"/>
+        <w:gridCol w:w="569"/>
         <w:gridCol w:w="1984"/>
         <w:gridCol w:w="566"/>
         <w:gridCol w:w="567"/>
@@ -497,6 +497,7 @@
             <w:pPr>
               <w:pStyle w:val="Footer"/>
               <w:widowControl/>
+              <w:suppressAutoHyphens w:val="true"/>
               <w:spacing w:before="120" w:after="120"/>
               <w:jc w:val="center"/>
               <w:rPr>
@@ -514,10 +515,8 @@
                 <w:b/>
                 <w:bCs/>
                 <w:color w:themeColor="text1" w:val="000000"/>
-                <w:kern w:val="0"/>
-                <w:sz w:val="22"/>
-                <w:szCs w:val="22"/>
-                <w:lang w:bidi="ar-SA"/>
+                <w:sz w:val="22"/>
+                <w:szCs w:val="22"/>
               </w:rPr>
             </w:r>
           </w:p>
@@ -542,6 +541,7 @@
                 <w:tab w:val="clear" w:pos="4419"/>
                 <w:tab w:val="clear" w:pos="8838"/>
               </w:tabs>
+              <w:suppressAutoHyphens w:val="true"/>
               <w:spacing w:before="120" w:after="120"/>
               <w:jc w:val="center"/>
               <w:rPr>
@@ -570,7 +570,7 @@
         </w:tc>
         <w:tc>
           <w:tcPr>
-            <w:tcW w:w="566" w:type="dxa"/>
+            <w:tcW w:w="565" w:type="dxa"/>
             <w:tcBorders>
               <w:top w:val="nil"/>
               <w:left w:val="single" w:sz="4" w:space="0" w:color="808080"/>
@@ -587,6 +587,7 @@
                 <w:tab w:val="clear" w:pos="4419"/>
                 <w:tab w:val="clear" w:pos="8838"/>
               </w:tabs>
+              <w:suppressAutoHyphens w:val="true"/>
               <w:spacing w:before="120" w:after="120"/>
               <w:jc w:val="center"/>
               <w:rPr>
@@ -604,17 +605,15 @@
                 <w:b/>
                 <w:bCs/>
                 <w:color w:themeColor="background1" w:val="FFFFFF"/>
-                <w:kern w:val="0"/>
-                <w:sz w:val="22"/>
-                <w:szCs w:val="22"/>
-                <w:lang w:bidi="ar-SA"/>
-              </w:rPr>
-            </w:r>
-          </w:p>
-        </w:tc>
-        <w:tc>
-          <w:tcPr>
-            <w:tcW w:w="568" w:type="dxa"/>
+                <w:sz w:val="22"/>
+                <w:szCs w:val="22"/>
+              </w:rPr>
+            </w:r>
+          </w:p>
+        </w:tc>
+        <w:tc>
+          <w:tcPr>
+            <w:tcW w:w="569" w:type="dxa"/>
             <w:tcBorders>
               <w:top w:val="single" w:sz="4" w:space="0" w:color="808080"/>
               <w:left w:val="single" w:sz="4" w:space="0" w:color="808080"/>
@@ -631,6 +630,7 @@
                 <w:tab w:val="clear" w:pos="4419"/>
                 <w:tab w:val="clear" w:pos="8838"/>
               </w:tabs>
+              <w:suppressAutoHyphens w:val="true"/>
               <w:spacing w:before="120" w:after="120"/>
               <w:jc w:val="center"/>
               <w:rPr>
@@ -648,10 +648,8 @@
                 <w:b/>
                 <w:bCs/>
                 <w:color w:val="auto"/>
-                <w:kern w:val="0"/>
-                <w:sz w:val="22"/>
-                <w:szCs w:val="22"/>
-                <w:lang w:bidi="ar-SA"/>
+                <w:sz w:val="22"/>
+                <w:szCs w:val="22"/>
               </w:rPr>
             </w:r>
           </w:p>
@@ -676,6 +674,7 @@
                 <w:tab w:val="clear" w:pos="4419"/>
                 <w:tab w:val="clear" w:pos="8838"/>
               </w:tabs>
+              <w:suppressAutoHyphens w:val="true"/>
               <w:spacing w:before="120" w:after="120"/>
               <w:jc w:val="center"/>
               <w:rPr>
@@ -721,6 +720,7 @@
                 <w:tab w:val="clear" w:pos="4419"/>
                 <w:tab w:val="clear" w:pos="8838"/>
               </w:tabs>
+              <w:suppressAutoHyphens w:val="true"/>
               <w:spacing w:before="120" w:after="120"/>
               <w:jc w:val="center"/>
               <w:rPr>
@@ -738,10 +738,8 @@
                 <w:b/>
                 <w:bCs/>
                 <w:color w:themeColor="background1" w:val="FFFFFF"/>
-                <w:kern w:val="0"/>
-                <w:sz w:val="22"/>
-                <w:szCs w:val="22"/>
-                <w:lang w:bidi="ar-SA"/>
+                <w:sz w:val="22"/>
+                <w:szCs w:val="22"/>
               </w:rPr>
             </w:r>
           </w:p>
@@ -765,6 +763,7 @@
                 <w:tab w:val="clear" w:pos="4419"/>
                 <w:tab w:val="clear" w:pos="8838"/>
               </w:tabs>
+              <w:suppressAutoHyphens w:val="true"/>
               <w:spacing w:before="120" w:after="120"/>
               <w:jc w:val="center"/>
               <w:rPr>
@@ -811,6 +810,7 @@
                 <w:tab w:val="clear" w:pos="4419"/>
                 <w:tab w:val="clear" w:pos="8838"/>
               </w:tabs>
+              <w:suppressAutoHyphens w:val="true"/>
               <w:spacing w:before="120" w:after="120"/>
               <w:jc w:val="center"/>
               <w:rPr>
@@ -945,6 +945,7 @@
                 <w:tab w:val="clear" w:pos="4419"/>
                 <w:tab w:val="clear" w:pos="8838"/>
               </w:tabs>
+              <w:suppressAutoHyphens w:val="true"/>
               <w:spacing w:before="40" w:after="0"/>
               <w:jc w:val="center"/>
               <w:rPr>
@@ -987,6 +988,7 @@
                 <w:tab w:val="clear" w:pos="4419"/>
                 <w:tab w:val="clear" w:pos="8838"/>
               </w:tabs>
+              <w:suppressAutoHyphens w:val="true"/>
               <w:spacing w:before="40" w:after="0"/>
               <w:jc w:val="center"/>
               <w:rPr>
@@ -1029,6 +1031,7 @@
                 <w:tab w:val="clear" w:pos="4419"/>
                 <w:tab w:val="clear" w:pos="8838"/>
               </w:tabs>
+              <w:suppressAutoHyphens w:val="true"/>
               <w:spacing w:before="40" w:after="0"/>
               <w:jc w:val="center"/>
               <w:rPr>
@@ -1071,6 +1074,7 @@
                 <w:tab w:val="clear" w:pos="4419"/>
                 <w:tab w:val="clear" w:pos="8838"/>
               </w:tabs>
+              <w:suppressAutoHyphens w:val="true"/>
               <w:spacing w:before="40" w:after="0"/>
               <w:jc w:val="center"/>
               <w:rPr>
@@ -1112,6 +1116,7 @@
                 <w:tab w:val="clear" w:pos="4419"/>
                 <w:tab w:val="clear" w:pos="8838"/>
               </w:tabs>
+              <w:suppressAutoHyphens w:val="true"/>
               <w:spacing w:before="40" w:after="0"/>
               <w:jc w:val="center"/>
               <w:rPr>
@@ -1155,6 +1160,7 @@
             <w:pPr>
               <w:pStyle w:val="Normal"/>
               <w:widowControl/>
+              <w:suppressAutoHyphens w:val="true"/>
               <w:spacing w:before="40" w:after="0"/>
               <w:jc w:val="both"/>
               <w:rPr>
@@ -1174,13 +1180,14 @@
                 <w:kern w:val="0"/>
                 <w:lang w:eastAsia="ja-JP" w:bidi="ar-SA"/>
               </w:rPr>
-              <w:t xml:space="preserve">RA1 </w:t>
-            </w:r>
-          </w:p>
-          <w:p>
-            <w:pPr>
-              <w:pStyle w:val="Normal"/>
-              <w:widowControl/>
+              <w:t>RA1</w:t>
+            </w:r>
+          </w:p>
+          <w:p>
+            <w:pPr>
+              <w:pStyle w:val="Normal"/>
+              <w:widowControl/>
+              <w:suppressAutoHyphens w:val="true"/>
               <w:spacing w:before="40" w:after="0"/>
               <w:jc w:val="both"/>
               <w:rPr>
@@ -1216,6 +1223,7 @@
             <w:pPr>
               <w:pStyle w:val="Normal"/>
               <w:widowControl/>
+              <w:suppressAutoHyphens w:val="true"/>
               <w:spacing w:before="40" w:after="0"/>
               <w:jc w:val="both"/>
               <w:rPr>
@@ -1245,6 +1253,7 @@
                 <w:tab w:val="clear" w:pos="4419"/>
                 <w:tab w:val="clear" w:pos="8838"/>
               </w:tabs>
+              <w:suppressAutoHyphens w:val="true"/>
               <w:spacing w:before="40" w:after="0"/>
               <w:jc w:val="both"/>
               <w:rPr>
@@ -1282,6 +1291,7 @@
                 <w:tab w:val="clear" w:pos="4419"/>
                 <w:tab w:val="clear" w:pos="8838"/>
               </w:tabs>
+              <w:suppressAutoHyphens w:val="true"/>
               <w:spacing w:before="40" w:after="0"/>
               <w:jc w:val="both"/>
               <w:rPr>
@@ -1320,6 +1330,7 @@
                 <w:tab w:val="clear" w:pos="4419"/>
                 <w:tab w:val="clear" w:pos="8838"/>
               </w:tabs>
+              <w:suppressAutoHyphens w:val="true"/>
               <w:spacing w:before="40" w:after="0"/>
               <w:jc w:val="center"/>
               <w:rPr>
@@ -1357,6 +1368,7 @@
                 <w:tab w:val="clear" w:pos="4419"/>
                 <w:tab w:val="clear" w:pos="8838"/>
               </w:tabs>
+              <w:suppressAutoHyphens w:val="true"/>
               <w:spacing w:before="40" w:after="0"/>
               <w:jc w:val="center"/>
               <w:rPr>
@@ -1399,6 +1411,7 @@
             <w:pPr>
               <w:pStyle w:val="Normal"/>
               <w:widowControl/>
+              <w:suppressAutoHyphens w:val="true"/>
               <w:spacing w:before="40" w:after="0"/>
               <w:jc w:val="both"/>
               <w:rPr>
@@ -1413,8 +1426,7 @@
                 <w:rFonts w:cs="Calibri" w:ascii="Calibri" w:hAnsi="Calibri"/>
                 <w:bCs/>
                 <w:color w:themeColor="background2" w:themeShade="40" w:val="3B3838"/>
-                <w:kern w:val="0"/>
-                <w:lang w:eastAsia="ja-JP" w:bidi="ar-SA"/>
+                <w:lang w:eastAsia="ja-JP"/>
               </w:rPr>
             </w:r>
           </w:p>
@@ -1435,6 +1447,7 @@
             <w:pPr>
               <w:pStyle w:val="Normal"/>
               <w:widowControl/>
+              <w:suppressAutoHyphens w:val="true"/>
               <w:spacing w:before="40" w:after="0"/>
               <w:jc w:val="left"/>
               <w:rPr>
@@ -1448,8 +1461,6 @@
                 <w:rFonts w:cs="Calibri" w:ascii="Calibri" w:hAnsi="Calibri"/>
                 <w:b/>
                 <w:color w:themeColor="background2" w:themeShade="40" w:val="3B3838"/>
-                <w:kern w:val="0"/>
-                <w:lang w:bidi="ar-SA"/>
               </w:rPr>
             </w:r>
           </w:p>
@@ -1473,6 +1484,7 @@
                 <w:tab w:val="clear" w:pos="4419"/>
                 <w:tab w:val="clear" w:pos="8838"/>
               </w:tabs>
+              <w:suppressAutoHyphens w:val="true"/>
               <w:spacing w:before="40" w:after="0"/>
               <w:jc w:val="both"/>
               <w:rPr>
@@ -1511,6 +1523,7 @@
                 <w:tab w:val="clear" w:pos="4419"/>
                 <w:tab w:val="clear" w:pos="8838"/>
               </w:tabs>
+              <w:suppressAutoHyphens w:val="true"/>
               <w:spacing w:before="40" w:after="0"/>
               <w:jc w:val="center"/>
               <w:rPr>
@@ -1524,8 +1537,6 @@
                 <w:rFonts w:cs="Calibri" w:ascii="Calibri" w:hAnsi="Calibri"/>
                 <w:bCs/>
                 <w:color w:themeColor="background2" w:themeShade="40" w:val="3B3838"/>
-                <w:kern w:val="0"/>
-                <w:lang w:bidi="ar-SA"/>
               </w:rPr>
             </w:r>
           </w:p>
@@ -1549,6 +1560,7 @@
                 <w:tab w:val="clear" w:pos="4419"/>
                 <w:tab w:val="clear" w:pos="8838"/>
               </w:tabs>
+              <w:suppressAutoHyphens w:val="true"/>
               <w:spacing w:before="40" w:after="0"/>
               <w:jc w:val="center"/>
               <w:rPr>
@@ -1591,6 +1603,7 @@
             <w:pPr>
               <w:pStyle w:val="Normal"/>
               <w:widowControl/>
+              <w:suppressAutoHyphens w:val="true"/>
               <w:spacing w:before="40" w:after="0"/>
               <w:jc w:val="both"/>
               <w:rPr>
@@ -1605,8 +1618,7 @@
                 <w:rFonts w:cs="Calibri" w:ascii="Calibri" w:hAnsi="Calibri"/>
                 <w:bCs/>
                 <w:color w:themeColor="background2" w:themeShade="40" w:val="3B3838"/>
-                <w:kern w:val="0"/>
-                <w:lang w:eastAsia="ja-JP" w:bidi="ar-SA"/>
+                <w:lang w:eastAsia="ja-JP"/>
               </w:rPr>
             </w:r>
           </w:p>
@@ -1627,6 +1639,7 @@
             <w:pPr>
               <w:pStyle w:val="Normal"/>
               <w:widowControl/>
+              <w:suppressAutoHyphens w:val="true"/>
               <w:spacing w:before="40" w:after="0"/>
               <w:jc w:val="left"/>
               <w:rPr>
@@ -1640,8 +1653,6 @@
                 <w:rFonts w:cs="Calibri" w:ascii="Calibri" w:hAnsi="Calibri"/>
                 <w:b/>
                 <w:color w:themeColor="background2" w:themeShade="40" w:val="3B3838"/>
-                <w:kern w:val="0"/>
-                <w:lang w:bidi="ar-SA"/>
               </w:rPr>
             </w:r>
           </w:p>
@@ -1665,6 +1676,7 @@
                 <w:tab w:val="clear" w:pos="4419"/>
                 <w:tab w:val="clear" w:pos="8838"/>
               </w:tabs>
+              <w:suppressAutoHyphens w:val="true"/>
               <w:spacing w:before="40" w:after="0"/>
               <w:jc w:val="both"/>
               <w:rPr>
@@ -1703,6 +1715,7 @@
                 <w:tab w:val="clear" w:pos="4419"/>
                 <w:tab w:val="clear" w:pos="8838"/>
               </w:tabs>
+              <w:suppressAutoHyphens w:val="true"/>
               <w:spacing w:before="40" w:after="0"/>
               <w:jc w:val="center"/>
               <w:rPr>
@@ -1716,8 +1729,6 @@
                 <w:rFonts w:cs="Calibri" w:ascii="Calibri" w:hAnsi="Calibri"/>
                 <w:bCs/>
                 <w:color w:themeColor="background2" w:themeShade="40" w:val="3B3838"/>
-                <w:kern w:val="0"/>
-                <w:lang w:bidi="ar-SA"/>
               </w:rPr>
             </w:r>
           </w:p>
@@ -1741,6 +1752,7 @@
                 <w:tab w:val="clear" w:pos="4419"/>
                 <w:tab w:val="clear" w:pos="8838"/>
               </w:tabs>
+              <w:suppressAutoHyphens w:val="true"/>
               <w:spacing w:before="40" w:after="0"/>
               <w:jc w:val="center"/>
               <w:rPr>
@@ -1783,6 +1795,7 @@
             <w:pPr>
               <w:pStyle w:val="Normal"/>
               <w:widowControl/>
+              <w:suppressAutoHyphens w:val="true"/>
               <w:spacing w:before="40" w:after="0"/>
               <w:jc w:val="both"/>
               <w:rPr>
@@ -1797,8 +1810,7 @@
                 <w:rFonts w:cs="Calibri" w:ascii="Calibri" w:hAnsi="Calibri"/>
                 <w:bCs/>
                 <w:color w:themeColor="background2" w:themeShade="40" w:val="3B3838"/>
-                <w:kern w:val="0"/>
-                <w:lang w:eastAsia="ja-JP" w:bidi="ar-SA"/>
+                <w:lang w:eastAsia="ja-JP"/>
               </w:rPr>
             </w:r>
           </w:p>
@@ -1819,6 +1831,7 @@
             <w:pPr>
               <w:pStyle w:val="Normal"/>
               <w:widowControl/>
+              <w:suppressAutoHyphens w:val="true"/>
               <w:spacing w:before="40" w:after="0"/>
               <w:jc w:val="left"/>
               <w:rPr>
@@ -1832,8 +1845,6 @@
                 <w:rFonts w:cs="Calibri" w:ascii="Calibri" w:hAnsi="Calibri"/>
                 <w:b/>
                 <w:color w:themeColor="background2" w:themeShade="40" w:val="3B3838"/>
-                <w:kern w:val="0"/>
-                <w:lang w:bidi="ar-SA"/>
               </w:rPr>
             </w:r>
           </w:p>
@@ -1857,6 +1868,7 @@
                 <w:tab w:val="clear" w:pos="4419"/>
                 <w:tab w:val="clear" w:pos="8838"/>
               </w:tabs>
+              <w:suppressAutoHyphens w:val="true"/>
               <w:spacing w:before="40" w:after="0"/>
               <w:jc w:val="both"/>
               <w:rPr>
@@ -1871,7 +1883,7 @@
                 <w:kern w:val="0"/>
                 <w:lang w:bidi="ar-SA"/>
               </w:rPr>
-              <w:t xml:space="preserve">4.  Argumenta por qué el proyecto es factible de realizarse en el marco de la asignatura. </w:t>
+              <w:t>4.  Argumenta por qué el proyecto es factible de realizarse en el marco de la asignatura.</w:t>
             </w:r>
           </w:p>
         </w:tc>
@@ -1895,6 +1907,7 @@
                 <w:tab w:val="clear" w:pos="4419"/>
                 <w:tab w:val="clear" w:pos="8838"/>
               </w:tabs>
+              <w:suppressAutoHyphens w:val="true"/>
               <w:spacing w:before="40" w:after="0"/>
               <w:jc w:val="center"/>
               <w:rPr>
@@ -1908,8 +1921,6 @@
                 <w:rFonts w:cs="Calibri" w:ascii="Calibri" w:hAnsi="Calibri"/>
                 <w:bCs/>
                 <w:color w:themeColor="background2" w:themeShade="40" w:val="3B3838"/>
-                <w:kern w:val="0"/>
-                <w:lang w:bidi="ar-SA"/>
               </w:rPr>
             </w:r>
           </w:p>
@@ -1933,6 +1944,7 @@
                 <w:tab w:val="clear" w:pos="4419"/>
                 <w:tab w:val="clear" w:pos="8838"/>
               </w:tabs>
+              <w:suppressAutoHyphens w:val="true"/>
               <w:spacing w:before="40" w:after="0"/>
               <w:jc w:val="center"/>
               <w:rPr>
@@ -1979,6 +1991,7 @@
                 <w:tab w:val="clear" w:pos="4419"/>
                 <w:tab w:val="clear" w:pos="8838"/>
               </w:tabs>
+              <w:suppressAutoHyphens w:val="true"/>
               <w:spacing w:before="40" w:after="0"/>
               <w:jc w:val="left"/>
               <w:rPr>
@@ -1992,8 +2005,6 @@
                 <w:rFonts w:cs="Calibri" w:ascii="Calibri" w:hAnsi="Calibri"/>
                 <w:bCs/>
                 <w:color w:themeColor="background2" w:themeShade="40" w:val="3B3838"/>
-                <w:kern w:val="0"/>
-                <w:lang w:bidi="ar-SA"/>
               </w:rPr>
             </w:r>
           </w:p>
@@ -2018,6 +2029,7 @@
                 <w:tab w:val="clear" w:pos="4419"/>
                 <w:tab w:val="clear" w:pos="8838"/>
               </w:tabs>
+              <w:suppressAutoHyphens w:val="true"/>
               <w:spacing w:before="40" w:after="0"/>
               <w:jc w:val="both"/>
               <w:rPr>
@@ -2066,6 +2078,7 @@
                 <w:tab w:val="clear" w:pos="4419"/>
                 <w:tab w:val="clear" w:pos="8838"/>
               </w:tabs>
+              <w:suppressAutoHyphens w:val="true"/>
               <w:spacing w:before="40" w:after="0"/>
               <w:jc w:val="both"/>
               <w:rPr>
@@ -2100,6 +2113,7 @@
             <w:pPr>
               <w:pStyle w:val="Footer"/>
               <w:widowControl/>
+              <w:suppressAutoHyphens w:val="true"/>
               <w:spacing w:before="40" w:after="0"/>
               <w:jc w:val="center"/>
               <w:rPr>
@@ -2137,6 +2151,7 @@
                 <w:tab w:val="clear" w:pos="4419"/>
                 <w:tab w:val="clear" w:pos="8838"/>
               </w:tabs>
+              <w:suppressAutoHyphens w:val="true"/>
               <w:spacing w:before="40" w:after="0"/>
               <w:jc w:val="center"/>
               <w:rPr>
@@ -2183,6 +2198,7 @@
                 <w:tab w:val="clear" w:pos="4419"/>
                 <w:tab w:val="clear" w:pos="8838"/>
               </w:tabs>
+              <w:suppressAutoHyphens w:val="true"/>
               <w:spacing w:before="40" w:after="0"/>
               <w:jc w:val="left"/>
               <w:rPr>
@@ -2196,8 +2212,6 @@
                 <w:rFonts w:cs="Calibri" w:ascii="Calibri" w:hAnsi="Calibri"/>
                 <w:bCs/>
                 <w:color w:themeColor="background2" w:themeShade="40" w:val="3B3838"/>
-                <w:kern w:val="0"/>
-                <w:lang w:bidi="ar-SA"/>
               </w:rPr>
             </w:r>
           </w:p>
@@ -2222,6 +2236,7 @@
                 <w:tab w:val="clear" w:pos="4419"/>
                 <w:tab w:val="clear" w:pos="8838"/>
               </w:tabs>
+              <w:suppressAutoHyphens w:val="true"/>
               <w:spacing w:before="40" w:after="0"/>
               <w:jc w:val="left"/>
               <w:rPr>
@@ -2235,8 +2250,6 @@
                 <w:rFonts w:cs="Calibri" w:ascii="Calibri" w:hAnsi="Calibri"/>
                 <w:b/>
                 <w:color w:themeColor="background2" w:themeShade="40" w:val="3B3838"/>
-                <w:kern w:val="0"/>
-                <w:lang w:bidi="ar-SA"/>
               </w:rPr>
             </w:r>
           </w:p>
@@ -2260,6 +2273,7 @@
                 <w:tab w:val="clear" w:pos="4419"/>
                 <w:tab w:val="clear" w:pos="8838"/>
               </w:tabs>
+              <w:suppressAutoHyphens w:val="true"/>
               <w:spacing w:before="40" w:after="0"/>
               <w:jc w:val="both"/>
               <w:rPr>
@@ -2294,6 +2308,7 @@
             <w:pPr>
               <w:pStyle w:val="Footer"/>
               <w:widowControl/>
+              <w:suppressAutoHyphens w:val="true"/>
               <w:spacing w:before="40" w:after="0"/>
               <w:jc w:val="center"/>
               <w:rPr>
@@ -2307,8 +2322,6 @@
                 <w:rFonts w:cs="Calibri" w:ascii="Calibri" w:hAnsi="Calibri"/>
                 <w:bCs/>
                 <w:color w:themeColor="background2" w:themeShade="40" w:val="3B3838"/>
-                <w:kern w:val="0"/>
-                <w:lang w:bidi="ar-SA"/>
               </w:rPr>
             </w:r>
           </w:p>
@@ -2332,6 +2345,7 @@
                 <w:tab w:val="clear" w:pos="4419"/>
                 <w:tab w:val="clear" w:pos="8838"/>
               </w:tabs>
+              <w:suppressAutoHyphens w:val="true"/>
               <w:spacing w:before="40" w:after="0"/>
               <w:jc w:val="center"/>
               <w:rPr>
@@ -2378,6 +2392,7 @@
                 <w:tab w:val="clear" w:pos="4419"/>
                 <w:tab w:val="clear" w:pos="8838"/>
               </w:tabs>
+              <w:suppressAutoHyphens w:val="true"/>
               <w:spacing w:before="40" w:after="0"/>
               <w:jc w:val="left"/>
               <w:rPr>
@@ -2391,8 +2406,6 @@
                 <w:rFonts w:cs="Calibri" w:ascii="Calibri" w:hAnsi="Calibri"/>
                 <w:bCs/>
                 <w:color w:themeColor="background2" w:themeShade="40" w:val="3B3838"/>
-                <w:kern w:val="0"/>
-                <w:lang w:bidi="ar-SA"/>
               </w:rPr>
             </w:r>
           </w:p>
@@ -2417,6 +2430,7 @@
                 <w:tab w:val="clear" w:pos="4419"/>
                 <w:tab w:val="clear" w:pos="8838"/>
               </w:tabs>
+              <w:suppressAutoHyphens w:val="true"/>
               <w:spacing w:before="40" w:after="0"/>
               <w:jc w:val="both"/>
               <w:rPr>
@@ -2465,6 +2479,7 @@
                 <w:tab w:val="clear" w:pos="4419"/>
                 <w:tab w:val="clear" w:pos="8838"/>
               </w:tabs>
+              <w:suppressAutoHyphens w:val="true"/>
               <w:spacing w:before="40" w:after="0"/>
               <w:jc w:val="both"/>
               <w:rPr>
@@ -2499,6 +2514,7 @@
             <w:pPr>
               <w:pStyle w:val="Footer"/>
               <w:widowControl/>
+              <w:suppressAutoHyphens w:val="true"/>
               <w:spacing w:before="40" w:after="0"/>
               <w:jc w:val="center"/>
               <w:rPr>
@@ -2536,6 +2552,7 @@
                 <w:tab w:val="clear" w:pos="4419"/>
                 <w:tab w:val="clear" w:pos="8838"/>
               </w:tabs>
+              <w:suppressAutoHyphens w:val="true"/>
               <w:spacing w:before="40" w:after="0"/>
               <w:jc w:val="center"/>
               <w:rPr>
@@ -2582,6 +2599,7 @@
                 <w:tab w:val="clear" w:pos="4419"/>
                 <w:tab w:val="clear" w:pos="8838"/>
               </w:tabs>
+              <w:suppressAutoHyphens w:val="true"/>
               <w:spacing w:before="40" w:after="0"/>
               <w:jc w:val="left"/>
               <w:rPr>
@@ -2595,8 +2613,6 @@
                 <w:rFonts w:cs="Calibri" w:ascii="Calibri" w:hAnsi="Calibri"/>
                 <w:bCs/>
                 <w:color w:themeColor="background2" w:themeShade="40" w:val="3B3838"/>
-                <w:kern w:val="0"/>
-                <w:lang w:bidi="ar-SA"/>
               </w:rPr>
             </w:r>
           </w:p>
@@ -2621,6 +2637,7 @@
                 <w:tab w:val="clear" w:pos="4419"/>
                 <w:tab w:val="clear" w:pos="8838"/>
               </w:tabs>
+              <w:suppressAutoHyphens w:val="true"/>
               <w:spacing w:before="40" w:after="0"/>
               <w:jc w:val="left"/>
               <w:rPr>
@@ -2634,8 +2651,6 @@
                 <w:rFonts w:cs="Calibri" w:ascii="Calibri" w:hAnsi="Calibri"/>
                 <w:b/>
                 <w:color w:themeColor="background2" w:themeShade="40" w:val="3B3838"/>
-                <w:kern w:val="0"/>
-                <w:lang w:bidi="ar-SA"/>
               </w:rPr>
             </w:r>
           </w:p>
@@ -2659,6 +2674,7 @@
                 <w:tab w:val="clear" w:pos="4419"/>
                 <w:tab w:val="clear" w:pos="8838"/>
               </w:tabs>
+              <w:suppressAutoHyphens w:val="true"/>
               <w:spacing w:before="40" w:after="0"/>
               <w:jc w:val="both"/>
               <w:rPr>
@@ -2693,6 +2709,7 @@
             <w:pPr>
               <w:pStyle w:val="Footer"/>
               <w:widowControl/>
+              <w:suppressAutoHyphens w:val="true"/>
               <w:spacing w:before="40" w:after="0"/>
               <w:jc w:val="center"/>
               <w:rPr>
@@ -2706,8 +2723,6 @@
                 <w:rFonts w:cs="Calibri" w:ascii="Calibri" w:hAnsi="Calibri"/>
                 <w:bCs/>
                 <w:color w:themeColor="background2" w:themeShade="40" w:val="3B3838"/>
-                <w:kern w:val="0"/>
-                <w:lang w:bidi="ar-SA"/>
               </w:rPr>
             </w:r>
           </w:p>
@@ -2731,6 +2746,7 @@
                 <w:tab w:val="clear" w:pos="4419"/>
                 <w:tab w:val="clear" w:pos="8838"/>
               </w:tabs>
+              <w:suppressAutoHyphens w:val="true"/>
               <w:spacing w:before="40" w:after="0"/>
               <w:jc w:val="center"/>
               <w:rPr>
@@ -2777,6 +2793,7 @@
                 <w:tab w:val="clear" w:pos="4419"/>
                 <w:tab w:val="clear" w:pos="8838"/>
               </w:tabs>
+              <w:suppressAutoHyphens w:val="true"/>
               <w:spacing w:before="40" w:after="0"/>
               <w:jc w:val="left"/>
               <w:rPr>
@@ -2790,8 +2807,6 @@
                 <w:rFonts w:cs="Calibri" w:ascii="Calibri" w:hAnsi="Calibri"/>
                 <w:bCs/>
                 <w:color w:themeColor="background2" w:themeShade="40" w:val="3B3838"/>
-                <w:kern w:val="0"/>
-                <w:lang w:bidi="ar-SA"/>
               </w:rPr>
             </w:r>
           </w:p>
@@ -2812,6 +2827,7 @@
             <w:pPr>
               <w:pStyle w:val="Normal"/>
               <w:widowControl/>
+              <w:suppressAutoHyphens w:val="true"/>
               <w:spacing w:before="40" w:after="0"/>
               <w:jc w:val="both"/>
               <w:rPr>
@@ -2830,7 +2846,7 @@
                 <w:kern w:val="0"/>
                 <w:lang w:bidi="ar-SA"/>
               </w:rPr>
-              <w:t xml:space="preserve">IL 1.4 </w:t>
+              <w:t>IL 1.4</w:t>
             </w:r>
           </w:p>
           <w:p>
@@ -2841,6 +2857,7 @@
                 <w:tab w:val="clear" w:pos="4419"/>
                 <w:tab w:val="clear" w:pos="8838"/>
               </w:tabs>
+              <w:suppressAutoHyphens w:val="true"/>
               <w:spacing w:before="40" w:after="0"/>
               <w:jc w:val="both"/>
               <w:rPr>
@@ -2878,6 +2895,7 @@
                 <w:tab w:val="clear" w:pos="4419"/>
                 <w:tab w:val="clear" w:pos="8838"/>
               </w:tabs>
+              <w:suppressAutoHyphens w:val="true"/>
               <w:spacing w:before="40" w:after="0"/>
               <w:jc w:val="both"/>
               <w:rPr>
@@ -2892,7 +2910,7 @@
                 <w:kern w:val="0"/>
                 <w:lang w:bidi="ar-SA"/>
               </w:rPr>
-              <w:t xml:space="preserve">9. Utiliza reglas de redacción, ortografía (literal, puntual, acentual) y las normas para citas y referencias. </w:t>
+              <w:t>9. Utiliza reglas de redacción, ortografía (literal, puntual, acentual) y las normas para citas y referencias.</w:t>
             </w:r>
           </w:p>
         </w:tc>
@@ -2912,6 +2930,7 @@
             <w:pPr>
               <w:pStyle w:val="Footer"/>
               <w:widowControl/>
+              <w:suppressAutoHyphens w:val="true"/>
               <w:spacing w:before="40" w:after="0"/>
               <w:jc w:val="center"/>
               <w:rPr>
@@ -2949,6 +2968,7 @@
                 <w:tab w:val="clear" w:pos="4419"/>
                 <w:tab w:val="clear" w:pos="8838"/>
               </w:tabs>
+              <w:suppressAutoHyphens w:val="true"/>
               <w:spacing w:before="40" w:after="0"/>
               <w:jc w:val="center"/>
               <w:rPr>
@@ -2995,6 +3015,7 @@
                 <w:tab w:val="clear" w:pos="4419"/>
                 <w:tab w:val="clear" w:pos="8838"/>
               </w:tabs>
+              <w:suppressAutoHyphens w:val="true"/>
               <w:spacing w:before="40" w:after="0"/>
               <w:jc w:val="left"/>
               <w:rPr>
@@ -3008,8 +3029,6 @@
                 <w:rFonts w:cs="Calibri" w:ascii="Calibri" w:hAnsi="Calibri"/>
                 <w:bCs/>
                 <w:color w:themeColor="background2" w:themeShade="40" w:val="3B3838"/>
-                <w:kern w:val="0"/>
-                <w:lang w:bidi="ar-SA"/>
               </w:rPr>
             </w:r>
           </w:p>
@@ -3030,6 +3049,7 @@
             <w:pPr>
               <w:pStyle w:val="Normal"/>
               <w:widowControl/>
+              <w:suppressAutoHyphens w:val="true"/>
               <w:spacing w:before="40" w:after="0"/>
               <w:jc w:val="left"/>
               <w:rPr>
@@ -3043,8 +3063,6 @@
                 <w:rFonts w:cs="Calibri" w:ascii="Calibri" w:hAnsi="Calibri"/>
                 <w:b/>
                 <w:color w:themeColor="background2" w:themeShade="40" w:val="3B3838"/>
-                <w:kern w:val="0"/>
-                <w:lang w:bidi="ar-SA"/>
               </w:rPr>
             </w:r>
           </w:p>
@@ -3068,6 +3086,7 @@
                 <w:tab w:val="clear" w:pos="4419"/>
                 <w:tab w:val="clear" w:pos="8838"/>
               </w:tabs>
+              <w:suppressAutoHyphens w:val="true"/>
               <w:spacing w:before="40" w:after="0"/>
               <w:jc w:val="both"/>
               <w:rPr>
@@ -3082,7 +3101,7 @@
                 <w:kern w:val="0"/>
                 <w:lang w:bidi="ar-SA"/>
               </w:rPr>
-              <w:t xml:space="preserve">10.  Cumple con el formato del informe establecido por la disciplina. </w:t>
+              <w:t>10.  Cumple con el formato del informe establecido por la disciplina.</w:t>
             </w:r>
           </w:p>
         </w:tc>
@@ -3102,6 +3121,7 @@
             <w:pPr>
               <w:pStyle w:val="Footer"/>
               <w:widowControl/>
+              <w:suppressAutoHyphens w:val="true"/>
               <w:spacing w:before="40" w:after="0"/>
               <w:jc w:val="center"/>
               <w:rPr>
@@ -3115,8 +3135,6 @@
                 <w:rFonts w:cs="Calibri" w:ascii="Calibri" w:hAnsi="Calibri"/>
                 <w:bCs/>
                 <w:color w:themeColor="background2" w:themeShade="40" w:val="3B3838"/>
-                <w:kern w:val="0"/>
-                <w:lang w:bidi="ar-SA"/>
               </w:rPr>
             </w:r>
           </w:p>
@@ -3140,6 +3158,7 @@
                 <w:tab w:val="clear" w:pos="4419"/>
                 <w:tab w:val="clear" w:pos="8838"/>
               </w:tabs>
+              <w:suppressAutoHyphens w:val="true"/>
               <w:spacing w:before="40" w:after="0"/>
               <w:jc w:val="center"/>
               <w:rPr>
@@ -3188,6 +3207,7 @@
                 <w:tab w:val="clear" w:pos="4419"/>
                 <w:tab w:val="clear" w:pos="8838"/>
               </w:tabs>
+              <w:suppressAutoHyphens w:val="true"/>
               <w:spacing w:before="40" w:after="0"/>
               <w:jc w:val="left"/>
               <w:rPr>
@@ -3201,8 +3221,6 @@
                 <w:rFonts w:cs="Calibri" w:ascii="Calibri" w:hAnsi="Calibri"/>
                 <w:bCs/>
                 <w:color w:themeColor="text1" w:themeTint="d9" w:val="262626"/>
-                <w:kern w:val="0"/>
-                <w:lang w:bidi="ar-SA"/>
               </w:rPr>
             </w:r>
           </w:p>
@@ -3223,6 +3241,7 @@
             <w:pPr>
               <w:pStyle w:val="Normal"/>
               <w:widowControl/>
+              <w:suppressAutoHyphens w:val="true"/>
               <w:spacing w:before="40" w:after="0"/>
               <w:jc w:val="both"/>
               <w:rPr>
@@ -3241,7 +3260,7 @@
                 <w:kern w:val="0"/>
                 <w:lang w:bidi="ar-SA"/>
               </w:rPr>
-              <w:t xml:space="preserve">IL 1.5 </w:t>
+              <w:t>IL 1.5</w:t>
             </w:r>
           </w:p>
           <w:p>
@@ -3252,6 +3271,7 @@
                 <w:tab w:val="clear" w:pos="4419"/>
                 <w:tab w:val="clear" w:pos="8838"/>
               </w:tabs>
+              <w:suppressAutoHyphens w:val="true"/>
               <w:spacing w:before="40" w:after="0"/>
               <w:jc w:val="both"/>
               <w:rPr>
@@ -3285,6 +3305,7 @@
             <w:pPr>
               <w:pStyle w:val="Normal"/>
               <w:widowControl/>
+              <w:suppressAutoHyphens w:val="true"/>
               <w:spacing w:before="40" w:after="0"/>
               <w:jc w:val="both"/>
               <w:rPr>
@@ -3320,6 +3341,7 @@
             <w:pPr>
               <w:pStyle w:val="Footer"/>
               <w:widowControl/>
+              <w:suppressAutoHyphens w:val="true"/>
               <w:spacing w:before="40" w:after="0"/>
               <w:jc w:val="center"/>
               <w:rPr>
@@ -3357,6 +3379,7 @@
                 <w:tab w:val="clear" w:pos="4419"/>
                 <w:tab w:val="clear" w:pos="8838"/>
               </w:tabs>
+              <w:suppressAutoHyphens w:val="true"/>
               <w:spacing w:before="40" w:after="0"/>
               <w:jc w:val="center"/>
               <w:rPr>
@@ -3401,6 +3424,7 @@
             <w:pPr>
               <w:pStyle w:val="Normal"/>
               <w:widowControl/>
+              <w:suppressAutoHyphens w:val="true"/>
               <w:spacing w:before="40" w:after="0"/>
               <w:jc w:val="left"/>
               <w:rPr>
@@ -3434,6 +3458,7 @@
             <w:pPr>
               <w:pStyle w:val="Normal"/>
               <w:widowControl/>
+              <w:suppressAutoHyphens w:val="true"/>
               <w:spacing w:before="40" w:after="0"/>
               <w:jc w:val="left"/>
               <w:rPr>
@@ -3466,6 +3491,7 @@
             <w:pPr>
               <w:pStyle w:val="Normal"/>
               <w:widowControl/>
+              <w:suppressAutoHyphens w:val="true"/>
               <w:spacing w:before="40" w:after="0"/>
               <w:jc w:val="both"/>
               <w:rPr>
@@ -3499,6 +3525,7 @@
             <w:pPr>
               <w:pStyle w:val="Normal"/>
               <w:widowControl/>
+              <w:suppressAutoHyphens w:val="true"/>
               <w:spacing w:before="40" w:after="0"/>
               <w:jc w:val="left"/>
               <w:rPr>
@@ -3531,6 +3558,7 @@
             <w:pPr>
               <w:pStyle w:val="Footer"/>
               <w:widowControl/>
+              <w:suppressAutoHyphens w:val="true"/>
               <w:spacing w:before="40" w:after="0"/>
               <w:jc w:val="center"/>
               <w:rPr>
@@ -3580,6 +3608,7 @@
                 <w:tab w:val="clear" w:pos="4419"/>
                 <w:tab w:val="clear" w:pos="8838"/>
               </w:tabs>
+              <w:suppressAutoHyphens w:val="true"/>
               <w:spacing w:before="0" w:after="0"/>
               <w:jc w:val="right"/>
               <w:rPr>
@@ -3622,6 +3651,7 @@
                 <w:tab w:val="clear" w:pos="4419"/>
                 <w:tab w:val="clear" w:pos="8838"/>
               </w:tabs>
+              <w:suppressAutoHyphens w:val="true"/>
               <w:spacing w:before="0" w:after="0"/>
               <w:jc w:val="center"/>
               <w:rPr>
@@ -3663,6 +3693,7 @@
                 <w:tab w:val="clear" w:pos="4419"/>
                 <w:tab w:val="clear" w:pos="8838"/>
               </w:tabs>
+              <w:suppressAutoHyphens w:val="true"/>
               <w:spacing w:before="40" w:after="0"/>
               <w:jc w:val="center"/>
               <w:rPr>
@@ -4051,7 +4082,7 @@
                 <w:sz w:val="22"/>
                 <w:szCs w:val="22"/>
               </w:rPr>
-              <w:t xml:space="preserve">El objetivo de aplicar este instrumento de autoevaluación es: </w:t>
+              <w:t>El objetivo de aplicar este instrumento de autoevaluación es:</w:t>
             </w:r>
           </w:p>
           <w:p>
@@ -4132,7 +4163,7 @@
                 <w:sz w:val="22"/>
                 <w:szCs w:val="22"/>
               </w:rPr>
-              <w:t xml:space="preserve">Generar información que permita retroalimentar tu proyecto y ajustarlo antes de la evaluación sumativa. </w:t>
+              <w:t>Generar información que permita retroalimentar tu proyecto y ajustarlo antes de la evaluación sumativa.</w:t>
             </w:r>
           </w:p>
           <w:p>
@@ -4179,16 +4210,6 @@
                 <w:szCs w:val="22"/>
               </w:rPr>
               <w:t>Deberán redactar los siguientes apartados según este formato:</w:t>
-            </w:r>
-            <w:r>
-              <w:rPr>
-                <w:rStyle w:val="eop"/>
-                <w:rFonts w:eastAsia="Calibri" w:cs="Calibri" w:ascii="Calibri" w:hAnsi="Calibri"/>
-                <w:color w:themeColor="text1" w:val="000000"/>
-                <w:sz w:val="22"/>
-                <w:szCs w:val="22"/>
-              </w:rPr>
-              <w:t> </w:t>
             </w:r>
           </w:p>
           <w:p>
@@ -4219,7 +4240,7 @@
                 <w:szCs w:val="22"/>
                 <w:lang w:val="es-CL"/>
               </w:rPr>
-              <w:t>Abstract (inglés y español) </w:t>
+              <w:t>Abstract (inglés y español)</w:t>
             </w:r>
           </w:p>
           <w:p>
@@ -4250,7 +4271,7 @@
                 <w:szCs w:val="22"/>
                 <w:lang w:val="es-CL"/>
               </w:rPr>
-              <w:t>Conclusiones individuales solo en inglés. </w:t>
+              <w:t>Conclusiones individuales solo en inglés.</w:t>
             </w:r>
           </w:p>
           <w:p>
@@ -4281,7 +4302,7 @@
                 <w:szCs w:val="22"/>
                 <w:lang w:val="es-CL"/>
               </w:rPr>
-              <w:t>Reflexión solo en inglés. </w:t>
+              <w:t>Reflexión solo en inglés.</w:t>
             </w:r>
           </w:p>
           <w:p>
@@ -4330,7 +4351,7 @@
                 <w:sz w:val="22"/>
                 <w:szCs w:val="22"/>
               </w:rPr>
-              <w:t>Tu informe debe contener:  </w:t>
+              <w:t>Tu informe debe contener:</w:t>
             </w:r>
           </w:p>
           <w:p>
@@ -4361,7 +4382,7 @@
                 <w:szCs w:val="22"/>
                 <w:lang w:val="es-ES"/>
               </w:rPr>
-              <w:t>Descripción de proyecto APT </w:t>
+              <w:t>Descripción de proyecto APT</w:t>
             </w:r>
           </w:p>
           <w:p>
@@ -4392,7 +4413,7 @@
                 <w:szCs w:val="22"/>
                 <w:lang w:val="es-ES"/>
               </w:rPr>
-              <w:t>Relación del proyecto APT con las competencias del perfil de egreso. </w:t>
+              <w:t>Relación del proyecto APT con las competencias del perfil de egreso.</w:t>
             </w:r>
           </w:p>
           <w:p>
@@ -4423,7 +4444,7 @@
                 <w:szCs w:val="22"/>
                 <w:lang w:val="es-ES"/>
               </w:rPr>
-              <w:t>Relación del proyecto con tus intereses profesionales. </w:t>
+              <w:t>Relación del proyecto con tus intereses profesionales.</w:t>
             </w:r>
           </w:p>
           <w:p>
@@ -4454,7 +4475,7 @@
                 <w:szCs w:val="22"/>
                 <w:lang w:val="es-ES"/>
               </w:rPr>
-              <w:t>Argumento del por qué el proyecto es factible a realizarse dentro de la asignatura. </w:t>
+              <w:t>Argumento del por qué el proyecto es factible a realizarse dentro de la asignatura.</w:t>
             </w:r>
           </w:p>
           <w:p>
@@ -4485,7 +4506,7 @@
                 <w:szCs w:val="22"/>
                 <w:lang w:val="es-ES"/>
               </w:rPr>
-              <w:t>Objetivos claros y coherentes. </w:t>
+              <w:t>Objetivos claros y coherentes.</w:t>
             </w:r>
           </w:p>
           <w:p>
@@ -4516,7 +4537,7 @@
                 <w:szCs w:val="22"/>
                 <w:lang w:val="es-ES"/>
               </w:rPr>
-              <w:t>Propuesta metodológica de trabajo que permita alcanzar los objetivos. </w:t>
+              <w:t>Propuesta metodológica de trabajo que permita alcanzar los objetivos.</w:t>
             </w:r>
           </w:p>
           <w:p>
@@ -4547,7 +4568,7 @@
                 <w:szCs w:val="22"/>
                 <w:lang w:val="es-ES"/>
               </w:rPr>
-              <w:t>Plan de trabajo para el proyecto APT. </w:t>
+              <w:t>Plan de trabajo para el proyecto APT.</w:t>
             </w:r>
           </w:p>
           <w:p>
@@ -4578,7 +4599,7 @@
                 <w:szCs w:val="22"/>
                 <w:lang w:val="es-ES"/>
               </w:rPr>
-              <w:t>Propuesta de evidencias que darán cuenta del logro de las actividades. </w:t>
+              <w:t>Propuesta de evidencias que darán cuenta del logro de las actividades.</w:t>
             </w:r>
           </w:p>
           <w:p>
@@ -4594,13 +4615,11 @@
             </w:pPr>
             <w:r>
               <w:rPr>
-                <w:rStyle w:val="eop"/>
                 <w:rFonts w:eastAsia="Calibri" w:cs="Calibri" w:ascii="Calibri" w:hAnsi="Calibri"/>
                 <w:color w:themeColor="text1" w:val="000000"/>
                 <w:sz w:val="22"/>
                 <w:szCs w:val="22"/>
               </w:rPr>
-              <w:t> </w:t>
             </w:r>
           </w:p>
           <w:p>
@@ -4624,7 +4643,7 @@
                 <w:sz w:val="22"/>
                 <w:szCs w:val="22"/>
               </w:rPr>
-              <w:t>Aspectos formales: </w:t>
+              <w:t>Aspectos formales:</w:t>
             </w:r>
           </w:p>
           <w:p>
@@ -4655,7 +4674,7 @@
                 <w:szCs w:val="22"/>
                 <w:lang w:val="es-ES"/>
               </w:rPr>
-              <w:t>Formato informe escuela  </w:t>
+              <w:t>Formato informe escuela</w:t>
             </w:r>
           </w:p>
           <w:p>
@@ -4686,7 +4705,7 @@
                 <w:szCs w:val="22"/>
                 <w:lang w:val="es-ES"/>
               </w:rPr>
-              <w:t>Respeta reglas de redacción, ortografía y normas de citas y referencias. </w:t>
+              <w:t>Respeta reglas de redacción, ortografía y normas de citas y referencias.</w:t>
             </w:r>
           </w:p>
           <w:p>
@@ -4702,13 +4721,11 @@
             </w:pPr>
             <w:r>
               <w:rPr>
-                <w:rStyle w:val="eop"/>
                 <w:rFonts w:eastAsia="Calibri" w:cs="Calibri" w:ascii="Calibri" w:hAnsi="Calibri"/>
                 <w:color w:themeColor="text1" w:val="000000"/>
                 <w:sz w:val="22"/>
                 <w:szCs w:val="22"/>
               </w:rPr>
-              <w:t> </w:t>
             </w:r>
           </w:p>
           <w:p>
@@ -4732,7 +4749,7 @@
                 <w:sz w:val="22"/>
                 <w:szCs w:val="22"/>
               </w:rPr>
-              <w:t>Indicadores de calidad: </w:t>
+              <w:t>Indicadores de calidad:</w:t>
             </w:r>
           </w:p>
           <w:p>
@@ -4763,7 +4780,7 @@
                 <w:szCs w:val="22"/>
                 <w:lang w:val="es-ES"/>
               </w:rPr>
-              <w:t>El informe cumple con los indicadores de la presentación del proyecto, según los estándares de la disciplina. </w:t>
+              <w:t>El informe cumple con los indicadores de la presentación del proyecto, según los estándares de la disciplina.</w:t>
             </w:r>
           </w:p>
           <w:p>
@@ -4977,7 +4994,7 @@
                 <w:sz w:val="22"/>
                 <w:szCs w:val="22"/>
               </w:rPr>
-              <w:t xml:space="preserve">Lee cada indicador y el descriptor correspondiente en cada nivel de desempeño. Compara esa descripción con tu proyecto y determina a qué nivel corresponde tu trabajo. </w:t>
+              <w:t>Lee cada indicador y el descriptor correspondiente en cada nivel de desempeño. Compara esa descripción con tu proyecto y determina a qué nivel corresponde tu trabajo.</w:t>
             </w:r>
           </w:p>
           <w:p>
@@ -5186,6 +5203,7 @@
                 <w:tab w:val="clear" w:pos="4419"/>
                 <w:tab w:val="clear" w:pos="8838"/>
               </w:tabs>
+              <w:suppressAutoHyphens w:val="true"/>
               <w:spacing w:before="0" w:after="0"/>
               <w:jc w:val="center"/>
               <w:rPr>
@@ -5226,6 +5244,7 @@
                 <w:tab w:val="clear" w:pos="4419"/>
                 <w:tab w:val="clear" w:pos="8838"/>
               </w:tabs>
+              <w:suppressAutoHyphens w:val="true"/>
               <w:spacing w:before="40" w:after="0"/>
               <w:jc w:val="center"/>
               <w:rPr>
@@ -5266,6 +5285,7 @@
             <w:pPr>
               <w:pStyle w:val="Normal"/>
               <w:widowControl/>
+              <w:suppressAutoHyphens w:val="true"/>
               <w:spacing w:before="40" w:after="0"/>
               <w:jc w:val="left"/>
               <w:rPr>
@@ -5305,6 +5325,7 @@
                 <w:tab w:val="clear" w:pos="4419"/>
                 <w:tab w:val="clear" w:pos="8838"/>
               </w:tabs>
+              <w:suppressAutoHyphens w:val="true"/>
               <w:spacing w:before="40" w:after="0"/>
               <w:jc w:val="both"/>
               <w:rPr>
@@ -5339,6 +5360,7 @@
             <w:pPr>
               <w:pStyle w:val="Normal"/>
               <w:widowControl/>
+              <w:suppressAutoHyphens w:val="true"/>
               <w:spacing w:before="40" w:after="0"/>
               <w:jc w:val="left"/>
               <w:rPr>
@@ -5371,6 +5393,7 @@
             <w:pPr>
               <w:pStyle w:val="Normal"/>
               <w:widowControl/>
+              <w:suppressAutoHyphens w:val="true"/>
               <w:spacing w:before="40" w:after="0"/>
               <w:jc w:val="both"/>
               <w:rPr>
@@ -5405,6 +5428,7 @@
             <w:pPr>
               <w:pStyle w:val="Normal"/>
               <w:widowControl/>
+              <w:suppressAutoHyphens w:val="true"/>
               <w:spacing w:before="40" w:after="0"/>
               <w:jc w:val="left"/>
               <w:rPr>
@@ -5437,6 +5461,7 @@
             <w:pPr>
               <w:pStyle w:val="Normal"/>
               <w:widowControl/>
+              <w:suppressAutoHyphens w:val="true"/>
               <w:spacing w:before="40" w:after="0"/>
               <w:jc w:val="both"/>
               <w:rPr>
@@ -5451,7 +5476,7 @@
                 <w:kern w:val="0"/>
                 <w:lang w:bidi="ar-SA"/>
               </w:rPr>
-              <w:t xml:space="preserve">1.3 Desarrolla mejoras al producto en base al resultado de las mismas. </w:t>
+              <w:t>1.3 Desarrolla mejoras al producto en base al resultado de las mismas.</w:t>
             </w:r>
           </w:p>
         </w:tc>
@@ -5479,6 +5504,7 @@
                 <w:tab w:val="clear" w:pos="4419"/>
                 <w:tab w:val="clear" w:pos="8838"/>
               </w:tabs>
+              <w:suppressAutoHyphens w:val="true"/>
               <w:spacing w:before="40" w:after="0"/>
               <w:jc w:val="both"/>
               <w:rPr>
@@ -5514,6 +5540,7 @@
             <w:pPr>
               <w:pStyle w:val="Normal"/>
               <w:widowControl/>
+              <w:suppressAutoHyphens w:val="true"/>
               <w:spacing w:before="40" w:after="0"/>
               <w:jc w:val="both"/>
               <w:rPr>
@@ -5548,6 +5575,7 @@
             <w:pPr>
               <w:pStyle w:val="Normal"/>
               <w:widowControl/>
+              <w:suppressAutoHyphens w:val="true"/>
               <w:spacing w:before="40" w:after="0"/>
               <w:jc w:val="left"/>
               <w:rPr>
@@ -5580,6 +5608,7 @@
             <w:pPr>
               <w:pStyle w:val="Normal"/>
               <w:widowControl/>
+              <w:suppressAutoHyphens w:val="true"/>
               <w:spacing w:before="40" w:after="0"/>
               <w:jc w:val="both"/>
               <w:rPr>
@@ -5622,6 +5651,7 @@
                 <w:tab w:val="clear" w:pos="4419"/>
                 <w:tab w:val="clear" w:pos="8838"/>
               </w:tabs>
+              <w:suppressAutoHyphens w:val="true"/>
               <w:spacing w:before="40" w:after="0"/>
               <w:jc w:val="both"/>
               <w:rPr>
@@ -5657,6 +5687,7 @@
             <w:pPr>
               <w:pStyle w:val="Normal"/>
               <w:widowControl/>
+              <w:suppressAutoHyphens w:val="true"/>
               <w:spacing w:before="40" w:after="0"/>
               <w:jc w:val="both"/>
               <w:rPr>
@@ -5691,6 +5722,7 @@
             <w:pPr>
               <w:pStyle w:val="Normal"/>
               <w:widowControl/>
+              <w:suppressAutoHyphens w:val="true"/>
               <w:spacing w:before="40" w:after="0"/>
               <w:jc w:val="left"/>
               <w:rPr>
@@ -5723,6 +5755,7 @@
             <w:pPr>
               <w:pStyle w:val="Normal"/>
               <w:widowControl/>
+              <w:suppressAutoHyphens w:val="true"/>
               <w:spacing w:before="40" w:after="0"/>
               <w:jc w:val="both"/>
               <w:rPr>
@@ -5765,6 +5798,7 @@
                 <w:tab w:val="clear" w:pos="4419"/>
                 <w:tab w:val="clear" w:pos="8838"/>
               </w:tabs>
+              <w:suppressAutoHyphens w:val="true"/>
               <w:spacing w:before="40" w:after="0"/>
               <w:jc w:val="both"/>
               <w:rPr>
@@ -5800,6 +5834,7 @@
             <w:pPr>
               <w:pStyle w:val="Normal"/>
               <w:widowControl/>
+              <w:suppressAutoHyphens w:val="true"/>
               <w:spacing w:before="40" w:after="0"/>
               <w:jc w:val="both"/>
               <w:rPr>
@@ -5834,6 +5869,7 @@
             <w:pPr>
               <w:pStyle w:val="Normal"/>
               <w:widowControl/>
+              <w:suppressAutoHyphens w:val="true"/>
               <w:spacing w:before="40" w:after="0"/>
               <w:jc w:val="left"/>
               <w:rPr>
@@ -5866,6 +5902,7 @@
             <w:pPr>
               <w:pStyle w:val="Normal"/>
               <w:widowControl/>
+              <w:suppressAutoHyphens w:val="true"/>
               <w:spacing w:before="40" w:after="0"/>
               <w:jc w:val="both"/>
               <w:rPr>
@@ -5900,6 +5937,7 @@
             <w:pPr>
               <w:pStyle w:val="Normal"/>
               <w:widowControl/>
+              <w:suppressAutoHyphens w:val="true"/>
               <w:spacing w:before="40" w:after="0"/>
               <w:jc w:val="left"/>
               <w:rPr>
@@ -5932,6 +5970,7 @@
             <w:pPr>
               <w:pStyle w:val="Normal"/>
               <w:widowControl/>
+              <w:suppressAutoHyphens w:val="true"/>
               <w:spacing w:before="40" w:after="0"/>
               <w:jc w:val="both"/>
               <w:rPr>
@@ -6093,9 +6132,9 @@
         <w:tblLook w:val="04a0" w:noHBand="0" w:noVBand="1" w:firstColumn="1" w:lastRow="0" w:lastColumn="0" w:firstRow="1"/>
       </w:tblPr>
       <w:tblGrid>
-        <w:gridCol w:w="3088"/>
+        <w:gridCol w:w="3087"/>
         <w:gridCol w:w="1116"/>
-        <w:gridCol w:w="8790"/>
+        <w:gridCol w:w="8791"/>
       </w:tblGrid>
       <w:tr>
         <w:trPr>
@@ -6103,7 +6142,7 @@
         </w:trPr>
         <w:tc>
           <w:tcPr>
-            <w:tcW w:w="3088" w:type="dxa"/>
+            <w:tcW w:w="3087" w:type="dxa"/>
             <w:tcBorders>
               <w:top w:val="single" w:sz="4" w:space="0" w:color="7F7F7F"/>
               <w:left w:val="single" w:sz="4" w:space="0" w:color="7F7F7F"/>
@@ -6183,7 +6222,7 @@
         </w:tc>
         <w:tc>
           <w:tcPr>
-            <w:tcW w:w="8790" w:type="dxa"/>
+            <w:tcW w:w="8791" w:type="dxa"/>
             <w:tcBorders>
               <w:top w:val="single" w:sz="4" w:space="0" w:color="7F7F7F"/>
               <w:left w:val="single" w:sz="4" w:space="0" w:color="7F7F7F"/>
@@ -6226,7 +6265,7 @@
         </w:trPr>
         <w:tc>
           <w:tcPr>
-            <w:tcW w:w="3088" w:type="dxa"/>
+            <w:tcW w:w="3087" w:type="dxa"/>
             <w:tcBorders>
               <w:top w:val="single" w:sz="4" w:space="0" w:color="7F7F7F"/>
               <w:left w:val="single" w:sz="4" w:space="0" w:color="7F7F7F"/>
@@ -6296,7 +6335,7 @@
         </w:tc>
         <w:tc>
           <w:tcPr>
-            <w:tcW w:w="8790" w:type="dxa"/>
+            <w:tcW w:w="8791" w:type="dxa"/>
             <w:tcBorders>
               <w:top w:val="single" w:sz="4" w:space="0" w:color="7F7F7F"/>
               <w:left w:val="single" w:sz="4" w:space="0" w:color="7F7F7F"/>
@@ -6330,7 +6369,7 @@
         </w:trPr>
         <w:tc>
           <w:tcPr>
-            <w:tcW w:w="3088" w:type="dxa"/>
+            <w:tcW w:w="3087" w:type="dxa"/>
             <w:tcBorders>
               <w:top w:val="single" w:sz="4" w:space="0" w:color="7F7F7F"/>
               <w:left w:val="single" w:sz="4" w:space="0" w:color="7F7F7F"/>
@@ -6361,7 +6400,7 @@
                 <w:sz w:val="22"/>
                 <w:szCs w:val="22"/>
               </w:rPr>
-              <w:t xml:space="preserve">Logrado </w:t>
+              <w:t>Logrado</w:t>
             </w:r>
           </w:p>
         </w:tc>
@@ -6402,7 +6441,7 @@
         </w:tc>
         <w:tc>
           <w:tcPr>
-            <w:tcW w:w="8790" w:type="dxa"/>
+            <w:tcW w:w="8791" w:type="dxa"/>
             <w:tcBorders>
               <w:top w:val="single" w:sz="4" w:space="0" w:color="7F7F7F"/>
               <w:left w:val="single" w:sz="4" w:space="0" w:color="7F7F7F"/>
@@ -6436,7 +6475,7 @@
         </w:trPr>
         <w:tc>
           <w:tcPr>
-            <w:tcW w:w="3088" w:type="dxa"/>
+            <w:tcW w:w="3087" w:type="dxa"/>
             <w:tcBorders>
               <w:top w:val="single" w:sz="4" w:space="0" w:color="7F7F7F"/>
               <w:left w:val="single" w:sz="4" w:space="0" w:color="7F7F7F"/>
@@ -6467,7 +6506,7 @@
                 <w:sz w:val="22"/>
                 <w:szCs w:val="22"/>
               </w:rPr>
-              <w:t xml:space="preserve">Logro incipiente </w:t>
+              <w:t>Logro incipiente</w:t>
             </w:r>
           </w:p>
         </w:tc>
@@ -6509,7 +6548,7 @@
         </w:tc>
         <w:tc>
           <w:tcPr>
-            <w:tcW w:w="8790" w:type="dxa"/>
+            <w:tcW w:w="8791" w:type="dxa"/>
             <w:tcBorders>
               <w:top w:val="single" w:sz="4" w:space="0" w:color="7F7F7F"/>
               <w:left w:val="single" w:sz="4" w:space="0" w:color="7F7F7F"/>
@@ -6542,7 +6581,7 @@
         </w:trPr>
         <w:tc>
           <w:tcPr>
-            <w:tcW w:w="3088" w:type="dxa"/>
+            <w:tcW w:w="3087" w:type="dxa"/>
             <w:tcBorders>
               <w:top w:val="single" w:sz="4" w:space="0" w:color="7F7F7F"/>
               <w:left w:val="single" w:sz="4" w:space="0" w:color="7F7F7F"/>
@@ -6613,7 +6652,7 @@
         </w:tc>
         <w:tc>
           <w:tcPr>
-            <w:tcW w:w="8790" w:type="dxa"/>
+            <w:tcW w:w="8791" w:type="dxa"/>
             <w:tcBorders>
               <w:top w:val="single" w:sz="4" w:space="0" w:color="7F7F7F"/>
               <w:left w:val="single" w:sz="4" w:space="0" w:color="7F7F7F"/>
@@ -6680,8 +6719,8 @@
         <w:gridCol w:w="2269"/>
         <w:gridCol w:w="2126"/>
         <w:gridCol w:w="2127"/>
-        <w:gridCol w:w="2052"/>
-        <w:gridCol w:w="1448"/>
+        <w:gridCol w:w="2053"/>
+        <w:gridCol w:w="1447"/>
       </w:tblGrid>
       <w:tr>
         <w:trPr>
@@ -6704,6 +6743,7 @@
             <w:pPr>
               <w:pStyle w:val="Normal"/>
               <w:widowControl/>
+              <w:suppressAutoHyphens w:val="true"/>
               <w:spacing w:before="0" w:after="0"/>
               <w:jc w:val="center"/>
               <w:rPr>
@@ -6727,7 +6767,7 @@
         </w:tc>
         <w:tc>
           <w:tcPr>
-            <w:tcW w:w="8574" w:type="dxa"/>
+            <w:tcW w:w="8575" w:type="dxa"/>
             <w:gridSpan w:val="4"/>
             <w:tcBorders>
               <w:top w:val="single" w:sz="4" w:space="0" w:color="7F7F7F"/>
@@ -6742,6 +6782,7 @@
             <w:pPr>
               <w:pStyle w:val="Normal"/>
               <w:widowControl/>
+              <w:suppressAutoHyphens w:val="true"/>
               <w:spacing w:before="0" w:after="0"/>
               <w:jc w:val="center"/>
               <w:rPr>
@@ -6765,7 +6806,7 @@
         </w:tc>
         <w:tc>
           <w:tcPr>
-            <w:tcW w:w="1448" w:type="dxa"/>
+            <w:tcW w:w="1447" w:type="dxa"/>
             <w:vMerge w:val="restart"/>
             <w:tcBorders>
               <w:top w:val="single" w:sz="4" w:space="0" w:color="7F7F7F"/>
@@ -6780,6 +6821,7 @@
             <w:pPr>
               <w:pStyle w:val="Normal"/>
               <w:widowControl/>
+              <w:suppressAutoHyphens w:val="true"/>
               <w:spacing w:before="0" w:after="0"/>
               <w:jc w:val="center"/>
               <w:rPr>
@@ -6821,6 +6863,7 @@
             <w:pPr>
               <w:pStyle w:val="Normal"/>
               <w:widowControl/>
+              <w:suppressAutoHyphens w:val="true"/>
               <w:spacing w:before="0" w:after="0"/>
               <w:jc w:val="left"/>
               <w:rPr>
@@ -6835,8 +6878,7 @@
                 <w:rFonts w:cs="Arial" w:ascii="Arial" w:hAnsi="Arial"/>
                 <w:b/>
                 <w:bCs/>
-                <w:kern w:val="0"/>
-                <w:lang w:eastAsia="es-CL" w:bidi="ar-SA"/>
+                <w:lang w:eastAsia="es-CL"/>
               </w:rPr>
             </w:r>
           </w:p>
@@ -6857,6 +6899,7 @@
             <w:pPr>
               <w:pStyle w:val="Normal"/>
               <w:widowControl/>
+              <w:suppressAutoHyphens w:val="true"/>
               <w:spacing w:before="0" w:after="0"/>
               <w:jc w:val="center"/>
               <w:rPr>
@@ -6906,6 +6949,7 @@
             <w:pPr>
               <w:pStyle w:val="Normal"/>
               <w:widowControl/>
+              <w:suppressAutoHyphens w:val="true"/>
               <w:spacing w:before="0" w:after="0"/>
               <w:jc w:val="center"/>
               <w:rPr>
@@ -6955,6 +6999,7 @@
             <w:pPr>
               <w:pStyle w:val="Default"/>
               <w:widowControl/>
+              <w:suppressAutoHyphens w:val="true"/>
               <w:spacing w:before="0" w:after="0"/>
               <w:jc w:val="center"/>
               <w:rPr>
@@ -6977,13 +7022,14 @@
                 <w:szCs w:val="22"/>
                 <w:lang w:bidi="ar-SA"/>
               </w:rPr>
-              <w:t xml:space="preserve">Logro incipiente </w:t>
-            </w:r>
-          </w:p>
-          <w:p>
-            <w:pPr>
-              <w:pStyle w:val="Normal"/>
-              <w:widowControl/>
+              <w:t>Logro incipiente</w:t>
+            </w:r>
+          </w:p>
+          <w:p>
+            <w:pPr>
+              <w:pStyle w:val="Normal"/>
+              <w:widowControl/>
+              <w:suppressAutoHyphens w:val="true"/>
               <w:spacing w:before="0" w:after="0"/>
               <w:jc w:val="center"/>
               <w:rPr>
@@ -7007,7 +7053,7 @@
         </w:tc>
         <w:tc>
           <w:tcPr>
-            <w:tcW w:w="2052" w:type="dxa"/>
+            <w:tcW w:w="2053" w:type="dxa"/>
             <w:tcBorders>
               <w:top w:val="single" w:sz="4" w:space="0" w:color="7F7F7F"/>
               <w:left w:val="single" w:sz="4" w:space="0" w:color="7F7F7F"/>
@@ -7021,6 +7067,7 @@
             <w:pPr>
               <w:pStyle w:val="Normal"/>
               <w:widowControl/>
+              <w:suppressAutoHyphens w:val="true"/>
               <w:spacing w:before="0" w:after="0"/>
               <w:jc w:val="center"/>
               <w:rPr>
@@ -7045,6 +7092,7 @@
             <w:pPr>
               <w:pStyle w:val="Normal"/>
               <w:widowControl/>
+              <w:suppressAutoHyphens w:val="true"/>
               <w:spacing w:before="0" w:after="0"/>
               <w:jc w:val="center"/>
               <w:rPr>
@@ -7068,7 +7116,7 @@
         </w:tc>
         <w:tc>
           <w:tcPr>
-            <w:tcW w:w="1448" w:type="dxa"/>
+            <w:tcW w:w="1447" w:type="dxa"/>
             <w:vMerge w:val="continue"/>
             <w:tcBorders>
               <w:top w:val="single" w:sz="4" w:space="0" w:color="7F7F7F"/>
@@ -7081,6 +7129,7 @@
             <w:pPr>
               <w:pStyle w:val="Normal"/>
               <w:widowControl/>
+              <w:suppressAutoHyphens w:val="true"/>
               <w:spacing w:before="0" w:after="0"/>
               <w:jc w:val="left"/>
               <w:rPr>
@@ -7095,8 +7144,7 @@
                 <w:rFonts w:cs="Arial" w:ascii="Arial" w:hAnsi="Arial"/>
                 <w:b/>
                 <w:bCs/>
-                <w:kern w:val="0"/>
-                <w:lang w:eastAsia="es-CL" w:bidi="ar-SA"/>
+                <w:lang w:eastAsia="es-CL"/>
               </w:rPr>
             </w:r>
           </w:p>
@@ -7121,6 +7169,7 @@
             <w:pPr>
               <w:pStyle w:val="Normal"/>
               <w:widowControl/>
+              <w:suppressAutoHyphens w:val="true"/>
               <w:spacing w:before="0" w:after="0"/>
               <w:jc w:val="left"/>
               <w:rPr>
@@ -7155,19 +7204,21 @@
             <w:pPr>
               <w:pStyle w:val="Normal"/>
               <w:widowControl/>
+              <w:suppressAutoHyphens w:val="true"/>
               <w:spacing w:before="0" w:after="0"/>
               <w:jc w:val="left"/>
               <w:rPr>
                 <w:rFonts w:ascii="Calibri" w:hAnsi="Calibri" w:eastAsia="" w:cs="" w:asciiTheme="minorHAnsi" w:cstheme="minorBidi" w:eastAsiaTheme="minorEastAsia" w:hAnsiTheme="minorHAnsi"/>
-                <w:color w:themeColor="text1" w:val="000000"/>
-                <w:lang w:eastAsia="es-CL"/>
-              </w:rPr>
-            </w:pPr>
-            <w:r>
-              <w:rPr>
-                <w:rFonts w:eastAsia="" w:cs="" w:ascii="Calibri" w:hAnsi="Calibri" w:asciiTheme="minorHAnsi" w:cstheme="minorBidi" w:eastAsiaTheme="minorEastAsia" w:hAnsiTheme="minorHAnsi"/>
-                <w:color w:themeColor="text1" w:val="000000"/>
-                <w:kern w:val="0"/>
+                <w:highlight w:val="none"/>
+                <w:shd w:fill="81D41A" w:val="clear"/>
+              </w:rPr>
+            </w:pPr>
+            <w:r>
+              <w:rPr>
+                <w:rFonts w:eastAsia="" w:cs="" w:ascii="Calibri" w:hAnsi="Calibri" w:cstheme="minorBidi" w:eastAsiaTheme="minorEastAsia"/>
+                <w:color w:themeColor="text1" w:val="000000"/>
+                <w:kern w:val="0"/>
+                <w:shd w:fill="81D41A" w:val="clear"/>
                 <w:lang w:bidi="ar-SA"/>
               </w:rPr>
               <w:t>Describí brevemente en qué consiste el proyecto APT, justificando la relevancia, impacto o beneficio (real o simulado) que tendría en el campo laboral de mi carrera.</w:t>
@@ -7189,6 +7240,7 @@
             <w:pPr>
               <w:pStyle w:val="Normal"/>
               <w:widowControl/>
+              <w:suppressAutoHyphens w:val="true"/>
               <w:spacing w:before="0" w:after="0"/>
               <w:jc w:val="left"/>
               <w:rPr>
@@ -7223,6 +7275,7 @@
             <w:pPr>
               <w:pStyle w:val="Normal"/>
               <w:widowControl/>
+              <w:suppressAutoHyphens w:val="true"/>
               <w:spacing w:before="0" w:after="0"/>
               <w:jc w:val="left"/>
               <w:rPr>
@@ -7238,25 +7291,26 @@
                 <w:kern w:val="0"/>
                 <w:lang w:bidi="ar-SA"/>
               </w:rPr>
-              <w:t xml:space="preserve">Describí brevemente en qué consiste el proyecto APT, pero no lo justifiqué ni relaciona con el campo laboral de mi carrera. </w:t>
-            </w:r>
-          </w:p>
-        </w:tc>
-        <w:tc>
-          <w:tcPr>
-            <w:tcW w:w="2052" w:type="dxa"/>
-            <w:tcBorders>
-              <w:top w:val="single" w:sz="4" w:space="0" w:color="7F7F7F"/>
-              <w:left w:val="single" w:sz="4" w:space="0" w:color="7F7F7F"/>
-              <w:bottom w:val="single" w:sz="4" w:space="0" w:color="7F7F7F"/>
-              <w:right w:val="single" w:sz="4" w:space="0" w:color="7F7F7F"/>
-            </w:tcBorders>
-            <w:vAlign w:val="center"/>
-          </w:tcPr>
-          <w:p>
-            <w:pPr>
-              <w:pStyle w:val="Normal"/>
-              <w:widowControl/>
+              <w:t>Describí brevemente en qué consiste el proyecto APT, pero no lo justifiqué ni relaciona con el campo laboral de mi carrera.</w:t>
+            </w:r>
+          </w:p>
+        </w:tc>
+        <w:tc>
+          <w:tcPr>
+            <w:tcW w:w="2053" w:type="dxa"/>
+            <w:tcBorders>
+              <w:top w:val="single" w:sz="4" w:space="0" w:color="7F7F7F"/>
+              <w:left w:val="single" w:sz="4" w:space="0" w:color="7F7F7F"/>
+              <w:bottom w:val="single" w:sz="4" w:space="0" w:color="7F7F7F"/>
+              <w:right w:val="single" w:sz="4" w:space="0" w:color="7F7F7F"/>
+            </w:tcBorders>
+            <w:vAlign w:val="center"/>
+          </w:tcPr>
+          <w:p>
+            <w:pPr>
+              <w:pStyle w:val="Normal"/>
+              <w:widowControl/>
+              <w:suppressAutoHyphens w:val="true"/>
               <w:spacing w:before="0" w:after="0"/>
               <w:jc w:val="left"/>
               <w:rPr>
@@ -7272,25 +7326,26 @@
                 <w:kern w:val="0"/>
                 <w:lang w:bidi="ar-SA"/>
               </w:rPr>
-              <w:t xml:space="preserve">No describí o es confuso el proyecto APT, sin justificar ni relacionarlo con el campo laboral de mi carrera. </w:t>
-            </w:r>
-          </w:p>
-        </w:tc>
-        <w:tc>
-          <w:tcPr>
-            <w:tcW w:w="1448" w:type="dxa"/>
-            <w:tcBorders>
-              <w:top w:val="single" w:sz="4" w:space="0" w:color="7F7F7F"/>
-              <w:left w:val="single" w:sz="4" w:space="0" w:color="7F7F7F"/>
-              <w:bottom w:val="single" w:sz="4" w:space="0" w:color="7F7F7F"/>
-              <w:right w:val="single" w:sz="4" w:space="0" w:color="7F7F7F"/>
-            </w:tcBorders>
-            <w:vAlign w:val="center"/>
-          </w:tcPr>
-          <w:p>
-            <w:pPr>
-              <w:pStyle w:val="Normal"/>
-              <w:widowControl/>
+              <w:t>No describí o es confuso el proyecto APT, sin justificar ni relacionarlo con el campo laboral de mi carrera.</w:t>
+            </w:r>
+          </w:p>
+        </w:tc>
+        <w:tc>
+          <w:tcPr>
+            <w:tcW w:w="1447" w:type="dxa"/>
+            <w:tcBorders>
+              <w:top w:val="single" w:sz="4" w:space="0" w:color="7F7F7F"/>
+              <w:left w:val="single" w:sz="4" w:space="0" w:color="7F7F7F"/>
+              <w:bottom w:val="single" w:sz="4" w:space="0" w:color="7F7F7F"/>
+              <w:right w:val="single" w:sz="4" w:space="0" w:color="7F7F7F"/>
+            </w:tcBorders>
+            <w:vAlign w:val="center"/>
+          </w:tcPr>
+          <w:p>
+            <w:pPr>
+              <w:pStyle w:val="Normal"/>
+              <w:widowControl/>
+              <w:suppressAutoHyphens w:val="true"/>
               <w:spacing w:before="0" w:after="0"/>
               <w:jc w:val="center"/>
               <w:rPr>
@@ -7331,6 +7386,7 @@
             <w:pPr>
               <w:pStyle w:val="Normal"/>
               <w:widowControl/>
+              <w:suppressAutoHyphens w:val="true"/>
               <w:spacing w:before="0" w:after="0"/>
               <w:jc w:val="left"/>
               <w:rPr>
@@ -7365,22 +7421,24 @@
             <w:pPr>
               <w:pStyle w:val="Normal"/>
               <w:widowControl/>
+              <w:suppressAutoHyphens w:val="true"/>
               <w:spacing w:before="0" w:after="0"/>
               <w:jc w:val="left"/>
               <w:rPr>
-                <w:rFonts w:ascii="Calibri" w:hAnsi="Calibri" w:eastAsia="" w:cs="" w:asciiTheme="minorHAnsi" w:cstheme="minorBidi" w:eastAsiaTheme="minorEastAsia" w:hAnsiTheme="minorHAnsi"/>
-                <w:color w:themeColor="text1" w:val="000000"/>
-                <w:lang w:eastAsia="es-CL"/>
-              </w:rPr>
-            </w:pPr>
-            <w:r>
-              <w:rPr>
-                <w:rFonts w:eastAsia="" w:cs="" w:ascii="Calibri" w:hAnsi="Calibri" w:asciiTheme="minorHAnsi" w:cstheme="minorBidi" w:eastAsiaTheme="minorEastAsia" w:hAnsiTheme="minorHAnsi"/>
-                <w:color w:themeColor="text1" w:val="000000"/>
-                <w:kern w:val="0"/>
-                <w:lang w:bidi="ar-SA"/>
-              </w:rPr>
-              <w:t xml:space="preserve">Describí una relación coherente entre mi proyecto y el perfil de egreso de mi plan de estudio, especificando cómo debo utilizar distintas competencias para desarrollar mi Proyecto APT. </w:t>
+                <w:rFonts w:asciiTheme="minorHAnsi" w:cstheme="minorBidi" w:eastAsiaTheme="minorEastAsia" w:hAnsiTheme="minorHAnsi"/>
+                <w:highlight w:val="none"/>
+                <w:shd w:fill="81D41A" w:val="clear"/>
+              </w:rPr>
+            </w:pPr>
+            <w:r>
+              <w:rPr>
+                <w:rFonts w:eastAsia="" w:cs="" w:cstheme="minorBidi" w:eastAsiaTheme="minorEastAsia" w:ascii="Calibri" w:hAnsi="Calibri"/>
+                <w:color w:themeColor="text1" w:val="000000"/>
+                <w:kern w:val="0"/>
+                <w:shd w:fill="81D41A" w:val="clear"/>
+                <w:lang w:bidi="ar-SA"/>
+              </w:rPr>
+              <w:t>Describí una relación coherente entre mi proyecto y el perfil de egreso de mi plan de estudio, especificando cómo debo utilizar distintas competencias para desarrollar mi Proyecto APT.</w:t>
             </w:r>
           </w:p>
         </w:tc>
@@ -7399,6 +7457,7 @@
             <w:pPr>
               <w:pStyle w:val="Normal"/>
               <w:widowControl/>
+              <w:suppressAutoHyphens w:val="true"/>
               <w:spacing w:before="0" w:after="0"/>
               <w:jc w:val="left"/>
               <w:rPr>
@@ -7433,6 +7492,7 @@
             <w:pPr>
               <w:pStyle w:val="Normal"/>
               <w:widowControl/>
+              <w:suppressAutoHyphens w:val="true"/>
               <w:spacing w:before="0" w:after="0"/>
               <w:jc w:val="left"/>
               <w:rPr>
@@ -7454,19 +7514,20 @@
         </w:tc>
         <w:tc>
           <w:tcPr>
-            <w:tcW w:w="2052" w:type="dxa"/>
-            <w:tcBorders>
-              <w:top w:val="single" w:sz="4" w:space="0" w:color="7F7F7F"/>
-              <w:left w:val="single" w:sz="4" w:space="0" w:color="7F7F7F"/>
-              <w:bottom w:val="single" w:sz="4" w:space="0" w:color="7F7F7F"/>
-              <w:right w:val="single" w:sz="4" w:space="0" w:color="7F7F7F"/>
-            </w:tcBorders>
-            <w:vAlign w:val="center"/>
-          </w:tcPr>
-          <w:p>
-            <w:pPr>
-              <w:pStyle w:val="Normal"/>
-              <w:widowControl/>
+            <w:tcW w:w="2053" w:type="dxa"/>
+            <w:tcBorders>
+              <w:top w:val="single" w:sz="4" w:space="0" w:color="7F7F7F"/>
+              <w:left w:val="single" w:sz="4" w:space="0" w:color="7F7F7F"/>
+              <w:bottom w:val="single" w:sz="4" w:space="0" w:color="7F7F7F"/>
+              <w:right w:val="single" w:sz="4" w:space="0" w:color="7F7F7F"/>
+            </w:tcBorders>
+            <w:vAlign w:val="center"/>
+          </w:tcPr>
+          <w:p>
+            <w:pPr>
+              <w:pStyle w:val="Normal"/>
+              <w:widowControl/>
+              <w:suppressAutoHyphens w:val="true"/>
               <w:spacing w:before="0" w:after="0"/>
               <w:jc w:val="left"/>
               <w:rPr>
@@ -7514,25 +7575,26 @@
                 <w:kern w:val="0"/>
                 <w:lang w:bidi="ar-SA"/>
               </w:rPr>
-              <w:t xml:space="preserve">No relacioné el proyecto con mi perfil de egreso. </w:t>
-            </w:r>
-          </w:p>
-        </w:tc>
-        <w:tc>
-          <w:tcPr>
-            <w:tcW w:w="1448" w:type="dxa"/>
-            <w:tcBorders>
-              <w:top w:val="single" w:sz="4" w:space="0" w:color="7F7F7F"/>
-              <w:left w:val="single" w:sz="4" w:space="0" w:color="7F7F7F"/>
-              <w:bottom w:val="single" w:sz="4" w:space="0" w:color="7F7F7F"/>
-              <w:right w:val="single" w:sz="4" w:space="0" w:color="7F7F7F"/>
-            </w:tcBorders>
-            <w:vAlign w:val="center"/>
-          </w:tcPr>
-          <w:p>
-            <w:pPr>
-              <w:pStyle w:val="Normal"/>
-              <w:widowControl/>
+              <w:t>No relacioné el proyecto con mi perfil de egreso.</w:t>
+            </w:r>
+          </w:p>
+        </w:tc>
+        <w:tc>
+          <w:tcPr>
+            <w:tcW w:w="1447" w:type="dxa"/>
+            <w:tcBorders>
+              <w:top w:val="single" w:sz="4" w:space="0" w:color="7F7F7F"/>
+              <w:left w:val="single" w:sz="4" w:space="0" w:color="7F7F7F"/>
+              <w:bottom w:val="single" w:sz="4" w:space="0" w:color="7F7F7F"/>
+              <w:right w:val="single" w:sz="4" w:space="0" w:color="7F7F7F"/>
+            </w:tcBorders>
+            <w:vAlign w:val="center"/>
+          </w:tcPr>
+          <w:p>
+            <w:pPr>
+              <w:pStyle w:val="Normal"/>
+              <w:widowControl/>
+              <w:suppressAutoHyphens w:val="true"/>
               <w:spacing w:before="0" w:after="0"/>
               <w:jc w:val="center"/>
               <w:rPr>
@@ -7576,6 +7638,7 @@
             <w:pPr>
               <w:pStyle w:val="Normal"/>
               <w:widowControl/>
+              <w:suppressAutoHyphens w:val="true"/>
               <w:spacing w:before="0" w:after="0"/>
               <w:jc w:val="left"/>
               <w:rPr>
@@ -7598,6 +7661,7 @@
             <w:pPr>
               <w:pStyle w:val="Normal"/>
               <w:widowControl/>
+              <w:suppressAutoHyphens w:val="true"/>
               <w:spacing w:before="0" w:after="0"/>
               <w:jc w:val="left"/>
               <w:rPr>
@@ -7610,15 +7674,15 @@
               <w:rPr>
                 <w:rFonts w:eastAsia="" w:cs="" w:cstheme="minorBidi" w:eastAsiaTheme="minorEastAsia" w:ascii="Calibri" w:hAnsi="Calibri"/>
                 <w:color w:themeColor="text1" w:val="000000"/>
-                <w:kern w:val="0"/>
-                <w:lang w:eastAsia="es-CL" w:bidi="ar-SA"/>
-              </w:rPr>
-            </w:r>
-          </w:p>
-          <w:p>
-            <w:pPr>
-              <w:pStyle w:val="Normal"/>
-              <w:widowControl/>
+                <w:lang w:eastAsia="es-CL"/>
+              </w:rPr>
+            </w:r>
+          </w:p>
+          <w:p>
+            <w:pPr>
+              <w:pStyle w:val="Normal"/>
+              <w:widowControl/>
+              <w:suppressAutoHyphens w:val="true"/>
               <w:spacing w:before="0" w:after="0"/>
               <w:jc w:val="left"/>
               <w:rPr>
@@ -7631,8 +7695,7 @@
               <w:rPr>
                 <w:rFonts w:eastAsia="" w:cs="" w:cstheme="minorBidi" w:eastAsiaTheme="minorEastAsia" w:ascii="Calibri" w:hAnsi="Calibri"/>
                 <w:color w:themeColor="text1" w:val="000000"/>
-                <w:kern w:val="0"/>
-                <w:lang w:eastAsia="es-CL" w:bidi="ar-SA"/>
+                <w:lang w:eastAsia="es-CL"/>
               </w:rPr>
             </w:r>
           </w:p>
@@ -7652,22 +7715,24 @@
             <w:pPr>
               <w:pStyle w:val="Normal"/>
               <w:widowControl/>
+              <w:suppressAutoHyphens w:val="true"/>
               <w:spacing w:before="0" w:after="0"/>
               <w:jc w:val="left"/>
               <w:rPr>
-                <w:rFonts w:ascii="Calibri" w:hAnsi="Calibri" w:eastAsia="" w:cs="" w:asciiTheme="minorHAnsi" w:cstheme="minorBidi" w:eastAsiaTheme="minorEastAsia" w:hAnsiTheme="minorHAnsi"/>
-                <w:color w:themeColor="text1" w:val="000000"/>
-                <w:lang w:eastAsia="es-CL"/>
-              </w:rPr>
-            </w:pPr>
-            <w:r>
-              <w:rPr>
-                <w:rFonts w:eastAsia="" w:cs="" w:ascii="Calibri" w:hAnsi="Calibri" w:asciiTheme="minorHAnsi" w:cstheme="minorBidi" w:eastAsiaTheme="minorEastAsia" w:hAnsiTheme="minorHAnsi"/>
-                <w:color w:themeColor="text1" w:val="000000"/>
-                <w:kern w:val="0"/>
-                <w:lang w:bidi="ar-SA"/>
-              </w:rPr>
-              <w:t xml:space="preserve">Mencioné mis intereses profesionales y expliqué con claridad cómo estos se ven reflejados en mi proyecto. </w:t>
+                <w:rFonts w:asciiTheme="minorHAnsi" w:cstheme="minorBidi" w:eastAsiaTheme="minorEastAsia" w:hAnsiTheme="minorHAnsi"/>
+                <w:highlight w:val="none"/>
+                <w:shd w:fill="81D41A" w:val="clear"/>
+              </w:rPr>
+            </w:pPr>
+            <w:r>
+              <w:rPr>
+                <w:rFonts w:eastAsia="" w:cs="" w:cstheme="minorBidi" w:eastAsiaTheme="minorEastAsia" w:ascii="Calibri" w:hAnsi="Calibri"/>
+                <w:color w:themeColor="text1" w:val="000000"/>
+                <w:kern w:val="0"/>
+                <w:shd w:fill="81D41A" w:val="clear"/>
+                <w:lang w:bidi="ar-SA"/>
+              </w:rPr>
+              <w:t>Mencioné mis intereses profesionales y expliqué con claridad cómo estos se ven reflejados en mi proyecto.</w:t>
             </w:r>
           </w:p>
         </w:tc>
@@ -7686,6 +7751,7 @@
             <w:pPr>
               <w:pStyle w:val="Normal"/>
               <w:widowControl/>
+              <w:suppressAutoHyphens w:val="true"/>
               <w:spacing w:before="0" w:after="0"/>
               <w:jc w:val="left"/>
               <w:rPr>
@@ -7720,6 +7786,7 @@
             <w:pPr>
               <w:pStyle w:val="Normal"/>
               <w:widowControl/>
+              <w:suppressAutoHyphens w:val="true"/>
               <w:spacing w:before="0" w:after="0"/>
               <w:jc w:val="left"/>
               <w:rPr>
@@ -7735,25 +7802,26 @@
                 <w:kern w:val="0"/>
                 <w:lang w:bidi="ar-SA"/>
               </w:rPr>
-              <w:t xml:space="preserve">Menciona mis intereses profesionales sin conectarlos con mi proyecto. </w:t>
-            </w:r>
-          </w:p>
-        </w:tc>
-        <w:tc>
-          <w:tcPr>
-            <w:tcW w:w="2052" w:type="dxa"/>
-            <w:tcBorders>
-              <w:top w:val="single" w:sz="4" w:space="0" w:color="7F7F7F"/>
-              <w:left w:val="single" w:sz="4" w:space="0" w:color="7F7F7F"/>
-              <w:bottom w:val="single" w:sz="4" w:space="0" w:color="7F7F7F"/>
-              <w:right w:val="single" w:sz="4" w:space="0" w:color="7F7F7F"/>
-            </w:tcBorders>
-            <w:vAlign w:val="center"/>
-          </w:tcPr>
-          <w:p>
-            <w:pPr>
-              <w:pStyle w:val="Normal"/>
-              <w:widowControl/>
+              <w:t>Menciona mis intereses profesionales sin conectarlos con mi proyecto.</w:t>
+            </w:r>
+          </w:p>
+        </w:tc>
+        <w:tc>
+          <w:tcPr>
+            <w:tcW w:w="2053" w:type="dxa"/>
+            <w:tcBorders>
+              <w:top w:val="single" w:sz="4" w:space="0" w:color="7F7F7F"/>
+              <w:left w:val="single" w:sz="4" w:space="0" w:color="7F7F7F"/>
+              <w:bottom w:val="single" w:sz="4" w:space="0" w:color="7F7F7F"/>
+              <w:right w:val="single" w:sz="4" w:space="0" w:color="7F7F7F"/>
+            </w:tcBorders>
+            <w:vAlign w:val="center"/>
+          </w:tcPr>
+          <w:p>
+            <w:pPr>
+              <w:pStyle w:val="Normal"/>
+              <w:widowControl/>
+              <w:suppressAutoHyphens w:val="true"/>
               <w:spacing w:before="0" w:after="0"/>
               <w:jc w:val="left"/>
               <w:rPr>
@@ -7775,19 +7843,20 @@
         </w:tc>
         <w:tc>
           <w:tcPr>
-            <w:tcW w:w="1448" w:type="dxa"/>
-            <w:tcBorders>
-              <w:top w:val="single" w:sz="4" w:space="0" w:color="7F7F7F"/>
-              <w:left w:val="single" w:sz="4" w:space="0" w:color="7F7F7F"/>
-              <w:bottom w:val="single" w:sz="4" w:space="0" w:color="7F7F7F"/>
-              <w:right w:val="single" w:sz="4" w:space="0" w:color="7F7F7F"/>
-            </w:tcBorders>
-            <w:vAlign w:val="center"/>
-          </w:tcPr>
-          <w:p>
-            <w:pPr>
-              <w:pStyle w:val="Normal"/>
-              <w:widowControl/>
+            <w:tcW w:w="1447" w:type="dxa"/>
+            <w:tcBorders>
+              <w:top w:val="single" w:sz="4" w:space="0" w:color="7F7F7F"/>
+              <w:left w:val="single" w:sz="4" w:space="0" w:color="7F7F7F"/>
+              <w:bottom w:val="single" w:sz="4" w:space="0" w:color="7F7F7F"/>
+              <w:right w:val="single" w:sz="4" w:space="0" w:color="7F7F7F"/>
+            </w:tcBorders>
+            <w:vAlign w:val="center"/>
+          </w:tcPr>
+          <w:p>
+            <w:pPr>
+              <w:pStyle w:val="Normal"/>
+              <w:widowControl/>
+              <w:suppressAutoHyphens w:val="true"/>
               <w:spacing w:before="0" w:after="0"/>
               <w:jc w:val="center"/>
               <w:rPr>
@@ -7831,6 +7900,7 @@
             <w:pPr>
               <w:pStyle w:val="Normal"/>
               <w:widowControl/>
+              <w:suppressAutoHyphens w:val="true"/>
               <w:spacing w:before="0" w:after="0"/>
               <w:jc w:val="left"/>
               <w:rPr>
@@ -7846,7 +7916,7 @@
                 <w:kern w:val="0"/>
                 <w:lang w:eastAsia="es-CL" w:bidi="ar-SA"/>
               </w:rPr>
-              <w:t xml:space="preserve">4.  Argumenta por qué el proyecto es factible de realizarse en el marco de la asignatura. </w:t>
+              <w:t>4.  Argumenta por qué el proyecto es factible de realizarse en el marco de la asignatura.</w:t>
             </w:r>
           </w:p>
         </w:tc>
@@ -7865,19 +7935,21 @@
             <w:pPr>
               <w:pStyle w:val="Normal"/>
               <w:widowControl/>
+              <w:suppressAutoHyphens w:val="true"/>
               <w:spacing w:before="0" w:after="0"/>
               <w:jc w:val="left"/>
               <w:rPr>
-                <w:rFonts w:ascii="Calibri" w:hAnsi="Calibri" w:eastAsia="" w:cs="" w:asciiTheme="minorHAnsi" w:cstheme="minorBidi" w:eastAsiaTheme="minorEastAsia" w:hAnsiTheme="minorHAnsi"/>
-                <w:color w:themeColor="text1" w:val="000000"/>
-                <w:lang w:eastAsia="es-CL"/>
-              </w:rPr>
-            </w:pPr>
-            <w:r>
-              <w:rPr>
-                <w:rFonts w:eastAsia="" w:cs="" w:ascii="Calibri" w:hAnsi="Calibri" w:asciiTheme="minorHAnsi" w:cstheme="minorBidi" w:eastAsiaTheme="minorEastAsia" w:hAnsiTheme="minorHAnsi"/>
-                <w:color w:themeColor="text1" w:val="000000"/>
-                <w:kern w:val="0"/>
+                <w:rFonts w:asciiTheme="minorHAnsi" w:cstheme="minorBidi" w:eastAsiaTheme="minorEastAsia" w:hAnsiTheme="minorHAnsi"/>
+                <w:highlight w:val="none"/>
+                <w:shd w:fill="81D41A" w:val="clear"/>
+              </w:rPr>
+            </w:pPr>
+            <w:r>
+              <w:rPr>
+                <w:rFonts w:eastAsia="" w:cs="" w:cstheme="minorBidi" w:eastAsiaTheme="minorEastAsia" w:ascii="Calibri" w:hAnsi="Calibri"/>
+                <w:color w:themeColor="text1" w:val="000000"/>
+                <w:kern w:val="0"/>
+                <w:shd w:fill="81D41A" w:val="clear"/>
                 <w:lang w:bidi="ar-SA"/>
               </w:rPr>
               <w:t>Justifiqué por qué el proyecto puede desarrollarse considerado tiempo, materiales y factores externos, y en caso de posibles dificultades plantee como las abordaría.</w:t>
@@ -7899,6 +7971,7 @@
             <w:pPr>
               <w:pStyle w:val="Normal"/>
               <w:widowControl/>
+              <w:suppressAutoHyphens w:val="true"/>
               <w:spacing w:before="0" w:after="0"/>
               <w:jc w:val="left"/>
               <w:rPr>
@@ -7965,6 +8038,7 @@
             <w:pPr>
               <w:pStyle w:val="Normal"/>
               <w:widowControl/>
+              <w:suppressAutoHyphens w:val="true"/>
               <w:spacing w:before="0" w:after="0"/>
               <w:jc w:val="left"/>
               <w:rPr>
@@ -8018,19 +8092,20 @@
         </w:tc>
         <w:tc>
           <w:tcPr>
-            <w:tcW w:w="2052" w:type="dxa"/>
-            <w:tcBorders>
-              <w:top w:val="single" w:sz="4" w:space="0" w:color="7F7F7F"/>
-              <w:left w:val="single" w:sz="4" w:space="0" w:color="7F7F7F"/>
-              <w:bottom w:val="single" w:sz="4" w:space="0" w:color="7F7F7F"/>
-              <w:right w:val="single" w:sz="4" w:space="0" w:color="7F7F7F"/>
-            </w:tcBorders>
-            <w:vAlign w:val="center"/>
-          </w:tcPr>
-          <w:p>
-            <w:pPr>
-              <w:pStyle w:val="Normal"/>
-              <w:widowControl/>
+            <w:tcW w:w="2053" w:type="dxa"/>
+            <w:tcBorders>
+              <w:top w:val="single" w:sz="4" w:space="0" w:color="7F7F7F"/>
+              <w:left w:val="single" w:sz="4" w:space="0" w:color="7F7F7F"/>
+              <w:bottom w:val="single" w:sz="4" w:space="0" w:color="7F7F7F"/>
+              <w:right w:val="single" w:sz="4" w:space="0" w:color="7F7F7F"/>
+            </w:tcBorders>
+            <w:vAlign w:val="center"/>
+          </w:tcPr>
+          <w:p>
+            <w:pPr>
+              <w:pStyle w:val="Normal"/>
+              <w:widowControl/>
+              <w:suppressAutoHyphens w:val="true"/>
               <w:spacing w:before="0" w:after="0"/>
               <w:jc w:val="left"/>
               <w:rPr>
@@ -8084,19 +8159,20 @@
         </w:tc>
         <w:tc>
           <w:tcPr>
-            <w:tcW w:w="1448" w:type="dxa"/>
-            <w:tcBorders>
-              <w:top w:val="single" w:sz="4" w:space="0" w:color="7F7F7F"/>
-              <w:left w:val="single" w:sz="4" w:space="0" w:color="7F7F7F"/>
-              <w:bottom w:val="single" w:sz="4" w:space="0" w:color="7F7F7F"/>
-              <w:right w:val="single" w:sz="4" w:space="0" w:color="7F7F7F"/>
-            </w:tcBorders>
-            <w:vAlign w:val="center"/>
-          </w:tcPr>
-          <w:p>
-            <w:pPr>
-              <w:pStyle w:val="Normal"/>
-              <w:widowControl/>
+            <w:tcW w:w="1447" w:type="dxa"/>
+            <w:tcBorders>
+              <w:top w:val="single" w:sz="4" w:space="0" w:color="7F7F7F"/>
+              <w:left w:val="single" w:sz="4" w:space="0" w:color="7F7F7F"/>
+              <w:bottom w:val="single" w:sz="4" w:space="0" w:color="7F7F7F"/>
+              <w:right w:val="single" w:sz="4" w:space="0" w:color="7F7F7F"/>
+            </w:tcBorders>
+            <w:vAlign w:val="center"/>
+          </w:tcPr>
+          <w:p>
+            <w:pPr>
+              <w:pStyle w:val="Normal"/>
+              <w:widowControl/>
+              <w:suppressAutoHyphens w:val="true"/>
               <w:spacing w:before="0" w:after="0"/>
               <w:jc w:val="center"/>
               <w:rPr>
@@ -8140,6 +8216,7 @@
             <w:pPr>
               <w:pStyle w:val="Normal"/>
               <w:widowControl/>
+              <w:suppressAutoHyphens w:val="true"/>
               <w:spacing w:before="0" w:after="0"/>
               <w:jc w:val="left"/>
               <w:rPr>
@@ -8155,7 +8232,7 @@
                 <w:kern w:val="0"/>
                 <w:lang w:eastAsia="es-CL" w:bidi="ar-SA"/>
               </w:rPr>
-              <w:t xml:space="preserve">5. Formula objetivos claros, concisos y coherentes con la disciplina y la situación a abordar. </w:t>
+              <w:t>5. Formula objetivos claros, concisos y coherentes con la disciplina y la situación a abordar.</w:t>
             </w:r>
           </w:p>
         </w:tc>
@@ -8174,6 +8251,7 @@
             <w:pPr>
               <w:pStyle w:val="Normal"/>
               <w:widowControl/>
+              <w:suppressAutoHyphens w:val="true"/>
               <w:spacing w:before="0" w:after="0"/>
               <w:jc w:val="left"/>
               <w:rPr>
@@ -8208,22 +8286,24 @@
             <w:pPr>
               <w:pStyle w:val="Normal"/>
               <w:widowControl/>
+              <w:suppressAutoHyphens w:val="true"/>
               <w:spacing w:before="0" w:after="0"/>
               <w:jc w:val="left"/>
               <w:rPr>
-                <w:rFonts w:ascii="Calibri" w:hAnsi="Calibri" w:eastAsia="" w:cs="" w:asciiTheme="minorHAnsi" w:cstheme="minorBidi" w:eastAsiaTheme="minorEastAsia" w:hAnsiTheme="minorHAnsi"/>
-                <w:color w:themeColor="text1" w:val="000000"/>
-                <w:lang w:eastAsia="es-CL"/>
-              </w:rPr>
-            </w:pPr>
-            <w:r>
-              <w:rPr>
-                <w:rFonts w:eastAsia="" w:cs="" w:ascii="Calibri" w:hAnsi="Calibri" w:asciiTheme="minorHAnsi" w:cstheme="minorBidi" w:eastAsiaTheme="minorEastAsia" w:hAnsiTheme="minorHAnsi"/>
-                <w:color w:themeColor="text1" w:val="000000"/>
-                <w:kern w:val="0"/>
-                <w:lang w:bidi="ar-SA"/>
-              </w:rPr>
-              <w:t xml:space="preserve">Formulé objetivos claros y coherentes con la situación a abordar, pero imprecisos de acuerdo a la disciplina. </w:t>
+                <w:rFonts w:asciiTheme="minorHAnsi" w:cstheme="minorBidi" w:eastAsiaTheme="minorEastAsia" w:hAnsiTheme="minorHAnsi"/>
+                <w:highlight w:val="none"/>
+                <w:shd w:fill="81D41A" w:val="clear"/>
+              </w:rPr>
+            </w:pPr>
+            <w:r>
+              <w:rPr>
+                <w:rFonts w:eastAsia="" w:cs="" w:cstheme="minorBidi" w:eastAsiaTheme="minorEastAsia" w:ascii="Calibri" w:hAnsi="Calibri"/>
+                <w:color w:themeColor="text1" w:val="000000"/>
+                <w:kern w:val="0"/>
+                <w:shd w:fill="81D41A" w:val="clear"/>
+                <w:lang w:bidi="ar-SA"/>
+              </w:rPr>
+              <w:t>Formulé objetivos claros y coherentes con la situación a abordar, pero imprecisos de acuerdo a la disciplina.</w:t>
             </w:r>
           </w:p>
         </w:tc>
@@ -8242,6 +8322,7 @@
             <w:pPr>
               <w:pStyle w:val="Normal"/>
               <w:widowControl/>
+              <w:suppressAutoHyphens w:val="true"/>
               <w:spacing w:before="0" w:after="0"/>
               <w:jc w:val="left"/>
               <w:rPr>
@@ -8257,25 +8338,26 @@
                 <w:kern w:val="0"/>
                 <w:lang w:bidi="ar-SA"/>
               </w:rPr>
-              <w:t xml:space="preserve">Formulé objetivos confusos, por lo que no queda claro lo que se busca alcanzar ni si es coherente con la situación a abordar.  </w:t>
-            </w:r>
-          </w:p>
-        </w:tc>
-        <w:tc>
-          <w:tcPr>
-            <w:tcW w:w="2052" w:type="dxa"/>
-            <w:tcBorders>
-              <w:top w:val="single" w:sz="4" w:space="0" w:color="7F7F7F"/>
-              <w:left w:val="single" w:sz="4" w:space="0" w:color="7F7F7F"/>
-              <w:bottom w:val="single" w:sz="4" w:space="0" w:color="7F7F7F"/>
-              <w:right w:val="single" w:sz="4" w:space="0" w:color="7F7F7F"/>
-            </w:tcBorders>
-            <w:vAlign w:val="center"/>
-          </w:tcPr>
-          <w:p>
-            <w:pPr>
-              <w:pStyle w:val="Normal"/>
-              <w:widowControl/>
+              <w:t>Formulé objetivos confusos, por lo que no queda claro lo que se busca alcanzar ni si es coherente con la situación a abordar.</w:t>
+            </w:r>
+          </w:p>
+        </w:tc>
+        <w:tc>
+          <w:tcPr>
+            <w:tcW w:w="2053" w:type="dxa"/>
+            <w:tcBorders>
+              <w:top w:val="single" w:sz="4" w:space="0" w:color="7F7F7F"/>
+              <w:left w:val="single" w:sz="4" w:space="0" w:color="7F7F7F"/>
+              <w:bottom w:val="single" w:sz="4" w:space="0" w:color="7F7F7F"/>
+              <w:right w:val="single" w:sz="4" w:space="0" w:color="7F7F7F"/>
+            </w:tcBorders>
+            <w:vAlign w:val="center"/>
+          </w:tcPr>
+          <w:p>
+            <w:pPr>
+              <w:pStyle w:val="Normal"/>
+              <w:widowControl/>
+              <w:suppressAutoHyphens w:val="true"/>
               <w:spacing w:before="0" w:after="0"/>
               <w:jc w:val="left"/>
               <w:rPr>
@@ -8297,19 +8379,20 @@
         </w:tc>
         <w:tc>
           <w:tcPr>
-            <w:tcW w:w="1448" w:type="dxa"/>
-            <w:tcBorders>
-              <w:top w:val="single" w:sz="4" w:space="0" w:color="7F7F7F"/>
-              <w:left w:val="single" w:sz="4" w:space="0" w:color="7F7F7F"/>
-              <w:bottom w:val="single" w:sz="4" w:space="0" w:color="7F7F7F"/>
-              <w:right w:val="single" w:sz="4" w:space="0" w:color="7F7F7F"/>
-            </w:tcBorders>
-            <w:vAlign w:val="center"/>
-          </w:tcPr>
-          <w:p>
-            <w:pPr>
-              <w:pStyle w:val="Normal"/>
-              <w:widowControl/>
+            <w:tcW w:w="1447" w:type="dxa"/>
+            <w:tcBorders>
+              <w:top w:val="single" w:sz="4" w:space="0" w:color="7F7F7F"/>
+              <w:left w:val="single" w:sz="4" w:space="0" w:color="7F7F7F"/>
+              <w:bottom w:val="single" w:sz="4" w:space="0" w:color="7F7F7F"/>
+              <w:right w:val="single" w:sz="4" w:space="0" w:color="7F7F7F"/>
+            </w:tcBorders>
+            <w:vAlign w:val="center"/>
+          </w:tcPr>
+          <w:p>
+            <w:pPr>
+              <w:pStyle w:val="Normal"/>
+              <w:widowControl/>
+              <w:suppressAutoHyphens w:val="true"/>
               <w:spacing w:before="0" w:after="0"/>
               <w:jc w:val="center"/>
               <w:rPr>
@@ -8353,6 +8436,7 @@
             <w:pPr>
               <w:pStyle w:val="Normal"/>
               <w:widowControl/>
+              <w:suppressAutoHyphens w:val="true"/>
               <w:spacing w:before="0" w:after="0"/>
               <w:jc w:val="left"/>
               <w:rPr>
@@ -8387,19 +8471,21 @@
             <w:pPr>
               <w:pStyle w:val="Normal"/>
               <w:widowControl/>
+              <w:suppressAutoHyphens w:val="true"/>
               <w:spacing w:before="0" w:after="0"/>
               <w:jc w:val="left"/>
               <w:rPr>
-                <w:rFonts w:ascii="Calibri" w:hAnsi="Calibri" w:eastAsia="" w:cs="" w:asciiTheme="minorHAnsi" w:cstheme="minorBidi" w:eastAsiaTheme="minorEastAsia" w:hAnsiTheme="minorHAnsi"/>
-                <w:color w:themeColor="text1" w:val="000000"/>
-                <w:lang w:eastAsia="es-CL"/>
-              </w:rPr>
-            </w:pPr>
-            <w:r>
-              <w:rPr>
-                <w:rFonts w:eastAsia="" w:cs="" w:ascii="Calibri" w:hAnsi="Calibri" w:asciiTheme="minorHAnsi" w:cstheme="minorBidi" w:eastAsiaTheme="minorEastAsia" w:hAnsiTheme="minorHAnsi"/>
-                <w:color w:themeColor="text1" w:val="000000"/>
-                <w:kern w:val="0"/>
+                <w:rFonts w:asciiTheme="minorHAnsi" w:cstheme="minorBidi" w:eastAsiaTheme="minorEastAsia" w:hAnsiTheme="minorHAnsi"/>
+                <w:highlight w:val="none"/>
+                <w:shd w:fill="81D41A" w:val="clear"/>
+              </w:rPr>
+            </w:pPr>
+            <w:r>
+              <w:rPr>
+                <w:rFonts w:eastAsia="" w:cs="" w:cstheme="minorBidi" w:eastAsiaTheme="minorEastAsia" w:ascii="Calibri" w:hAnsi="Calibri"/>
+                <w:color w:themeColor="text1" w:val="000000"/>
+                <w:kern w:val="0"/>
+                <w:shd w:fill="81D41A" w:val="clear"/>
                 <w:lang w:bidi="ar-SA"/>
               </w:rPr>
               <w:t>Describí una metodología pertinente con los requerimientos disciplinares, contemplando todos los aspectos necesarios para alcanzar los objetivos planteados.</w:t>
@@ -8421,6 +8507,7 @@
             <w:pPr>
               <w:pStyle w:val="Normal"/>
               <w:widowControl/>
+              <w:suppressAutoHyphens w:val="true"/>
               <w:spacing w:before="0" w:after="0"/>
               <w:jc w:val="left"/>
               <w:rPr>
@@ -8455,6 +8542,7 @@
             <w:pPr>
               <w:pStyle w:val="Normal"/>
               <w:widowControl/>
+              <w:suppressAutoHyphens w:val="true"/>
               <w:spacing w:before="0" w:after="0"/>
               <w:jc w:val="left"/>
               <w:rPr>
@@ -8476,19 +8564,20 @@
         </w:tc>
         <w:tc>
           <w:tcPr>
-            <w:tcW w:w="2052" w:type="dxa"/>
-            <w:tcBorders>
-              <w:top w:val="single" w:sz="4" w:space="0" w:color="7F7F7F"/>
-              <w:left w:val="single" w:sz="4" w:space="0" w:color="7F7F7F"/>
-              <w:bottom w:val="single" w:sz="4" w:space="0" w:color="7F7F7F"/>
-              <w:right w:val="single" w:sz="4" w:space="0" w:color="7F7F7F"/>
-            </w:tcBorders>
-            <w:vAlign w:val="center"/>
-          </w:tcPr>
-          <w:p>
-            <w:pPr>
-              <w:pStyle w:val="Normal"/>
-              <w:widowControl/>
+            <w:tcW w:w="2053" w:type="dxa"/>
+            <w:tcBorders>
+              <w:top w:val="single" w:sz="4" w:space="0" w:color="7F7F7F"/>
+              <w:left w:val="single" w:sz="4" w:space="0" w:color="7F7F7F"/>
+              <w:bottom w:val="single" w:sz="4" w:space="0" w:color="7F7F7F"/>
+              <w:right w:val="single" w:sz="4" w:space="0" w:color="7F7F7F"/>
+            </w:tcBorders>
+            <w:vAlign w:val="center"/>
+          </w:tcPr>
+          <w:p>
+            <w:pPr>
+              <w:pStyle w:val="Normal"/>
+              <w:widowControl/>
+              <w:suppressAutoHyphens w:val="true"/>
               <w:spacing w:before="0" w:after="0"/>
               <w:jc w:val="left"/>
               <w:rPr>
@@ -8504,25 +8593,26 @@
                 <w:kern w:val="0"/>
                 <w:lang w:bidi="ar-SA"/>
               </w:rPr>
-              <w:t xml:space="preserve">No describí una metodología, o bien esta no es pertinente para lograr los objetivos propuestos. </w:t>
-            </w:r>
-          </w:p>
-        </w:tc>
-        <w:tc>
-          <w:tcPr>
-            <w:tcW w:w="1448" w:type="dxa"/>
-            <w:tcBorders>
-              <w:top w:val="single" w:sz="4" w:space="0" w:color="7F7F7F"/>
-              <w:left w:val="single" w:sz="4" w:space="0" w:color="7F7F7F"/>
-              <w:bottom w:val="single" w:sz="4" w:space="0" w:color="7F7F7F"/>
-              <w:right w:val="single" w:sz="4" w:space="0" w:color="7F7F7F"/>
-            </w:tcBorders>
-            <w:vAlign w:val="center"/>
-          </w:tcPr>
-          <w:p>
-            <w:pPr>
-              <w:pStyle w:val="Normal"/>
-              <w:widowControl/>
+              <w:t>No describí una metodología, o bien esta no es pertinente para lograr los objetivos propuestos.</w:t>
+            </w:r>
+          </w:p>
+        </w:tc>
+        <w:tc>
+          <w:tcPr>
+            <w:tcW w:w="1447" w:type="dxa"/>
+            <w:tcBorders>
+              <w:top w:val="single" w:sz="4" w:space="0" w:color="7F7F7F"/>
+              <w:left w:val="single" w:sz="4" w:space="0" w:color="7F7F7F"/>
+              <w:bottom w:val="single" w:sz="4" w:space="0" w:color="7F7F7F"/>
+              <w:right w:val="single" w:sz="4" w:space="0" w:color="7F7F7F"/>
+            </w:tcBorders>
+            <w:vAlign w:val="center"/>
+          </w:tcPr>
+          <w:p>
+            <w:pPr>
+              <w:pStyle w:val="Normal"/>
+              <w:widowControl/>
+              <w:suppressAutoHyphens w:val="true"/>
               <w:spacing w:before="0" w:after="0"/>
               <w:jc w:val="center"/>
               <w:rPr>
@@ -8566,6 +8656,7 @@
             <w:pPr>
               <w:pStyle w:val="Normal"/>
               <w:widowControl/>
+              <w:suppressAutoHyphens w:val="true"/>
               <w:spacing w:before="0" w:after="0"/>
               <w:jc w:val="left"/>
               <w:rPr>
@@ -8581,13 +8672,14 @@
                 <w:kern w:val="0"/>
                 <w:lang w:eastAsia="es-CL" w:bidi="ar-SA"/>
               </w:rPr>
-              <w:t xml:space="preserve">7. Establece un plan de trabajo para su proyecto APT considerando los recursos, duración, facilitadores y obstaculizadores en el desarrollo de las actividades. </w:t>
-            </w:r>
-          </w:p>
-          <w:p>
-            <w:pPr>
-              <w:pStyle w:val="Normal"/>
-              <w:widowControl/>
+              <w:t>7. Establece un plan de trabajo para su proyecto APT considerando los recursos, duración, facilitadores y obstaculizadores en el desarrollo de las actividades.</w:t>
+            </w:r>
+          </w:p>
+          <w:p>
+            <w:pPr>
+              <w:pStyle w:val="Normal"/>
+              <w:widowControl/>
+              <w:suppressAutoHyphens w:val="true"/>
               <w:spacing w:before="0" w:after="0"/>
               <w:jc w:val="left"/>
               <w:rPr>
@@ -8600,8 +8692,7 @@
               <w:rPr>
                 <w:rFonts w:eastAsia="" w:cs="" w:cstheme="minorBidi" w:eastAsiaTheme="minorEastAsia" w:ascii="Calibri" w:hAnsi="Calibri"/>
                 <w:color w:themeColor="text1" w:val="000000"/>
-                <w:kern w:val="0"/>
-                <w:lang w:eastAsia="es-CL" w:bidi="ar-SA"/>
+                <w:lang w:eastAsia="es-CL"/>
               </w:rPr>
             </w:r>
           </w:p>
@@ -8621,22 +8712,24 @@
             <w:pPr>
               <w:pStyle w:val="Normal"/>
               <w:widowControl/>
+              <w:suppressAutoHyphens w:val="true"/>
               <w:spacing w:before="0" w:after="0"/>
               <w:jc w:val="left"/>
               <w:rPr>
-                <w:rFonts w:ascii="Calibri" w:hAnsi="Calibri" w:eastAsia="" w:cs="" w:asciiTheme="minorHAnsi" w:cstheme="minorBidi" w:eastAsiaTheme="minorEastAsia" w:hAnsiTheme="minorHAnsi"/>
-                <w:color w:themeColor="text1" w:val="000000"/>
-                <w:lang w:eastAsia="es-CL"/>
-              </w:rPr>
-            </w:pPr>
-            <w:r>
-              <w:rPr>
-                <w:rFonts w:eastAsia="" w:cs="" w:ascii="Calibri" w:hAnsi="Calibri" w:asciiTheme="minorHAnsi" w:cstheme="minorBidi" w:eastAsiaTheme="minorEastAsia" w:hAnsiTheme="minorHAnsi"/>
-                <w:color w:themeColor="text1" w:val="000000"/>
-                <w:kern w:val="0"/>
-                <w:lang w:bidi="ar-SA"/>
-              </w:rPr>
-              <w:t xml:space="preserve">Establecí un plan de trabajo con todas las actividades necesarias para cumplir mis objetivos, teniendo en consideración los recursos, duración, facilitadores y obstaculizadores. </w:t>
+                <w:rFonts w:asciiTheme="minorHAnsi" w:cstheme="minorBidi" w:eastAsiaTheme="minorEastAsia" w:hAnsiTheme="minorHAnsi"/>
+                <w:highlight w:val="none"/>
+                <w:shd w:fill="81D41A" w:val="clear"/>
+              </w:rPr>
+            </w:pPr>
+            <w:r>
+              <w:rPr>
+                <w:rFonts w:eastAsia="" w:cs="" w:cstheme="minorBidi" w:eastAsiaTheme="minorEastAsia" w:ascii="Calibri" w:hAnsi="Calibri"/>
+                <w:color w:themeColor="text1" w:val="000000"/>
+                <w:kern w:val="0"/>
+                <w:shd w:fill="81D41A" w:val="clear"/>
+                <w:lang w:bidi="ar-SA"/>
+              </w:rPr>
+              <w:t>Establecí un plan de trabajo con todas las actividades necesarias para cumplir mis objetivos, teniendo en consideración los recursos, duración, facilitadores y obstaculizadores.</w:t>
             </w:r>
           </w:p>
         </w:tc>
@@ -8655,6 +8748,7 @@
             <w:pPr>
               <w:pStyle w:val="Normal"/>
               <w:widowControl/>
+              <w:suppressAutoHyphens w:val="true"/>
               <w:spacing w:before="0" w:after="0"/>
               <w:jc w:val="left"/>
               <w:rPr>
@@ -8670,7 +8764,7 @@
                 <w:kern w:val="0"/>
                 <w:lang w:bidi="ar-SA"/>
               </w:rPr>
-              <w:t xml:space="preserve">Establecí un plan de trabajo con la mayoría de las actividades necesarias para cumplir mis objetivos, teniendo en consideración los recursos, duración, facilitadores y obstaculizadores. </w:t>
+              <w:t>Establecí un plan de trabajo con la mayoría de las actividades necesarias para cumplir mis objetivos, teniendo en consideración los recursos, duración, facilitadores y obstaculizadores.</w:t>
             </w:r>
           </w:p>
         </w:tc>
@@ -8689,6 +8783,7 @@
             <w:pPr>
               <w:pStyle w:val="Normal"/>
               <w:widowControl/>
+              <w:suppressAutoHyphens w:val="true"/>
               <w:spacing w:before="0" w:after="0"/>
               <w:jc w:val="left"/>
               <w:rPr>
@@ -8704,25 +8799,26 @@
                 <w:kern w:val="0"/>
                 <w:lang w:bidi="ar-SA"/>
               </w:rPr>
-              <w:t xml:space="preserve">Establecí un plan de trabajo que carece de actividades necesarias para cumplir mis objetivos y/o no tiene en consideración los recursos, duración, facilitadores y obstaculizadores. </w:t>
-            </w:r>
-          </w:p>
-        </w:tc>
-        <w:tc>
-          <w:tcPr>
-            <w:tcW w:w="2052" w:type="dxa"/>
-            <w:tcBorders>
-              <w:top w:val="single" w:sz="4" w:space="0" w:color="7F7F7F"/>
-              <w:left w:val="single" w:sz="4" w:space="0" w:color="7F7F7F"/>
-              <w:bottom w:val="single" w:sz="4" w:space="0" w:color="7F7F7F"/>
-              <w:right w:val="single" w:sz="4" w:space="0" w:color="7F7F7F"/>
-            </w:tcBorders>
-            <w:vAlign w:val="center"/>
-          </w:tcPr>
-          <w:p>
-            <w:pPr>
-              <w:pStyle w:val="Normal"/>
-              <w:widowControl/>
+              <w:t>Establecí un plan de trabajo que carece de actividades necesarias para cumplir mis objetivos y/o no tiene en consideración los recursos, duración, facilitadores y obstaculizadores.</w:t>
+            </w:r>
+          </w:p>
+        </w:tc>
+        <w:tc>
+          <w:tcPr>
+            <w:tcW w:w="2053" w:type="dxa"/>
+            <w:tcBorders>
+              <w:top w:val="single" w:sz="4" w:space="0" w:color="7F7F7F"/>
+              <w:left w:val="single" w:sz="4" w:space="0" w:color="7F7F7F"/>
+              <w:bottom w:val="single" w:sz="4" w:space="0" w:color="7F7F7F"/>
+              <w:right w:val="single" w:sz="4" w:space="0" w:color="7F7F7F"/>
+            </w:tcBorders>
+            <w:vAlign w:val="center"/>
+          </w:tcPr>
+          <w:p>
+            <w:pPr>
+              <w:pStyle w:val="Normal"/>
+              <w:widowControl/>
+              <w:suppressAutoHyphens w:val="true"/>
               <w:spacing w:before="0" w:after="0"/>
               <w:jc w:val="left"/>
               <w:rPr>
@@ -8744,19 +8840,20 @@
         </w:tc>
         <w:tc>
           <w:tcPr>
-            <w:tcW w:w="1448" w:type="dxa"/>
-            <w:tcBorders>
-              <w:top w:val="single" w:sz="4" w:space="0" w:color="7F7F7F"/>
-              <w:left w:val="single" w:sz="4" w:space="0" w:color="7F7F7F"/>
-              <w:bottom w:val="single" w:sz="4" w:space="0" w:color="7F7F7F"/>
-              <w:right w:val="single" w:sz="4" w:space="0" w:color="7F7F7F"/>
-            </w:tcBorders>
-            <w:vAlign w:val="center"/>
-          </w:tcPr>
-          <w:p>
-            <w:pPr>
-              <w:pStyle w:val="Normal"/>
-              <w:widowControl/>
+            <w:tcW w:w="1447" w:type="dxa"/>
+            <w:tcBorders>
+              <w:top w:val="single" w:sz="4" w:space="0" w:color="7F7F7F"/>
+              <w:left w:val="single" w:sz="4" w:space="0" w:color="7F7F7F"/>
+              <w:bottom w:val="single" w:sz="4" w:space="0" w:color="7F7F7F"/>
+              <w:right w:val="single" w:sz="4" w:space="0" w:color="7F7F7F"/>
+            </w:tcBorders>
+            <w:vAlign w:val="center"/>
+          </w:tcPr>
+          <w:p>
+            <w:pPr>
+              <w:pStyle w:val="Normal"/>
+              <w:widowControl/>
+              <w:suppressAutoHyphens w:val="true"/>
               <w:spacing w:before="0" w:after="0"/>
               <w:jc w:val="center"/>
               <w:rPr>
@@ -8800,6 +8897,7 @@
             <w:pPr>
               <w:pStyle w:val="Normal"/>
               <w:widowControl/>
+              <w:suppressAutoHyphens w:val="true"/>
               <w:spacing w:before="0" w:after="0"/>
               <w:jc w:val="left"/>
               <w:rPr>
@@ -8834,22 +8932,24 @@
             <w:pPr>
               <w:pStyle w:val="Normal"/>
               <w:widowControl/>
+              <w:suppressAutoHyphens w:val="true"/>
               <w:spacing w:before="0" w:after="0"/>
               <w:jc w:val="left"/>
               <w:rPr>
-                <w:rFonts w:ascii="Calibri" w:hAnsi="Calibri" w:eastAsia="" w:cs="" w:asciiTheme="minorHAnsi" w:cstheme="minorBidi" w:eastAsiaTheme="minorEastAsia" w:hAnsiTheme="minorHAnsi"/>
-                <w:color w:themeColor="text1" w:val="000000"/>
-                <w:lang w:eastAsia="es-CL"/>
-              </w:rPr>
-            </w:pPr>
-            <w:r>
-              <w:rPr>
-                <w:rFonts w:eastAsia="" w:cs="" w:ascii="Calibri" w:hAnsi="Calibri" w:asciiTheme="minorHAnsi" w:cstheme="minorBidi" w:eastAsiaTheme="minorEastAsia" w:hAnsiTheme="minorHAnsi"/>
-                <w:color w:themeColor="text1" w:val="000000"/>
-                <w:kern w:val="0"/>
-                <w:lang w:bidi="ar-SA"/>
-              </w:rPr>
-              <w:t xml:space="preserve">Describí evidencias que permiten dar cuenta del logro de las actividades de mi proyecto APT y justifiqué su selección. </w:t>
+                <w:rFonts w:asciiTheme="minorHAnsi" w:cstheme="minorBidi" w:eastAsiaTheme="minorEastAsia" w:hAnsiTheme="minorHAnsi"/>
+                <w:highlight w:val="none"/>
+                <w:shd w:fill="81D41A" w:val="clear"/>
+              </w:rPr>
+            </w:pPr>
+            <w:r>
+              <w:rPr>
+                <w:rFonts w:eastAsia="" w:cs="" w:cstheme="minorBidi" w:eastAsiaTheme="minorEastAsia" w:ascii="Calibri" w:hAnsi="Calibri"/>
+                <w:color w:themeColor="text1" w:val="000000"/>
+                <w:kern w:val="0"/>
+                <w:shd w:fill="81D41A" w:val="clear"/>
+                <w:lang w:bidi="ar-SA"/>
+              </w:rPr>
+              <w:t>Describí evidencias que permiten dar cuenta del logro de las actividades de mi proyecto APT y justifiqué su selección.</w:t>
             </w:r>
           </w:p>
         </w:tc>
@@ -8868,6 +8968,7 @@
             <w:pPr>
               <w:pStyle w:val="Normal"/>
               <w:widowControl/>
+              <w:suppressAutoHyphens w:val="true"/>
               <w:spacing w:before="0" w:after="0"/>
               <w:jc w:val="left"/>
               <w:rPr>
@@ -8901,6 +9002,7 @@
             <w:pPr>
               <w:pStyle w:val="Normal"/>
               <w:widowControl/>
+              <w:suppressAutoHyphens w:val="true"/>
               <w:spacing w:before="0" w:after="0"/>
               <w:jc w:val="left"/>
               <w:rPr>
@@ -8916,25 +9018,26 @@
                 <w:kern w:val="0"/>
                 <w:lang w:bidi="ar-SA"/>
               </w:rPr>
-              <w:t xml:space="preserve">Describí evidencias que permiten dar cuenta del logro de solo algunas actividades de mi proyecto APT y/o no justifiqué su selección. </w:t>
-            </w:r>
-          </w:p>
-        </w:tc>
-        <w:tc>
-          <w:tcPr>
-            <w:tcW w:w="2052" w:type="dxa"/>
-            <w:tcBorders>
-              <w:top w:val="single" w:sz="4" w:space="0" w:color="7F7F7F"/>
-              <w:left w:val="single" w:sz="4" w:space="0" w:color="7F7F7F"/>
-              <w:bottom w:val="single" w:sz="4" w:space="0" w:color="7F7F7F"/>
-              <w:right w:val="single" w:sz="4" w:space="0" w:color="7F7F7F"/>
-            </w:tcBorders>
-            <w:vAlign w:val="center"/>
-          </w:tcPr>
-          <w:p>
-            <w:pPr>
-              <w:pStyle w:val="Normal"/>
-              <w:widowControl/>
+              <w:t>Describí evidencias que permiten dar cuenta del logro de solo algunas actividades de mi proyecto APT y/o no justifiqué su selección.</w:t>
+            </w:r>
+          </w:p>
+        </w:tc>
+        <w:tc>
+          <w:tcPr>
+            <w:tcW w:w="2053" w:type="dxa"/>
+            <w:tcBorders>
+              <w:top w:val="single" w:sz="4" w:space="0" w:color="7F7F7F"/>
+              <w:left w:val="single" w:sz="4" w:space="0" w:color="7F7F7F"/>
+              <w:bottom w:val="single" w:sz="4" w:space="0" w:color="7F7F7F"/>
+              <w:right w:val="single" w:sz="4" w:space="0" w:color="7F7F7F"/>
+            </w:tcBorders>
+            <w:vAlign w:val="center"/>
+          </w:tcPr>
+          <w:p>
+            <w:pPr>
+              <w:pStyle w:val="Normal"/>
+              <w:widowControl/>
+              <w:suppressAutoHyphens w:val="true"/>
               <w:spacing w:before="0" w:after="0"/>
               <w:jc w:val="left"/>
               <w:rPr>
@@ -8956,19 +9059,20 @@
         </w:tc>
         <w:tc>
           <w:tcPr>
-            <w:tcW w:w="1448" w:type="dxa"/>
-            <w:tcBorders>
-              <w:top w:val="single" w:sz="4" w:space="0" w:color="7F7F7F"/>
-              <w:left w:val="single" w:sz="4" w:space="0" w:color="7F7F7F"/>
-              <w:bottom w:val="single" w:sz="4" w:space="0" w:color="7F7F7F"/>
-              <w:right w:val="single" w:sz="4" w:space="0" w:color="7F7F7F"/>
-            </w:tcBorders>
-            <w:vAlign w:val="center"/>
-          </w:tcPr>
-          <w:p>
-            <w:pPr>
-              <w:pStyle w:val="Normal"/>
-              <w:widowControl/>
+            <w:tcW w:w="1447" w:type="dxa"/>
+            <w:tcBorders>
+              <w:top w:val="single" w:sz="4" w:space="0" w:color="7F7F7F"/>
+              <w:left w:val="single" w:sz="4" w:space="0" w:color="7F7F7F"/>
+              <w:bottom w:val="single" w:sz="4" w:space="0" w:color="7F7F7F"/>
+              <w:right w:val="single" w:sz="4" w:space="0" w:color="7F7F7F"/>
+            </w:tcBorders>
+            <w:vAlign w:val="center"/>
+          </w:tcPr>
+          <w:p>
+            <w:pPr>
+              <w:pStyle w:val="Normal"/>
+              <w:widowControl/>
+              <w:suppressAutoHyphens w:val="true"/>
               <w:spacing w:before="0" w:after="0"/>
               <w:jc w:val="center"/>
               <w:rPr>
@@ -9012,6 +9116,7 @@
             <w:pPr>
               <w:pStyle w:val="Normal"/>
               <w:widowControl/>
+              <w:suppressAutoHyphens w:val="true"/>
               <w:spacing w:before="0" w:after="0"/>
               <w:jc w:val="left"/>
               <w:rPr>
@@ -9027,7 +9132,7 @@
                 <w:kern w:val="0"/>
                 <w:lang w:eastAsia="es-CL" w:bidi="ar-SA"/>
               </w:rPr>
-              <w:t xml:space="preserve">9. Utiliza reglas de redacción, ortografía (literal, puntual, acentual) y las normas para citas y referencias. </w:t>
+              <w:t>9. Utiliza reglas de redacción, ortografía (literal, puntual, acentual) y las normas para citas y referencias.</w:t>
             </w:r>
           </w:p>
         </w:tc>
@@ -9046,6 +9151,7 @@
             <w:pPr>
               <w:pStyle w:val="Normal"/>
               <w:widowControl/>
+              <w:suppressAutoHyphens w:val="true"/>
               <w:spacing w:before="0" w:after="0"/>
               <w:jc w:val="left"/>
               <w:rPr>
@@ -9112,19 +9218,21 @@
             <w:pPr>
               <w:pStyle w:val="Normal"/>
               <w:widowControl/>
+              <w:suppressAutoHyphens w:val="true"/>
               <w:spacing w:before="0" w:after="0"/>
               <w:jc w:val="left"/>
               <w:rPr>
-                <w:rFonts w:ascii="Calibri" w:hAnsi="Calibri" w:eastAsia="" w:cs="" w:asciiTheme="minorHAnsi" w:cstheme="minorBidi" w:eastAsiaTheme="minorEastAsia" w:hAnsiTheme="minorHAnsi"/>
-                <w:color w:themeColor="text1" w:val="000000"/>
-                <w:lang w:eastAsia="es-CL"/>
-              </w:rPr>
-            </w:pPr>
-            <w:r>
-              <w:rPr>
-                <w:rFonts w:eastAsia="" w:cs="" w:ascii="Calibri" w:hAnsi="Calibri" w:asciiTheme="minorHAnsi" w:cstheme="minorBidi" w:eastAsiaTheme="minorEastAsia" w:hAnsiTheme="minorHAnsi"/>
-                <w:color w:themeColor="text1" w:val="000000"/>
-                <w:kern w:val="0"/>
+                <w:rFonts w:asciiTheme="minorHAnsi" w:cstheme="minorBidi" w:eastAsiaTheme="minorEastAsia" w:hAnsiTheme="minorHAnsi"/>
+                <w:highlight w:val="none"/>
+                <w:shd w:fill="81D41A" w:val="clear"/>
+              </w:rPr>
+            </w:pPr>
+            <w:r>
+              <w:rPr>
+                <w:rFonts w:eastAsia="" w:cs="" w:cstheme="minorBidi" w:eastAsiaTheme="minorEastAsia" w:ascii="Calibri" w:hAnsi="Calibri"/>
+                <w:color w:themeColor="text1" w:val="000000"/>
+                <w:kern w:val="0"/>
+                <w:shd w:fill="81D41A" w:val="clear"/>
                 <w:lang w:bidi="ar-SA"/>
               </w:rPr>
               <w:t>El texto presenta de 1 a 5 errores de ortografía, redacción o en las citas y referencias del informe.</w:t>
@@ -9146,6 +9254,7 @@
             <w:pPr>
               <w:pStyle w:val="Normal"/>
               <w:widowControl/>
+              <w:suppressAutoHyphens w:val="true"/>
               <w:spacing w:before="0" w:after="0"/>
               <w:jc w:val="left"/>
               <w:rPr>
@@ -9167,19 +9276,20 @@
         </w:tc>
         <w:tc>
           <w:tcPr>
-            <w:tcW w:w="2052" w:type="dxa"/>
-            <w:tcBorders>
-              <w:top w:val="single" w:sz="4" w:space="0" w:color="7F7F7F"/>
-              <w:left w:val="single" w:sz="4" w:space="0" w:color="7F7F7F"/>
-              <w:bottom w:val="single" w:sz="4" w:space="0" w:color="7F7F7F"/>
-              <w:right w:val="single" w:sz="4" w:space="0" w:color="7F7F7F"/>
-            </w:tcBorders>
-            <w:vAlign w:val="center"/>
-          </w:tcPr>
-          <w:p>
-            <w:pPr>
-              <w:pStyle w:val="Normal"/>
-              <w:widowControl/>
+            <w:tcW w:w="2053" w:type="dxa"/>
+            <w:tcBorders>
+              <w:top w:val="single" w:sz="4" w:space="0" w:color="7F7F7F"/>
+              <w:left w:val="single" w:sz="4" w:space="0" w:color="7F7F7F"/>
+              <w:bottom w:val="single" w:sz="4" w:space="0" w:color="7F7F7F"/>
+              <w:right w:val="single" w:sz="4" w:space="0" w:color="7F7F7F"/>
+            </w:tcBorders>
+            <w:vAlign w:val="center"/>
+          </w:tcPr>
+          <w:p>
+            <w:pPr>
+              <w:pStyle w:val="Normal"/>
+              <w:widowControl/>
+              <w:suppressAutoHyphens w:val="true"/>
               <w:spacing w:before="0" w:after="0"/>
               <w:jc w:val="left"/>
               <w:rPr>
@@ -9201,19 +9311,20 @@
         </w:tc>
         <w:tc>
           <w:tcPr>
-            <w:tcW w:w="1448" w:type="dxa"/>
-            <w:tcBorders>
-              <w:top w:val="single" w:sz="4" w:space="0" w:color="7F7F7F"/>
-              <w:left w:val="single" w:sz="4" w:space="0" w:color="7F7F7F"/>
-              <w:bottom w:val="single" w:sz="4" w:space="0" w:color="7F7F7F"/>
-              <w:right w:val="single" w:sz="4" w:space="0" w:color="7F7F7F"/>
-            </w:tcBorders>
-            <w:vAlign w:val="center"/>
-          </w:tcPr>
-          <w:p>
-            <w:pPr>
-              <w:pStyle w:val="Normal"/>
-              <w:widowControl/>
+            <w:tcW w:w="1447" w:type="dxa"/>
+            <w:tcBorders>
+              <w:top w:val="single" w:sz="4" w:space="0" w:color="7F7F7F"/>
+              <w:left w:val="single" w:sz="4" w:space="0" w:color="7F7F7F"/>
+              <w:bottom w:val="single" w:sz="4" w:space="0" w:color="7F7F7F"/>
+              <w:right w:val="single" w:sz="4" w:space="0" w:color="7F7F7F"/>
+            </w:tcBorders>
+            <w:vAlign w:val="center"/>
+          </w:tcPr>
+          <w:p>
+            <w:pPr>
+              <w:pStyle w:val="Normal"/>
+              <w:widowControl/>
+              <w:suppressAutoHyphens w:val="true"/>
               <w:spacing w:before="0" w:after="0"/>
               <w:jc w:val="center"/>
               <w:rPr>
@@ -9257,6 +9368,7 @@
             <w:pPr>
               <w:pStyle w:val="Normal"/>
               <w:widowControl/>
+              <w:suppressAutoHyphens w:val="true"/>
               <w:spacing w:before="0" w:after="0"/>
               <w:jc w:val="left"/>
               <w:rPr>
@@ -9272,7 +9384,7 @@
                 <w:kern w:val="0"/>
                 <w:lang w:eastAsia="es-CL" w:bidi="ar-SA"/>
               </w:rPr>
-              <w:t xml:space="preserve">10.  Cumple con el formato del informe establecido por la disciplina. </w:t>
+              <w:t>10.  Cumple con el formato del informe establecido por la disciplina.</w:t>
             </w:r>
           </w:p>
         </w:tc>
@@ -9291,19 +9403,21 @@
             <w:pPr>
               <w:pStyle w:val="Normal"/>
               <w:widowControl/>
+              <w:suppressAutoHyphens w:val="true"/>
               <w:spacing w:before="0" w:after="0"/>
               <w:jc w:val="left"/>
               <w:rPr>
-                <w:rFonts w:ascii="Calibri" w:hAnsi="Calibri" w:eastAsia="" w:cs="" w:asciiTheme="minorHAnsi" w:cstheme="minorBidi" w:eastAsiaTheme="minorEastAsia" w:hAnsiTheme="minorHAnsi"/>
-                <w:color w:themeColor="text1" w:val="000000"/>
-                <w:lang w:eastAsia="es-CL"/>
-              </w:rPr>
-            </w:pPr>
-            <w:r>
-              <w:rPr>
-                <w:rFonts w:eastAsia="" w:cs="" w:ascii="Calibri" w:hAnsi="Calibri" w:asciiTheme="minorHAnsi" w:cstheme="minorBidi" w:eastAsiaTheme="minorEastAsia" w:hAnsiTheme="minorHAnsi"/>
-                <w:color w:themeColor="text1" w:val="000000"/>
-                <w:kern w:val="0"/>
+                <w:rFonts w:asciiTheme="minorHAnsi" w:cstheme="minorBidi" w:eastAsiaTheme="minorEastAsia" w:hAnsiTheme="minorHAnsi"/>
+                <w:highlight w:val="none"/>
+                <w:shd w:fill="81D41A" w:val="clear"/>
+              </w:rPr>
+            </w:pPr>
+            <w:r>
+              <w:rPr>
+                <w:rFonts w:eastAsia="" w:cs="" w:cstheme="minorBidi" w:eastAsiaTheme="minorEastAsia" w:ascii="Calibri" w:hAnsi="Calibri"/>
+                <w:color w:themeColor="text1" w:val="000000"/>
+                <w:kern w:val="0"/>
+                <w:shd w:fill="81D41A" w:val="clear"/>
                 <w:lang w:bidi="ar-SA"/>
               </w:rPr>
               <w:t>El informe cumple con todos los aspectos del formato establecido por la disciplina.</w:t>
@@ -9325,6 +9439,7 @@
             <w:pPr>
               <w:pStyle w:val="Normal"/>
               <w:widowControl/>
+              <w:suppressAutoHyphens w:val="true"/>
               <w:spacing w:before="0" w:after="0"/>
               <w:jc w:val="left"/>
               <w:rPr>
@@ -9359,6 +9474,7 @@
             <w:pPr>
               <w:pStyle w:val="Normal"/>
               <w:widowControl/>
+              <w:suppressAutoHyphens w:val="true"/>
               <w:spacing w:before="0" w:after="0"/>
               <w:jc w:val="left"/>
               <w:rPr>
@@ -9380,19 +9496,20 @@
         </w:tc>
         <w:tc>
           <w:tcPr>
-            <w:tcW w:w="2052" w:type="dxa"/>
-            <w:tcBorders>
-              <w:top w:val="single" w:sz="4" w:space="0" w:color="7F7F7F"/>
-              <w:left w:val="single" w:sz="4" w:space="0" w:color="7F7F7F"/>
-              <w:bottom w:val="single" w:sz="4" w:space="0" w:color="7F7F7F"/>
-              <w:right w:val="single" w:sz="4" w:space="0" w:color="7F7F7F"/>
-            </w:tcBorders>
-            <w:vAlign w:val="center"/>
-          </w:tcPr>
-          <w:p>
-            <w:pPr>
-              <w:pStyle w:val="Normal"/>
-              <w:widowControl/>
+            <w:tcW w:w="2053" w:type="dxa"/>
+            <w:tcBorders>
+              <w:top w:val="single" w:sz="4" w:space="0" w:color="7F7F7F"/>
+              <w:left w:val="single" w:sz="4" w:space="0" w:color="7F7F7F"/>
+              <w:bottom w:val="single" w:sz="4" w:space="0" w:color="7F7F7F"/>
+              <w:right w:val="single" w:sz="4" w:space="0" w:color="7F7F7F"/>
+            </w:tcBorders>
+            <w:vAlign w:val="center"/>
+          </w:tcPr>
+          <w:p>
+            <w:pPr>
+              <w:pStyle w:val="Normal"/>
+              <w:widowControl/>
+              <w:suppressAutoHyphens w:val="true"/>
               <w:spacing w:before="0" w:after="0"/>
               <w:jc w:val="left"/>
               <w:rPr>
@@ -9414,19 +9531,20 @@
         </w:tc>
         <w:tc>
           <w:tcPr>
-            <w:tcW w:w="1448" w:type="dxa"/>
-            <w:tcBorders>
-              <w:top w:val="single" w:sz="4" w:space="0" w:color="7F7F7F"/>
-              <w:left w:val="single" w:sz="4" w:space="0" w:color="7F7F7F"/>
-              <w:bottom w:val="single" w:sz="4" w:space="0" w:color="7F7F7F"/>
-              <w:right w:val="single" w:sz="4" w:space="0" w:color="7F7F7F"/>
-            </w:tcBorders>
-            <w:vAlign w:val="center"/>
-          </w:tcPr>
-          <w:p>
-            <w:pPr>
-              <w:pStyle w:val="Normal"/>
-              <w:widowControl/>
+            <w:tcW w:w="1447" w:type="dxa"/>
+            <w:tcBorders>
+              <w:top w:val="single" w:sz="4" w:space="0" w:color="7F7F7F"/>
+              <w:left w:val="single" w:sz="4" w:space="0" w:color="7F7F7F"/>
+              <w:bottom w:val="single" w:sz="4" w:space="0" w:color="7F7F7F"/>
+              <w:right w:val="single" w:sz="4" w:space="0" w:color="7F7F7F"/>
+            </w:tcBorders>
+            <w:vAlign w:val="center"/>
+          </w:tcPr>
+          <w:p>
+            <w:pPr>
+              <w:pStyle w:val="Normal"/>
+              <w:widowControl/>
+              <w:suppressAutoHyphens w:val="true"/>
               <w:spacing w:before="0" w:after="0"/>
               <w:jc w:val="center"/>
               <w:rPr>
@@ -9470,6 +9588,7 @@
             <w:pPr>
               <w:pStyle w:val="Normal"/>
               <w:widowControl/>
+              <w:suppressAutoHyphens w:val="true"/>
               <w:spacing w:before="0" w:after="0"/>
               <w:jc w:val="left"/>
               <w:rPr>
@@ -9504,19 +9623,21 @@
             <w:pPr>
               <w:pStyle w:val="Normal"/>
               <w:widowControl/>
+              <w:suppressAutoHyphens w:val="true"/>
               <w:spacing w:before="0" w:after="0"/>
               <w:jc w:val="left"/>
               <w:rPr>
-                <w:rFonts w:ascii="Calibri" w:hAnsi="Calibri" w:eastAsia="" w:cs="" w:asciiTheme="minorHAnsi" w:cstheme="minorBidi" w:eastAsiaTheme="minorEastAsia" w:hAnsiTheme="minorHAnsi"/>
-                <w:color w:themeColor="text1" w:val="000000"/>
-                <w:lang w:eastAsia="es-CL"/>
-              </w:rPr>
-            </w:pPr>
-            <w:r>
-              <w:rPr>
-                <w:rFonts w:eastAsia="" w:cs="" w:ascii="Calibri" w:hAnsi="Calibri" w:asciiTheme="minorHAnsi" w:cstheme="minorBidi" w:eastAsiaTheme="minorEastAsia" w:hAnsiTheme="minorHAnsi"/>
-                <w:color w:themeColor="text1" w:val="000000"/>
-                <w:kern w:val="0"/>
+                <w:rFonts w:asciiTheme="minorHAnsi" w:cstheme="minorBidi" w:eastAsiaTheme="minorEastAsia" w:hAnsiTheme="minorHAnsi"/>
+                <w:highlight w:val="none"/>
+                <w:shd w:fill="81D41A" w:val="clear"/>
+              </w:rPr>
+            </w:pPr>
+            <w:r>
+              <w:rPr>
+                <w:rFonts w:eastAsia="" w:cs="" w:cstheme="minorBidi" w:eastAsiaTheme="minorEastAsia" w:ascii="Calibri" w:hAnsi="Calibri"/>
+                <w:color w:themeColor="text1" w:val="000000"/>
+                <w:kern w:val="0"/>
+                <w:shd w:fill="81D41A" w:val="clear"/>
                 <w:lang w:eastAsia="es-CL" w:bidi="ar-SA"/>
               </w:rPr>
               <w:t>El informe cumple con el 100% de los indicadores de calidad disciplinarios requeridos en el diseño del Proyecto APT.</w:t>
@@ -9538,6 +9659,7 @@
             <w:pPr>
               <w:pStyle w:val="Normal"/>
               <w:widowControl/>
+              <w:suppressAutoHyphens w:val="true"/>
               <w:spacing w:before="0" w:after="0"/>
               <w:jc w:val="left"/>
               <w:rPr>
@@ -9572,6 +9694,7 @@
             <w:pPr>
               <w:pStyle w:val="Normal"/>
               <w:widowControl/>
+              <w:suppressAutoHyphens w:val="true"/>
               <w:spacing w:before="0" w:after="0"/>
               <w:jc w:val="left"/>
               <w:rPr>
@@ -9593,19 +9716,20 @@
         </w:tc>
         <w:tc>
           <w:tcPr>
-            <w:tcW w:w="2052" w:type="dxa"/>
-            <w:tcBorders>
-              <w:top w:val="single" w:sz="4" w:space="0" w:color="7F7F7F"/>
-              <w:left w:val="single" w:sz="4" w:space="0" w:color="7F7F7F"/>
-              <w:bottom w:val="single" w:sz="4" w:space="0" w:color="7F7F7F"/>
-              <w:right w:val="single" w:sz="4" w:space="0" w:color="7F7F7F"/>
-            </w:tcBorders>
-            <w:vAlign w:val="center"/>
-          </w:tcPr>
-          <w:p>
-            <w:pPr>
-              <w:pStyle w:val="Normal"/>
-              <w:widowControl/>
+            <w:tcW w:w="2053" w:type="dxa"/>
+            <w:tcBorders>
+              <w:top w:val="single" w:sz="4" w:space="0" w:color="7F7F7F"/>
+              <w:left w:val="single" w:sz="4" w:space="0" w:color="7F7F7F"/>
+              <w:bottom w:val="single" w:sz="4" w:space="0" w:color="7F7F7F"/>
+              <w:right w:val="single" w:sz="4" w:space="0" w:color="7F7F7F"/>
+            </w:tcBorders>
+            <w:vAlign w:val="center"/>
+          </w:tcPr>
+          <w:p>
+            <w:pPr>
+              <w:pStyle w:val="Normal"/>
+              <w:widowControl/>
+              <w:suppressAutoHyphens w:val="true"/>
               <w:spacing w:before="0" w:after="0"/>
               <w:jc w:val="left"/>
               <w:rPr>
@@ -9627,19 +9751,20 @@
         </w:tc>
         <w:tc>
           <w:tcPr>
-            <w:tcW w:w="1448" w:type="dxa"/>
-            <w:tcBorders>
-              <w:top w:val="single" w:sz="4" w:space="0" w:color="7F7F7F"/>
-              <w:left w:val="single" w:sz="4" w:space="0" w:color="7F7F7F"/>
-              <w:bottom w:val="single" w:sz="4" w:space="0" w:color="7F7F7F"/>
-              <w:right w:val="single" w:sz="4" w:space="0" w:color="7F7F7F"/>
-            </w:tcBorders>
-            <w:vAlign w:val="center"/>
-          </w:tcPr>
-          <w:p>
-            <w:pPr>
-              <w:pStyle w:val="Normal"/>
-              <w:widowControl/>
+            <w:tcW w:w="1447" w:type="dxa"/>
+            <w:tcBorders>
+              <w:top w:val="single" w:sz="4" w:space="0" w:color="7F7F7F"/>
+              <w:left w:val="single" w:sz="4" w:space="0" w:color="7F7F7F"/>
+              <w:bottom w:val="single" w:sz="4" w:space="0" w:color="7F7F7F"/>
+              <w:right w:val="single" w:sz="4" w:space="0" w:color="7F7F7F"/>
+            </w:tcBorders>
+            <w:vAlign w:val="center"/>
+          </w:tcPr>
+          <w:p>
+            <w:pPr>
+              <w:pStyle w:val="Normal"/>
+              <w:widowControl/>
+              <w:suppressAutoHyphens w:val="true"/>
               <w:spacing w:before="0" w:after="0"/>
               <w:jc w:val="center"/>
               <w:rPr>
@@ -9683,6 +9808,7 @@
             <w:pPr>
               <w:pStyle w:val="Normal"/>
               <w:widowControl/>
+              <w:suppressAutoHyphens w:val="true"/>
               <w:spacing w:before="0" w:after="0"/>
               <w:jc w:val="left"/>
               <w:rPr>
@@ -9705,6 +9831,7 @@
             <w:pPr>
               <w:pStyle w:val="Normal"/>
               <w:widowControl/>
+              <w:suppressAutoHyphens w:val="true"/>
               <w:spacing w:before="0" w:after="0"/>
               <w:jc w:val="left"/>
               <w:rPr>
@@ -9716,15 +9843,14 @@
               <w:rPr>
                 <w:rFonts w:eastAsia="Calibri" w:cs="Calibri" w:ascii="Calibri" w:hAnsi="Calibri"/>
                 <w:color w:themeColor="text1" w:val="000000"/>
-                <w:kern w:val="0"/>
-                <w:lang w:bidi="ar-SA"/>
-              </w:rPr>
-            </w:r>
-          </w:p>
-          <w:p>
-            <w:pPr>
-              <w:pStyle w:val="Normal"/>
-              <w:widowControl/>
+              </w:rPr>
+            </w:r>
+          </w:p>
+          <w:p>
+            <w:pPr>
+              <w:pStyle w:val="Normal"/>
+              <w:widowControl/>
+              <w:suppressAutoHyphens w:val="true"/>
               <w:spacing w:before="0" w:after="0"/>
               <w:jc w:val="left"/>
               <w:rPr>
@@ -9736,8 +9862,6 @@
               <w:rPr>
                 <w:rFonts w:eastAsia="Calibri" w:cs="Calibri" w:ascii="Calibri" w:hAnsi="Calibri"/>
                 <w:color w:themeColor="text1" w:val="000000"/>
-                <w:kern w:val="0"/>
-                <w:lang w:bidi="ar-SA"/>
               </w:rPr>
             </w:r>
           </w:p>
@@ -9757,6 +9881,7 @@
             <w:pPr>
               <w:pStyle w:val="Normal"/>
               <w:widowControl/>
+              <w:suppressAutoHyphens w:val="true"/>
               <w:spacing w:before="0" w:after="0"/>
               <w:jc w:val="left"/>
               <w:rPr>
@@ -9789,17 +9914,20 @@
             <w:pPr>
               <w:pStyle w:val="Normal"/>
               <w:widowControl/>
+              <w:suppressAutoHyphens w:val="true"/>
               <w:spacing w:before="0" w:after="0"/>
               <w:jc w:val="left"/>
               <w:rPr>
-                <w:rFonts w:ascii="Calibri" w:hAnsi="Calibri" w:eastAsia="Calibri" w:cs="Calibri" w:asciiTheme="minorHAnsi" w:cstheme="minorHAnsi" w:hAnsiTheme="minorHAnsi"/>
-                <w:color w:themeColor="text1" w:val="000000"/>
-              </w:rPr>
-            </w:pPr>
-            <w:r>
-              <w:rPr>
-                <w:rFonts w:cs="Calibri" w:ascii="Calibri" w:hAnsi="Calibri" w:asciiTheme="minorHAnsi" w:cstheme="minorHAnsi" w:hAnsiTheme="minorHAnsi"/>
-                <w:kern w:val="0"/>
+                <w:rFonts w:asciiTheme="minorHAnsi" w:cstheme="minorHAnsi" w:hAnsiTheme="minorHAnsi"/>
+                <w:highlight w:val="none"/>
+                <w:shd w:fill="81D41A" w:val="clear"/>
+              </w:rPr>
+            </w:pPr>
+            <w:r>
+              <w:rPr>
+                <w:rFonts w:cs="Calibri" w:cstheme="minorHAnsi" w:ascii="Calibri" w:hAnsi="Calibri"/>
+                <w:kern w:val="0"/>
+                <w:shd w:fill="81D41A" w:val="clear"/>
                 <w:lang w:bidi="ar-SA"/>
               </w:rPr>
               <w:t>Redacta los textos en inglés siguiendo una secuencia lógica en la que gran parte de las oraciones se conectan de manera fluida y comprensible,  utilizando en forma correcta la mayoría de las estructuras gramaticales y el vocabulario pertinentes al tema.</w:t>
@@ -9821,6 +9949,7 @@
             <w:pPr>
               <w:pStyle w:val="Normal"/>
               <w:widowControl/>
+              <w:suppressAutoHyphens w:val="true"/>
               <w:spacing w:before="0" w:after="0"/>
               <w:jc w:val="left"/>
               <w:rPr>
@@ -9840,19 +9969,20 @@
         </w:tc>
         <w:tc>
           <w:tcPr>
-            <w:tcW w:w="2052" w:type="dxa"/>
-            <w:tcBorders>
-              <w:top w:val="single" w:sz="4" w:space="0" w:color="7F7F7F"/>
-              <w:left w:val="single" w:sz="4" w:space="0" w:color="7F7F7F"/>
-              <w:bottom w:val="single" w:sz="4" w:space="0" w:color="7F7F7F"/>
-              <w:right w:val="single" w:sz="4" w:space="0" w:color="7F7F7F"/>
-            </w:tcBorders>
-            <w:vAlign w:val="center"/>
-          </w:tcPr>
-          <w:p>
-            <w:pPr>
-              <w:pStyle w:val="Normal"/>
-              <w:widowControl/>
+            <w:tcW w:w="2053" w:type="dxa"/>
+            <w:tcBorders>
+              <w:top w:val="single" w:sz="4" w:space="0" w:color="7F7F7F"/>
+              <w:left w:val="single" w:sz="4" w:space="0" w:color="7F7F7F"/>
+              <w:bottom w:val="single" w:sz="4" w:space="0" w:color="7F7F7F"/>
+              <w:right w:val="single" w:sz="4" w:space="0" w:color="7F7F7F"/>
+            </w:tcBorders>
+            <w:vAlign w:val="center"/>
+          </w:tcPr>
+          <w:p>
+            <w:pPr>
+              <w:pStyle w:val="Normal"/>
+              <w:widowControl/>
+              <w:suppressAutoHyphens w:val="true"/>
               <w:spacing w:before="0" w:after="0"/>
               <w:jc w:val="left"/>
               <w:rPr>
@@ -9872,6 +10002,7 @@
             <w:pPr>
               <w:pStyle w:val="Normal"/>
               <w:widowControl/>
+              <w:suppressAutoHyphens w:val="true"/>
               <w:spacing w:before="0" w:after="0"/>
               <w:jc w:val="left"/>
               <w:rPr>
@@ -9884,13 +10015,14 @@
                 <w:kern w:val="0"/>
                 <w:lang w:bidi="ar-SA"/>
               </w:rPr>
-              <w:t xml:space="preserve">o escribe frases sueltas que no se relacionan entre ellas impidiendo la comprensión de las ideas, </w:t>
-            </w:r>
-          </w:p>
-          <w:p>
-            <w:pPr>
-              <w:pStyle w:val="Normal"/>
-              <w:widowControl/>
+              <w:t>o escribe frases sueltas que no se relacionan entre ellas impidiendo la comprensión de las ideas,</w:t>
+            </w:r>
+          </w:p>
+          <w:p>
+            <w:pPr>
+              <w:pStyle w:val="Normal"/>
+              <w:widowControl/>
+              <w:suppressAutoHyphens w:val="true"/>
               <w:spacing w:before="0" w:after="0"/>
               <w:jc w:val="left"/>
               <w:rPr>
@@ -9910,19 +10042,20 @@
         </w:tc>
         <w:tc>
           <w:tcPr>
-            <w:tcW w:w="1448" w:type="dxa"/>
-            <w:tcBorders>
-              <w:top w:val="single" w:sz="4" w:space="0" w:color="7F7F7F"/>
-              <w:left w:val="single" w:sz="4" w:space="0" w:color="7F7F7F"/>
-              <w:bottom w:val="single" w:sz="4" w:space="0" w:color="7F7F7F"/>
-              <w:right w:val="single" w:sz="4" w:space="0" w:color="7F7F7F"/>
-            </w:tcBorders>
-            <w:vAlign w:val="center"/>
-          </w:tcPr>
-          <w:p>
-            <w:pPr>
-              <w:pStyle w:val="Normal"/>
-              <w:widowControl/>
+            <w:tcW w:w="1447" w:type="dxa"/>
+            <w:tcBorders>
+              <w:top w:val="single" w:sz="4" w:space="0" w:color="7F7F7F"/>
+              <w:left w:val="single" w:sz="4" w:space="0" w:color="7F7F7F"/>
+              <w:bottom w:val="single" w:sz="4" w:space="0" w:color="7F7F7F"/>
+              <w:right w:val="single" w:sz="4" w:space="0" w:color="7F7F7F"/>
+            </w:tcBorders>
+            <w:vAlign w:val="center"/>
+          </w:tcPr>
+          <w:p>
+            <w:pPr>
+              <w:pStyle w:val="Normal"/>
+              <w:widowControl/>
+              <w:suppressAutoHyphens w:val="true"/>
               <w:spacing w:before="0" w:after="0"/>
               <w:jc w:val="center"/>
               <w:rPr>
@@ -9952,7 +10085,7 @@
         </w:trPr>
         <w:tc>
           <w:tcPr>
-            <w:tcW w:w="11545" w:type="dxa"/>
+            <w:tcW w:w="11546" w:type="dxa"/>
             <w:gridSpan w:val="5"/>
             <w:tcBorders>
               <w:top w:val="single" w:sz="4" w:space="0" w:color="7F7F7F"/>
@@ -9966,6 +10099,7 @@
             <w:pPr>
               <w:pStyle w:val="Normal"/>
               <w:widowControl/>
+              <w:suppressAutoHyphens w:val="true"/>
               <w:spacing w:before="0" w:after="0"/>
               <w:jc w:val="right"/>
               <w:rPr>
@@ -9991,19 +10125,20 @@
         </w:tc>
         <w:tc>
           <w:tcPr>
-            <w:tcW w:w="1448" w:type="dxa"/>
-            <w:tcBorders>
-              <w:top w:val="single" w:sz="4" w:space="0" w:color="7F7F7F"/>
-              <w:left w:val="single" w:sz="4" w:space="0" w:color="7F7F7F"/>
-              <w:bottom w:val="single" w:sz="4" w:space="0" w:color="7F7F7F"/>
-              <w:right w:val="single" w:sz="4" w:space="0" w:color="7F7F7F"/>
-            </w:tcBorders>
-            <w:vAlign w:val="center"/>
-          </w:tcPr>
-          <w:p>
-            <w:pPr>
-              <w:pStyle w:val="Normal"/>
-              <w:widowControl/>
+            <w:tcW w:w="1447" w:type="dxa"/>
+            <w:tcBorders>
+              <w:top w:val="single" w:sz="4" w:space="0" w:color="7F7F7F"/>
+              <w:left w:val="single" w:sz="4" w:space="0" w:color="7F7F7F"/>
+              <w:bottom w:val="single" w:sz="4" w:space="0" w:color="7F7F7F"/>
+              <w:right w:val="single" w:sz="4" w:space="0" w:color="7F7F7F"/>
+            </w:tcBorders>
+            <w:vAlign w:val="center"/>
+          </w:tcPr>
+          <w:p>
+            <w:pPr>
+              <w:pStyle w:val="Normal"/>
+              <w:widowControl/>
+              <w:suppressAutoHyphens w:val="true"/>
               <w:spacing w:before="0" w:after="0"/>
               <w:jc w:val="center"/>
               <w:rPr>
@@ -10102,7 +10237,7 @@
       <mc:AlternateContent>
         <mc:Choice Requires="wps">
           <w:drawing>
-            <wp:anchor behindDoc="1" distT="0" distB="3810" distL="0" distR="0" simplePos="0" locked="0" layoutInCell="0" allowOverlap="1" relativeHeight="39" wp14:anchorId="3CF0A8BB">
+            <wp:anchor behindDoc="1" distT="0" distB="11430" distL="0" distR="0" simplePos="0" locked="0" layoutInCell="0" allowOverlap="1" relativeHeight="27" wp14:anchorId="3CF0A8BB">
               <wp:simplePos x="0" y="0"/>
               <wp:positionH relativeFrom="rightMargin">
                 <wp:align>left</wp:align>
@@ -10194,7 +10329,7 @@
                               <w:rFonts w:cs="Arial" w:ascii="Arial" w:hAnsi="Arial"/>
                               <w:color w:themeColor="background1" w:val="FFFFFF"/>
                             </w:rPr>
-                            <w:t>1</w:t>
+                            <w:t>8</w:t>
                           </w:r>
                           <w:r>
                             <w:rPr>
@@ -10270,7 +10405,7 @@
                         <w:rFonts w:cs="Arial" w:ascii="Arial" w:hAnsi="Arial"/>
                         <w:color w:themeColor="background1" w:val="FFFFFF"/>
                       </w:rPr>
-                      <w:t>1</w:t>
+                      <w:t>8</w:t>
                     </w:r>
                     <w:r>
                       <w:rPr>
@@ -10292,7 +10427,7 @@
       <mc:AlternateContent>
         <mc:Choice Requires="wpg">
           <w:drawing>
-            <wp:anchor behindDoc="1" distT="0" distB="3810" distL="0" distR="0" simplePos="0" locked="0" layoutInCell="0" allowOverlap="1" relativeHeight="64" wp14:anchorId="0F25DB77">
+            <wp:anchor behindDoc="1" distT="0" distB="11430" distL="0" distR="0" simplePos="0" locked="0" layoutInCell="0" allowOverlap="1" relativeHeight="53" wp14:anchorId="0F25DB77">
               <wp:simplePos x="0" y="0"/>
               <wp:positionH relativeFrom="margin">
                 <wp:align>right</wp:align>
@@ -10322,7 +10457,7 @@
                       <wps:spPr>
                         <a:xfrm>
                           <a:off x="19080" y="0"/>
-                          <a:ext cx="5924520" cy="17640"/>
+                          <a:ext cx="5924520" cy="16560"/>
                         </a:xfrm>
                         <a:prstGeom prst="rect">
                           <a:avLst/>
@@ -10390,15 +10525,13 @@
                             </w:pPr>
                             <w:sdt>
                               <w:sdtPr>
-                                <w:date w:fullDate="Subdirección de Evaluación de Resultados de Aprendizaje - Subdirección de Diseño InstruccionalT00:00:00Z">
+                                <w:dataBinding w:prefixMappings="xmlns:ns0='http://schemas.microsoft.com/office/2006/coverPageProps' " w:xpath="/ns0:CoverPageProperties[1]/ns0:PublishDate[1]" w:storeItemID="{55AF091B-3C7A-41E3-B477-F2FDAA23CFDA}"/>
+                                <w:alias w:val="Fecha"/>
+                                <w:id w:val="-1063724354"/>
+                                <w:date w:fullDate="Subdirección de Evaluación de Resultados de Aprendizaje - Subdirección de Diseño Instruccional">
                                   <w:dateFormat w:val="d 'de' MMMM 'de' yyyy"/>
                                   <w:lid w:val="es-ES"/>
-                                  <w:storeMappedDataAs w:val="dateTime"/>
-                                  <w:calendar w:val="gregorian"/>
                                 </w:date>
-                                <w:id w:val="-1063724354"/>
-                                <w:dataBinding w:prefixMappings="xmlns:ns0='http://schemas.microsoft.com/office/2006/coverPageProps' " w:xpath="/ns0:CoverPageProperties[1]/ns0:PublishDate[1]" w:storeItemID="{55AF091B-3C7A-41E3-B477-F2FDAA23CFDA}"/>
-                                <w:alias w:val="Fecha"/>
                               </w:sdtPr>
                               <w:sdtContent>
                                 <w:r>
@@ -10414,18 +10547,10 @@
                                     <w:sz w:val="16"/>
                                     <w:szCs w:val="16"/>
                                   </w:rPr>
-                                  <w:t>Subdirección de Evaluación de Resultados de Aprendizaje - Subdirección de Diseño Instruccional</w:t>
+                                  <w:t>30 de diciembre de 1899</w:t>
                                 </w:r>
-                                <w:r/>
                               </w:sdtContent>
                             </w:sdt>
-                            <w:r>
-                              <w:rPr>
-                                <w:rFonts w:cs="Arial" w:ascii="Arial" w:hAnsi="Arial"/>
-                                <w:sz w:val="16"/>
-                                <w:szCs w:val="16"/>
-                              </w:rPr>
-                            </w:r>
                           </w:p>
                           <w:p>
                             <w:pPr>
@@ -10443,7 +10568,7 @@
                           </w:p>
                         </w:txbxContent>
                       </wps:txbx>
-                      <wps:bodyPr bIns="0" anchor="b">
+                      <wps:bodyPr lIns="0" rIns="0" tIns="0" bIns="0" anchor="b">
                         <a:noAutofit/>
                       </wps:bodyPr>
                     </wps:wsp>
@@ -10459,7 +10584,7 @@
         <mc:Fallback>
           <w:pict>
             <v:group id="shape_0" alt="Grupo 37" style="position:absolute;margin-left:182.15pt;margin-top:555.25pt;width:468pt;height:25.2pt" coordorigin="3643,11105" coordsize="9360,504">
-              <v:rect id="shape_0" ID="Rectángulo 38" path="m0,0l-2147483645,0l-2147483645,-2147483646l0,-2147483646xe" fillcolor="black" stroked="f" o:allowincell="f" style="position:absolute;left:3673;top:11105;width:9329;height:27;mso-wrap-style:none;v-text-anchor:middle;mso-position-horizontal:right;mso-position-horizontal-relative:margin;mso-position-vertical-relative:page">
+              <v:rect id="shape_0" ID="Rectángulo 38" path="m0,0l-2147483645,0l-2147483645,-2147483646l0,-2147483646xe" fillcolor="black" stroked="f" o:allowincell="f" style="position:absolute;left:3673;top:11105;width:9329;height:25;mso-wrap-style:none;v-text-anchor:middle;mso-position-horizontal:right;mso-position-horizontal-relative:margin;mso-position-vertical-relative:page">
                 <v:fill o:detectmouseclick="t" type="solid" color2="white"/>
                 <v:stroke color="#3465a4" weight="12600" joinstyle="miter" endcap="flat"/>
                 <w10:wrap type="square"/>
@@ -10479,15 +10604,13 @@
                       </w:pPr>
                       <w:sdt>
                         <w:sdtPr>
-                          <w:date w:fullDate="Subdirección de Evaluación de Resultados de Aprendizaje - Subdirección de Diseño InstruccionalT00:00:00Z">
+                          <w:dataBinding w:prefixMappings="xmlns:ns0='http://schemas.microsoft.com/office/2006/coverPageProps' " w:xpath="/ns0:CoverPageProperties[1]/ns0:PublishDate[1]" w:storeItemID="{55AF091B-3C7A-41E3-B477-F2FDAA23CFDA}"/>
+                          <w:alias w:val="Fecha"/>
+                          <w:id w:val="-1063724354"/>
+                          <w:date w:fullDate="Subdirección de Evaluación de Resultados de Aprendizaje - Subdirección de Diseño Instruccional">
                             <w:dateFormat w:val="d 'de' MMMM 'de' yyyy"/>
                             <w:lid w:val="es-ES"/>
-                            <w:storeMappedDataAs w:val="dateTime"/>
-                            <w:calendar w:val="gregorian"/>
                           </w:date>
-                          <w:id w:val="-1063724354"/>
-                          <w:dataBinding w:prefixMappings="xmlns:ns0='http://schemas.microsoft.com/office/2006/coverPageProps' " w:xpath="/ns0:CoverPageProperties[1]/ns0:PublishDate[1]" w:storeItemID="{55AF091B-3C7A-41E3-B477-F2FDAA23CFDA}"/>
-                          <w:alias w:val="Fecha"/>
                         </w:sdtPr>
                         <w:sdtContent>
                           <w:r>
@@ -10503,18 +10626,10 @@
                               <w:sz w:val="16"/>
                               <w:szCs w:val="16"/>
                             </w:rPr>
-                            <w:t>Subdirección de Evaluación de Resultados de Aprendizaje - Subdirección de Diseño Instruccional</w:t>
+                            <w:t>30 de diciembre de 1899</w:t>
                           </w:r>
-                          <w:r/>
                         </w:sdtContent>
                       </w:sdt>
-                      <w:r>
-                        <w:rPr>
-                          <w:rFonts w:cs="Arial" w:ascii="Arial" w:hAnsi="Arial"/>
-                          <w:sz w:val="16"/>
-                          <w:szCs w:val="16"/>
-                        </w:rPr>
-                      </w:r>
                     </w:p>
                     <w:p>
                       <w:pPr>
@@ -10562,7 +10677,7 @@
       <mc:AlternateContent>
         <mc:Choice Requires="wps">
           <w:drawing>
-            <wp:anchor behindDoc="1" distT="0" distB="3810" distL="0" distR="0" simplePos="0" locked="0" layoutInCell="0" allowOverlap="1" relativeHeight="39" wp14:anchorId="3CF0A8BB">
+            <wp:anchor behindDoc="1" distT="0" distB="11430" distL="0" distR="0" simplePos="0" locked="0" layoutInCell="0" allowOverlap="1" relativeHeight="27" wp14:anchorId="3CF0A8BB">
               <wp:simplePos x="0" y="0"/>
               <wp:positionH relativeFrom="rightMargin">
                 <wp:align>left</wp:align>
@@ -10654,7 +10769,7 @@
                               <w:rFonts w:cs="Arial" w:ascii="Arial" w:hAnsi="Arial"/>
                               <w:color w:themeColor="background1" w:val="FFFFFF"/>
                             </w:rPr>
-                            <w:t>1</w:t>
+                            <w:t>8</w:t>
                           </w:r>
                           <w:r>
                             <w:rPr>
@@ -10730,7 +10845,7 @@
                         <w:rFonts w:cs="Arial" w:ascii="Arial" w:hAnsi="Arial"/>
                         <w:color w:themeColor="background1" w:val="FFFFFF"/>
                       </w:rPr>
-                      <w:t>1</w:t>
+                      <w:t>8</w:t>
                     </w:r>
                     <w:r>
                       <w:rPr>
@@ -10752,7 +10867,7 @@
       <mc:AlternateContent>
         <mc:Choice Requires="wpg">
           <w:drawing>
-            <wp:anchor behindDoc="1" distT="0" distB="3810" distL="0" distR="0" simplePos="0" locked="0" layoutInCell="0" allowOverlap="1" relativeHeight="64" wp14:anchorId="0F25DB77">
+            <wp:anchor behindDoc="1" distT="0" distB="11430" distL="0" distR="0" simplePos="0" locked="0" layoutInCell="0" allowOverlap="1" relativeHeight="53" wp14:anchorId="0F25DB77">
               <wp:simplePos x="0" y="0"/>
               <wp:positionH relativeFrom="margin">
                 <wp:align>right</wp:align>
@@ -10782,7 +10897,7 @@
                       <wps:spPr>
                         <a:xfrm>
                           <a:off x="19080" y="0"/>
-                          <a:ext cx="5924520" cy="17640"/>
+                          <a:ext cx="5924520" cy="16560"/>
                         </a:xfrm>
                         <a:prstGeom prst="rect">
                           <a:avLst/>
@@ -10850,15 +10965,13 @@
                             </w:pPr>
                             <w:sdt>
                               <w:sdtPr>
-                                <w:date w:fullDate="Subdirección de Evaluación de Resultados de Aprendizaje - Subdirección de Diseño InstruccionalT00:00:00Z">
+                                <w:dataBinding w:prefixMappings="xmlns:ns0='http://schemas.microsoft.com/office/2006/coverPageProps' " w:xpath="/ns0:CoverPageProperties[1]/ns0:PublishDate[1]" w:storeItemID="{55AF091B-3C7A-41E3-B477-F2FDAA23CFDA}"/>
+                                <w:alias w:val="Fecha"/>
+                                <w:id w:val="-1063724354"/>
+                                <w:date w:fullDate="Subdirección de Evaluación de Resultados de Aprendizaje - Subdirección de Diseño Instruccional">
                                   <w:dateFormat w:val="d 'de' MMMM 'de' yyyy"/>
                                   <w:lid w:val="es-ES"/>
-                                  <w:storeMappedDataAs w:val="dateTime"/>
-                                  <w:calendar w:val="gregorian"/>
                                 </w:date>
-                                <w:id w:val="-1063724354"/>
-                                <w:dataBinding w:prefixMappings="xmlns:ns0='http://schemas.microsoft.com/office/2006/coverPageProps' " w:xpath="/ns0:CoverPageProperties[1]/ns0:PublishDate[1]" w:storeItemID="{55AF091B-3C7A-41E3-B477-F2FDAA23CFDA}"/>
-                                <w:alias w:val="Fecha"/>
                               </w:sdtPr>
                               <w:sdtContent>
                                 <w:r>
@@ -10874,18 +10987,10 @@
                                     <w:sz w:val="16"/>
                                     <w:szCs w:val="16"/>
                                   </w:rPr>
-                                  <w:t>Subdirección de Evaluación de Resultados de Aprendizaje - Subdirección de Diseño Instruccional</w:t>
+                                  <w:t>30 de diciembre de 1899</w:t>
                                 </w:r>
-                                <w:r/>
                               </w:sdtContent>
                             </w:sdt>
-                            <w:r>
-                              <w:rPr>
-                                <w:rFonts w:cs="Arial" w:ascii="Arial" w:hAnsi="Arial"/>
-                                <w:sz w:val="16"/>
-                                <w:szCs w:val="16"/>
-                              </w:rPr>
-                            </w:r>
                           </w:p>
                           <w:p>
                             <w:pPr>
@@ -10903,7 +11008,7 @@
                           </w:p>
                         </w:txbxContent>
                       </wps:txbx>
-                      <wps:bodyPr bIns="0" anchor="b">
+                      <wps:bodyPr lIns="0" rIns="0" tIns="0" bIns="0" anchor="b">
                         <a:noAutofit/>
                       </wps:bodyPr>
                     </wps:wsp>
@@ -10919,7 +11024,7 @@
         <mc:Fallback>
           <w:pict>
             <v:group id="shape_0" alt="Grupo 37" style="position:absolute;margin-left:182.15pt;margin-top:555.25pt;width:468pt;height:25.2pt" coordorigin="3643,11105" coordsize="9360,504">
-              <v:rect id="shape_0" ID="Rectángulo 38" path="m0,0l-2147483645,0l-2147483645,-2147483646l0,-2147483646xe" fillcolor="black" stroked="f" o:allowincell="f" style="position:absolute;left:3673;top:11105;width:9329;height:27;mso-wrap-style:none;v-text-anchor:middle;mso-position-horizontal:right;mso-position-horizontal-relative:margin;mso-position-vertical-relative:page">
+              <v:rect id="shape_0" ID="Rectángulo 38" path="m0,0l-2147483645,0l-2147483645,-2147483646l0,-2147483646xe" fillcolor="black" stroked="f" o:allowincell="f" style="position:absolute;left:3673;top:11105;width:9329;height:25;mso-wrap-style:none;v-text-anchor:middle;mso-position-horizontal:right;mso-position-horizontal-relative:margin;mso-position-vertical-relative:page">
                 <v:fill o:detectmouseclick="t" type="solid" color2="white"/>
                 <v:stroke color="#3465a4" weight="12600" joinstyle="miter" endcap="flat"/>
                 <w10:wrap type="square"/>
@@ -10939,15 +11044,13 @@
                       </w:pPr>
                       <w:sdt>
                         <w:sdtPr>
-                          <w:date w:fullDate="Subdirección de Evaluación de Resultados de Aprendizaje - Subdirección de Diseño InstruccionalT00:00:00Z">
+                          <w:dataBinding w:prefixMappings="xmlns:ns0='http://schemas.microsoft.com/office/2006/coverPageProps' " w:xpath="/ns0:CoverPageProperties[1]/ns0:PublishDate[1]" w:storeItemID="{55AF091B-3C7A-41E3-B477-F2FDAA23CFDA}"/>
+                          <w:alias w:val="Fecha"/>
+                          <w:id w:val="-1063724354"/>
+                          <w:date w:fullDate="Subdirección de Evaluación de Resultados de Aprendizaje - Subdirección de Diseño Instruccional">
                             <w:dateFormat w:val="d 'de' MMMM 'de' yyyy"/>
                             <w:lid w:val="es-ES"/>
-                            <w:storeMappedDataAs w:val="dateTime"/>
-                            <w:calendar w:val="gregorian"/>
                           </w:date>
-                          <w:id w:val="-1063724354"/>
-                          <w:dataBinding w:prefixMappings="xmlns:ns0='http://schemas.microsoft.com/office/2006/coverPageProps' " w:xpath="/ns0:CoverPageProperties[1]/ns0:PublishDate[1]" w:storeItemID="{55AF091B-3C7A-41E3-B477-F2FDAA23CFDA}"/>
-                          <w:alias w:val="Fecha"/>
                         </w:sdtPr>
                         <w:sdtContent>
                           <w:r>
@@ -10963,18 +11066,10 @@
                               <w:sz w:val="16"/>
                               <w:szCs w:val="16"/>
                             </w:rPr>
-                            <w:t>Subdirección de Evaluación de Resultados de Aprendizaje - Subdirección de Diseño Instruccional</w:t>
+                            <w:t>30 de diciembre de 1899</w:t>
                           </w:r>
-                          <w:r/>
                         </w:sdtContent>
                       </w:sdt>
-                      <w:r>
-                        <w:rPr>
-                          <w:rFonts w:cs="Arial" w:ascii="Arial" w:hAnsi="Arial"/>
-                          <w:sz w:val="16"/>
-                          <w:szCs w:val="16"/>
-                        </w:rPr>
-                      </w:r>
                     </w:p>
                     <w:p>
                       <w:pPr>
@@ -11040,7 +11135,7 @@
         <w:sz w:val="10"/>
       </w:rPr>
       <w:drawing>
-        <wp:anchor behindDoc="0" distT="0" distB="0" distL="114300" distR="0" simplePos="0" locked="0" layoutInCell="0" allowOverlap="1" relativeHeight="14">
+        <wp:anchor behindDoc="0" distT="0" distB="0" distL="114300" distR="0" simplePos="0" locked="0" layoutInCell="0" allowOverlap="1" relativeHeight="68">
           <wp:simplePos x="0" y="0"/>
           <wp:positionH relativeFrom="margin">
             <wp:align>right</wp:align>
@@ -11052,18 +11147,18 @@
           <wp:effectExtent l="0" t="0" r="0" b="0"/>
           <wp:wrapTight wrapText="bothSides">
             <wp:wrapPolygon edited="0">
-              <wp:start x="7761" y="3211"/>
-              <wp:lineTo x="2214" y="5134"/>
-              <wp:lineTo x="1471" y="6423"/>
-              <wp:lineTo x="1471" y="16080"/>
-              <wp:lineTo x="7761" y="18658"/>
-              <wp:lineTo x="8688" y="18658"/>
-              <wp:lineTo x="19416" y="15446"/>
-              <wp:lineTo x="19416" y="14791"/>
-              <wp:lineTo x="20159" y="9001"/>
-              <wp:lineTo x="18679" y="5134"/>
-              <wp:lineTo x="8688" y="3211"/>
-              <wp:lineTo x="7761" y="3211"/>
+              <wp:start x="7749" y="3167"/>
+              <wp:lineTo x="2201" y="5090"/>
+              <wp:lineTo x="1458" y="6379"/>
+              <wp:lineTo x="1458" y="16036"/>
+              <wp:lineTo x="7749" y="18614"/>
+              <wp:lineTo x="8675" y="18614"/>
+              <wp:lineTo x="19403" y="15402"/>
+              <wp:lineTo x="19403" y="14747"/>
+              <wp:lineTo x="20145" y="8957"/>
+              <wp:lineTo x="18666" y="5090"/>
+              <wp:lineTo x="8675" y="3167"/>
+              <wp:lineTo x="7749" y="3167"/>
             </wp:wrapPolygon>
           </wp:wrapTight>
           <wp:docPr id="1" name="Imagen 4" descr=""/>
@@ -11127,7 +11222,7 @@
         <w:sz w:val="10"/>
       </w:rPr>
       <w:drawing>
-        <wp:anchor behindDoc="0" distT="0" distB="0" distL="114300" distR="0" simplePos="0" locked="0" layoutInCell="0" allowOverlap="1" relativeHeight="14">
+        <wp:anchor behindDoc="0" distT="0" distB="0" distL="114300" distR="0" simplePos="0" locked="0" layoutInCell="0" allowOverlap="1" relativeHeight="68">
           <wp:simplePos x="0" y="0"/>
           <wp:positionH relativeFrom="margin">
             <wp:align>right</wp:align>
@@ -11139,18 +11234,18 @@
           <wp:effectExtent l="0" t="0" r="0" b="0"/>
           <wp:wrapTight wrapText="bothSides">
             <wp:wrapPolygon edited="0">
-              <wp:start x="7761" y="3211"/>
-              <wp:lineTo x="2214" y="5134"/>
-              <wp:lineTo x="1471" y="6423"/>
-              <wp:lineTo x="1471" y="16080"/>
-              <wp:lineTo x="7761" y="18658"/>
-              <wp:lineTo x="8688" y="18658"/>
-              <wp:lineTo x="19416" y="15446"/>
-              <wp:lineTo x="19416" y="14791"/>
-              <wp:lineTo x="20159" y="9001"/>
-              <wp:lineTo x="18679" y="5134"/>
-              <wp:lineTo x="8688" y="3211"/>
-              <wp:lineTo x="7761" y="3211"/>
+              <wp:start x="7749" y="3167"/>
+              <wp:lineTo x="2201" y="5090"/>
+              <wp:lineTo x="1458" y="6379"/>
+              <wp:lineTo x="1458" y="16036"/>
+              <wp:lineTo x="7749" y="18614"/>
+              <wp:lineTo x="8675" y="18614"/>
+              <wp:lineTo x="19403" y="15402"/>
+              <wp:lineTo x="19403" y="14747"/>
+              <wp:lineTo x="20145" y="8957"/>
+              <wp:lineTo x="18666" y="5090"/>
+              <wp:lineTo x="8675" y="3167"/>
+              <wp:lineTo x="7749" y="3167"/>
             </wp:wrapPolygon>
           </wp:wrapTight>
           <wp:docPr id="2" name="Imagen 4" descr=""/>
@@ -12543,6 +12638,7 @@
     <w:rsid w:val="00fd58af"/>
     <w:pPr>
       <w:widowControl/>
+      <w:suppressAutoHyphens w:val="true"/>
       <w:bidi w:val="0"/>
       <w:spacing w:lineRule="auto" w:line="240" w:before="0" w:after="0"/>
       <w:jc w:val="left"/>
@@ -12648,7 +12744,6 @@
   </w:style>
   <w:style w:type="character" w:styleId="FootnoteCharacters">
     <w:name w:val="Footnote Characters"/>
-    <w:basedOn w:val="DefaultParagraphFont"/>
     <w:uiPriority w:val="99"/>
     <w:semiHidden/>
     <w:unhideWhenUsed/>
@@ -12927,6 +13022,7 @@
     <w:rsid w:val="00155960"/>
     <w:pPr>
       <w:widowControl/>
+      <w:suppressAutoHyphens w:val="true"/>
       <w:bidi w:val="0"/>
       <w:spacing w:lineRule="auto" w:line="240" w:before="0" w:after="0"/>
       <w:jc w:val="left"/>
@@ -12968,6 +13064,7 @@
     <w:rsid w:val="00444852"/>
     <w:pPr>
       <w:widowControl/>
+      <w:suppressAutoHyphens w:val="true"/>
       <w:bidi w:val="0"/>
       <w:spacing w:lineRule="auto" w:line="240" w:before="0" w:after="0"/>
       <w:jc w:val="left"/>
@@ -13357,217 +13454,4 @@
     </a:fmtScheme>
   </a:themeElements>
 </a:theme>
-</file>
-
-<file path=customXml/item1.xml><?xml version="1.0" encoding="utf-8"?>
-<p:properties xmlns:p="http://schemas.microsoft.com/office/2006/metadata/properties" xmlns:xsi="http://www.w3.org/2001/XMLSchema-instance" xmlns:pc="http://schemas.microsoft.com/office/infopath/2007/PartnerControls">
-  <documentManagement/>
-</p:properties>
-</file>
-
-<file path=customXml/item2.xml><?xml version="1.0" encoding="utf-8"?>
-<b:Sources xmlns:b="http://schemas.openxmlformats.org/officeDocument/2006/bibliography" xmlns="http://schemas.openxmlformats.org/officeDocument/2006/bibliography" SelectedStyle="\APASixthEditionOfficeOnline.xsl" StyleName="APA" Version="6"/>
-</file>
-
-<file path=customXml/item3.xml><?xml version="1.0" encoding="utf-8"?>
-<CoverPageProperties xmlns="http://schemas.microsoft.com/office/2006/coverPageProps">
-  <PublishDate>Subdirección de Evaluación de Resultados de Aprendizaje - Subdirección de Diseño Instruccional</PublishDate>
-  <Abstract/>
-  <CompanyAddress/>
-  <CompanyPhone/>
-  <CompanyFax/>
-  <CompanyEmail/>
-</CoverPageProperties>
-</file>
-
-<file path=customXml/item4.xml><?xml version="1.0" encoding="utf-8"?>
-<?mso-contentType ?>
-<FormTemplates xmlns="http://schemas.microsoft.com/sharepoint/v3/contenttype/forms">
-  <Display>DocumentLibraryForm</Display>
-  <Edit>DocumentLibraryForm</Edit>
-  <New>DocumentLibraryForm</New>
-</FormTemplates>
-</file>
-
-<file path=customXml/item5.xml><?xml version="1.0" encoding="utf-8"?>
-<ct:contentTypeSchema xmlns:ct="http://schemas.microsoft.com/office/2006/metadata/contentType" xmlns:ma="http://schemas.microsoft.com/office/2006/metadata/properties/metaAttributes" ct:_="" ma:_="" ma:contentTypeName="Documento" ma:contentTypeID="0x010100E96778489EE7714D8BD12CC105EB918B" ma:contentTypeVersion="2" ma:contentTypeDescription="Crear nuevo documento." ma:contentTypeScope="" ma:versionID="416c5c7ae9b5d54d83875cd3c65194e3">
-  <xsd:schema xmlns:xsd="http://www.w3.org/2001/XMLSchema" xmlns:xs="http://www.w3.org/2001/XMLSchema" xmlns:p="http://schemas.microsoft.com/office/2006/metadata/properties" xmlns:ns2="126e8a1c-9ea9-435a-ac89-d06c80d62e30" targetNamespace="http://schemas.microsoft.com/office/2006/metadata/properties" ma:root="true" ma:fieldsID="70a237c842677bd850644f8595079f5e" ns2:_="">
-    <xsd:import namespace="126e8a1c-9ea9-435a-ac89-d06c80d62e30"/>
-    <xsd:element name="properties">
-      <xsd:complexType>
-        <xsd:sequence>
-          <xsd:element name="documentManagement">
-            <xsd:complexType>
-              <xsd:all>
-                <xsd:element ref="ns2:MediaServiceMetadata" minOccurs="0"/>
-                <xsd:element ref="ns2:MediaServiceFastMetadata" minOccurs="0"/>
-              </xsd:all>
-            </xsd:complexType>
-          </xsd:element>
-        </xsd:sequence>
-      </xsd:complexType>
-    </xsd:element>
-  </xsd:schema>
-  <xsd:schema xmlns:xsd="http://www.w3.org/2001/XMLSchema" xmlns:xs="http://www.w3.org/2001/XMLSchema" xmlns:dms="http://schemas.microsoft.com/office/2006/documentManagement/types" xmlns:pc="http://schemas.microsoft.com/office/infopath/2007/PartnerControls" targetNamespace="126e8a1c-9ea9-435a-ac89-d06c80d62e30" elementFormDefault="qualified">
-    <xsd:import namespace="http://schemas.microsoft.com/office/2006/documentManagement/types"/>
-    <xsd:import namespace="http://schemas.microsoft.com/office/infopath/2007/PartnerControls"/>
-    <xsd:element name="MediaServiceMetadata" ma:index="8" nillable="true" ma:displayName="MediaServiceMetadata" ma:hidden="true" ma:internalName="MediaServiceMetadata" ma:readOnly="true">
-      <xsd:simpleType>
-        <xsd:restriction base="dms:Note"/>
-      </xsd:simpleType>
-    </xsd:element>
-    <xsd:element name="MediaServiceFastMetadata" ma:index="9" nillable="true" ma:displayName="MediaServiceFastMetadata" ma:hidden="true" ma:internalName="MediaServiceFastMetadata" ma:readOnly="true">
-      <xsd:simpleType>
-        <xsd:restriction base="dms:Note"/>
-      </xsd:simpleType>
-    </xsd:element>
-  </xsd:schema>
-  <xsd:schema xmlns="http://schemas.openxmlformats.org/package/2006/metadata/core-properties" xmlns:xsd="http://www.w3.org/2001/XMLSchema" xmlns:xsi="http://www.w3.org/2001/XMLSchema-instance" xmlns:dc="http://purl.org/dc/elements/1.1/" xmlns:dcterms="http://purl.org/dc/terms/" xmlns:odoc="http://schemas.microsoft.com/internal/obd" targetNamespace="http://schemas.openxmlformats.org/package/2006/metadata/core-properties" elementFormDefault="qualified" attributeFormDefault="unqualified" blockDefault="#all">
-    <xsd:import namespace="http://purl.org/dc/elements/1.1/" schemaLocation="http://dublincore.org/schemas/xmls/qdc/2003/04/02/dc.xsd"/>
-    <xsd:import namespace="http://purl.org/dc/terms/" schemaLocation="http://dublincore.org/schemas/xmls/qdc/2003/04/02/dcterms.xsd"/>
-    <xsd:element name="coreProperties" type="CT_coreProperties"/>
-    <xsd:complexType name="CT_coreProperties">
-      <xsd:all>
-        <xsd:element ref="dc:creator" minOccurs="0" maxOccurs="1"/>
-        <xsd:element ref="dcterms:created" minOccurs="0" maxOccurs="1"/>
-        <xsd:element ref="dc:identifier" minOccurs="0" maxOccurs="1"/>
-        <xsd:element name="contentType" minOccurs="0" maxOccurs="1" type="xsd:string" ma:index="0" ma:displayName="Tipo de contenido"/>
-        <xsd:element ref="dc:title" minOccurs="0" maxOccurs="1" ma:index="4" ma:displayName="Título"/>
-        <xsd:element ref="dc:subject" minOccurs="0" maxOccurs="1"/>
-        <xsd:element ref="dc:description" minOccurs="0" maxOccurs="1"/>
-        <xsd:element name="keywords" minOccurs="0" maxOccurs="1" type="xsd:string"/>
-        <xsd:element ref="dc:language" minOccurs="0" maxOccurs="1"/>
-        <xsd:element name="category" minOccurs="0" maxOccurs="1" type="xsd:string"/>
-        <xsd:element name="version" minOccurs="0" maxOccurs="1" type="xsd:string"/>
-        <xsd:element name="revision" minOccurs="0" maxOccurs="1" type="xsd:string">
-          <xsd:annotation>
-            <xsd:documentation>
-                        This value indicates the number of saves or revisions. The application is responsible for updating this value after each revision.
-                    </xsd:documentation>
-          </xsd:annotation>
-        </xsd:element>
-        <xsd:element name="lastModifiedBy" minOccurs="0" maxOccurs="1" type="xsd:string"/>
-        <xsd:element ref="dcterms:modified" minOccurs="0" maxOccurs="1"/>
-        <xsd:element name="contentStatus" minOccurs="0" maxOccurs="1" type="xsd:string"/>
-      </xsd:all>
-    </xsd:complexType>
-  </xsd:schema>
-  <xs:schema xmlns:pc="http://schemas.microsoft.com/office/infopath/2007/PartnerControls" xmlns:xs="http://www.w3.org/2001/XMLSchema" targetNamespace="http://schemas.microsoft.com/office/infopath/2007/PartnerControls" elementFormDefault="qualified" attributeFormDefault="unqualified">
-    <xs:element name="Person">
-      <xs:complexType>
-        <xs:sequence>
-          <xs:element ref="pc:DisplayName" minOccurs="0"/>
-          <xs:element ref="pc:AccountId" minOccurs="0"/>
-          <xs:element ref="pc:AccountType" minOccurs="0"/>
-        </xs:sequence>
-      </xs:complexType>
-    </xs:element>
-    <xs:element name="DisplayName" type="xs:string"/>
-    <xs:element name="AccountId" type="xs:string"/>
-    <xs:element name="AccountType" type="xs:string"/>
-    <xs:element name="BDCAssociatedEntity">
-      <xs:complexType>
-        <xs:sequence>
-          <xs:element ref="pc:BDCEntity" minOccurs="0" maxOccurs="unbounded"/>
-        </xs:sequence>
-        <xs:attribute ref="pc:EntityNamespace"/>
-        <xs:attribute ref="pc:EntityName"/>
-        <xs:attribute ref="pc:SystemInstanceName"/>
-        <xs:attribute ref="pc:AssociationName"/>
-      </xs:complexType>
-    </xs:element>
-    <xs:attribute name="EntityNamespace" type="xs:string"/>
-    <xs:attribute name="EntityName" type="xs:string"/>
-    <xs:attribute name="SystemInstanceName" type="xs:string"/>
-    <xs:attribute name="AssociationName" type="xs:string"/>
-    <xs:element name="BDCEntity">
-      <xs:complexType>
-        <xs:sequence>
-          <xs:element ref="pc:EntityDisplayName" minOccurs="0"/>
-          <xs:element ref="pc:EntityInstanceReference" minOccurs="0"/>
-          <xs:element ref="pc:EntityId1" minOccurs="0"/>
-          <xs:element ref="pc:EntityId2" minOccurs="0"/>
-          <xs:element ref="pc:EntityId3" minOccurs="0"/>
-          <xs:element ref="pc:EntityId4" minOccurs="0"/>
-          <xs:element ref="pc:EntityId5" minOccurs="0"/>
-        </xs:sequence>
-      </xs:complexType>
-    </xs:element>
-    <xs:element name="EntityDisplayName" type="xs:string"/>
-    <xs:element name="EntityInstanceReference" type="xs:string"/>
-    <xs:element name="EntityId1" type="xs:string"/>
-    <xs:element name="EntityId2" type="xs:string"/>
-    <xs:element name="EntityId3" type="xs:string"/>
-    <xs:element name="EntityId4" type="xs:string"/>
-    <xs:element name="EntityId5" type="xs:string"/>
-    <xs:element name="Terms">
-      <xs:complexType>
-        <xs:sequence>
-          <xs:element ref="pc:TermInfo" minOccurs="0" maxOccurs="unbounded"/>
-        </xs:sequence>
-      </xs:complexType>
-    </xs:element>
-    <xs:element name="TermInfo">
-      <xs:complexType>
-        <xs:sequence>
-          <xs:element ref="pc:TermName" minOccurs="0"/>
-          <xs:element ref="pc:TermId" minOccurs="0"/>
-        </xs:sequence>
-      </xs:complexType>
-    </xs:element>
-    <xs:element name="TermName" type="xs:string"/>
-    <xs:element name="TermId" type="xs:string"/>
-  </xs:schema>
-</ct:contentTypeSchema>
-</file>
-
-<file path=customXml/itemProps1.xml><?xml version="1.0" encoding="utf-8"?>
-<ds:datastoreItem xmlns:ds="http://schemas.openxmlformats.org/officeDocument/2006/customXml" ds:itemID="{5B7B5873-BEF7-4EF9-B783-7B50266FE496}">
-  <ds:schemaRefs>
-    <ds:schemaRef ds:uri="http://schemas.microsoft.com/office/2006/metadata/properties"/>
-    <ds:schemaRef ds:uri="http://schemas.microsoft.com/office/infopath/2007/PartnerControls"/>
-  </ds:schemaRefs>
-</ds:datastoreItem>
-</file>
-
-<file path=customXml/itemProps2.xml><?xml version="1.0" encoding="utf-8"?>
-<ds:datastoreItem xmlns:ds="http://schemas.openxmlformats.org/officeDocument/2006/customXml" ds:itemID="{028C5B15-B524-4B7C-9DF0-F573AFD0F54E}">
-  <ds:schemaRefs>
-    <ds:schemaRef ds:uri="http://schemas.openxmlformats.org/officeDocument/2006/bibliography"/>
-  </ds:schemaRefs>
-</ds:datastoreItem>
-</file>
-
-<file path=customXml/itemProps3.xml><?xml version="1.0" encoding="utf-8"?>
-<ds:datastoreItem xmlns:ds="http://schemas.openxmlformats.org/officeDocument/2006/customXml" ds:itemID="{55AF091B-3C7A-41E3-B477-F2FDAA23CFDA}">
-  <ds:schemaRefs>
-    <ds:schemaRef ds:uri="http://schemas.microsoft.com/office/2006/coverPageProps"/>
-  </ds:schemaRefs>
-</ds:datastoreItem>
-</file>
-
-<file path=customXml/itemProps4.xml><?xml version="1.0" encoding="utf-8"?>
-<ds:datastoreItem xmlns:ds="http://schemas.openxmlformats.org/officeDocument/2006/customXml" ds:itemID="{4EF1E242-F579-4982-B8CC-2FBF33737424}">
-  <ds:schemaRefs>
-    <ds:schemaRef ds:uri="http://schemas.microsoft.com/sharepoint/v3/contenttype/forms"/>
-  </ds:schemaRefs>
-</ds:datastoreItem>
-</file>
-
-<file path=customXml/itemProps5.xml><?xml version="1.0" encoding="utf-8"?>
-<ds:datastoreItem xmlns:ds="http://schemas.openxmlformats.org/officeDocument/2006/customXml" ds:itemID="{14D1F39E-8B56-417C-B337-6A9061C37D5D}">
-  <ds:schemaRefs>
-    <ds:schemaRef ds:uri="http://schemas.microsoft.com/office/2006/metadata/contentType"/>
-    <ds:schemaRef ds:uri="http://schemas.microsoft.com/office/2006/metadata/properties/metaAttributes"/>
-    <ds:schemaRef ds:uri="http://www.w3.org/2001/XMLSchema"/>
-    <ds:schemaRef ds:uri="http://schemas.microsoft.com/office/2006/metadata/properties"/>
-    <ds:schemaRef ds:uri="126e8a1c-9ea9-435a-ac89-d06c80d62e30"/>
-    <ds:schemaRef ds:uri="http://schemas.microsoft.com/office/2006/documentManagement/types"/>
-    <ds:schemaRef ds:uri="http://schemas.microsoft.com/office/infopath/2007/PartnerControls"/>
-    <ds:schemaRef ds:uri="http://schemas.openxmlformats.org/package/2006/metadata/core-properties"/>
-    <ds:schemaRef ds:uri="http://purl.org/dc/elements/1.1/"/>
-    <ds:schemaRef ds:uri="http://purl.org/dc/terms/"/>
-    <ds:schemaRef ds:uri="http://schemas.microsoft.com/internal/obd"/>
-  </ds:schemaRefs>
-</ds:datastoreItem>
 </file>
</xml_diff>

<commit_message>
cambiados colores de autoevaluacion
</commit_message>
<xml_diff>
--- a/Fase 1/Evidencias Individuales/Castro_Pablo_1.3_APT122_AutoevaluaciónFase1.docx
+++ b/Fase 1/Evidencias Individuales/Castro_Pablo_1.3_APT122_AutoevaluaciónFase1.docx
@@ -7425,14 +7425,14 @@
               <w:spacing w:before="0" w:after="0"/>
               <w:jc w:val="left"/>
               <w:rPr>
-                <w:rFonts w:asciiTheme="minorHAnsi" w:cstheme="minorBidi" w:eastAsiaTheme="minorEastAsia" w:hAnsiTheme="minorHAnsi"/>
+                <w:rFonts w:ascii="Calibri" w:hAnsi="Calibri" w:eastAsia="" w:cs="" w:asciiTheme="minorHAnsi" w:cstheme="minorBidi" w:eastAsiaTheme="minorEastAsia" w:hAnsiTheme="minorHAnsi"/>
                 <w:highlight w:val="none"/>
                 <w:shd w:fill="81D41A" w:val="clear"/>
               </w:rPr>
             </w:pPr>
             <w:r>
               <w:rPr>
-                <w:rFonts w:eastAsia="" w:cs="" w:cstheme="minorBidi" w:eastAsiaTheme="minorEastAsia" w:ascii="Calibri" w:hAnsi="Calibri"/>
+                <w:rFonts w:eastAsia="" w:cs="" w:ascii="Calibri" w:hAnsi="Calibri" w:cstheme="minorBidi" w:eastAsiaTheme="minorEastAsia"/>
                 <w:color w:themeColor="text1" w:val="000000"/>
                 <w:kern w:val="0"/>
                 <w:shd w:fill="81D41A" w:val="clear"/>
@@ -7719,14 +7719,14 @@
               <w:spacing w:before="0" w:after="0"/>
               <w:jc w:val="left"/>
               <w:rPr>
-                <w:rFonts w:asciiTheme="minorHAnsi" w:cstheme="minorBidi" w:eastAsiaTheme="minorEastAsia" w:hAnsiTheme="minorHAnsi"/>
+                <w:rFonts w:ascii="Calibri" w:hAnsi="Calibri" w:eastAsia="" w:cs="" w:asciiTheme="minorHAnsi" w:cstheme="minorBidi" w:eastAsiaTheme="minorEastAsia" w:hAnsiTheme="minorHAnsi"/>
                 <w:highlight w:val="none"/>
                 <w:shd w:fill="81D41A" w:val="clear"/>
               </w:rPr>
             </w:pPr>
             <w:r>
               <w:rPr>
-                <w:rFonts w:eastAsia="" w:cs="" w:cstheme="minorBidi" w:eastAsiaTheme="minorEastAsia" w:ascii="Calibri" w:hAnsi="Calibri"/>
+                <w:rFonts w:eastAsia="" w:cs="" w:ascii="Calibri" w:hAnsi="Calibri" w:cstheme="minorBidi" w:eastAsiaTheme="minorEastAsia"/>
                 <w:color w:themeColor="text1" w:val="000000"/>
                 <w:kern w:val="0"/>
                 <w:shd w:fill="81D41A" w:val="clear"/>
@@ -7939,14 +7939,14 @@
               <w:spacing w:before="0" w:after="0"/>
               <w:jc w:val="left"/>
               <w:rPr>
-                <w:rFonts w:asciiTheme="minorHAnsi" w:cstheme="minorBidi" w:eastAsiaTheme="minorEastAsia" w:hAnsiTheme="minorHAnsi"/>
+                <w:rFonts w:ascii="Calibri" w:hAnsi="Calibri" w:eastAsia="" w:cs="" w:asciiTheme="minorHAnsi" w:cstheme="minorBidi" w:eastAsiaTheme="minorEastAsia" w:hAnsiTheme="minorHAnsi"/>
                 <w:highlight w:val="none"/>
                 <w:shd w:fill="81D41A" w:val="clear"/>
               </w:rPr>
             </w:pPr>
             <w:r>
               <w:rPr>
-                <w:rFonts w:eastAsia="" w:cs="" w:cstheme="minorBidi" w:eastAsiaTheme="minorEastAsia" w:ascii="Calibri" w:hAnsi="Calibri"/>
+                <w:rFonts w:eastAsia="" w:cs="" w:ascii="Calibri" w:hAnsi="Calibri" w:cstheme="minorBidi" w:eastAsiaTheme="minorEastAsia"/>
                 <w:color w:themeColor="text1" w:val="000000"/>
                 <w:kern w:val="0"/>
                 <w:shd w:fill="81D41A" w:val="clear"/>
@@ -8255,41 +8255,6 @@
               <w:spacing w:before="0" w:after="0"/>
               <w:jc w:val="left"/>
               <w:rPr>
-                <w:rFonts w:ascii="Calibri" w:hAnsi="Calibri" w:eastAsia="" w:cs="" w:asciiTheme="minorHAnsi" w:cstheme="minorBidi" w:eastAsiaTheme="minorEastAsia" w:hAnsiTheme="minorHAnsi"/>
-                <w:color w:themeColor="text1" w:val="000000"/>
-                <w:lang w:eastAsia="es-CL"/>
-              </w:rPr>
-            </w:pPr>
-            <w:r>
-              <w:rPr>
-                <w:rFonts w:eastAsia="" w:cs="" w:ascii="Calibri" w:hAnsi="Calibri" w:asciiTheme="minorHAnsi" w:cstheme="minorBidi" w:eastAsiaTheme="minorEastAsia" w:hAnsiTheme="minorHAnsi"/>
-                <w:color w:themeColor="text1" w:val="000000"/>
-                <w:kern w:val="0"/>
-                <w:lang w:bidi="ar-SA"/>
-              </w:rPr>
-              <w:t>Formulé objetivos claros, concisos y coherentes con la disciplina y la situación a abordar.</w:t>
-            </w:r>
-          </w:p>
-        </w:tc>
-        <w:tc>
-          <w:tcPr>
-            <w:tcW w:w="2126" w:type="dxa"/>
-            <w:tcBorders>
-              <w:top w:val="single" w:sz="4" w:space="0" w:color="7F7F7F"/>
-              <w:left w:val="single" w:sz="4" w:space="0" w:color="7F7F7F"/>
-              <w:bottom w:val="single" w:sz="4" w:space="0" w:color="7F7F7F"/>
-              <w:right w:val="single" w:sz="4" w:space="0" w:color="7F7F7F"/>
-            </w:tcBorders>
-            <w:vAlign w:val="center"/>
-          </w:tcPr>
-          <w:p>
-            <w:pPr>
-              <w:pStyle w:val="Normal"/>
-              <w:widowControl/>
-              <w:suppressAutoHyphens w:val="true"/>
-              <w:spacing w:before="0" w:after="0"/>
-              <w:jc w:val="left"/>
-              <w:rPr>
                 <w:rFonts w:asciiTheme="minorHAnsi" w:cstheme="minorBidi" w:eastAsiaTheme="minorEastAsia" w:hAnsiTheme="minorHAnsi"/>
                 <w:highlight w:val="none"/>
                 <w:shd w:fill="81D41A" w:val="clear"/>
@@ -8301,6 +8266,42 @@
                 <w:color w:themeColor="text1" w:val="000000"/>
                 <w:kern w:val="0"/>
                 <w:shd w:fill="81D41A" w:val="clear"/>
+                <w:lang w:bidi="ar-SA"/>
+              </w:rPr>
+              <w:t>Formulé objetivos claros, concisos y coherentes con la disciplina y la situación a abordar.</w:t>
+            </w:r>
+          </w:p>
+        </w:tc>
+        <w:tc>
+          <w:tcPr>
+            <w:tcW w:w="2126" w:type="dxa"/>
+            <w:tcBorders>
+              <w:top w:val="single" w:sz="4" w:space="0" w:color="7F7F7F"/>
+              <w:left w:val="single" w:sz="4" w:space="0" w:color="7F7F7F"/>
+              <w:bottom w:val="single" w:sz="4" w:space="0" w:color="7F7F7F"/>
+              <w:right w:val="single" w:sz="4" w:space="0" w:color="7F7F7F"/>
+            </w:tcBorders>
+            <w:vAlign w:val="center"/>
+          </w:tcPr>
+          <w:p>
+            <w:pPr>
+              <w:pStyle w:val="Normal"/>
+              <w:widowControl/>
+              <w:suppressAutoHyphens w:val="true"/>
+              <w:spacing w:before="0" w:after="0"/>
+              <w:jc w:val="left"/>
+              <w:rPr>
+                <w:rFonts w:cstheme="minorBidi" w:eastAsiaTheme="minorEastAsia"/>
+                <w:highlight w:val="none"/>
+                <w:shd w:fill="auto" w:val="clear"/>
+              </w:rPr>
+            </w:pPr>
+            <w:r>
+              <w:rPr>
+                <w:rFonts w:eastAsia="" w:cs="" w:cstheme="minorBidi" w:eastAsiaTheme="minorEastAsia" w:ascii="Calibri" w:hAnsi="Calibri"/>
+                <w:color w:themeColor="text1" w:val="000000"/>
+                <w:kern w:val="0"/>
+                <w:shd w:fill="auto" w:val="clear"/>
                 <w:lang w:bidi="ar-SA"/>
               </w:rPr>
               <w:t>Formulé objetivos claros y coherentes con la situación a abordar, pero imprecisos de acuerdo a la disciplina.</w:t>
@@ -8475,14 +8476,14 @@
               <w:spacing w:before="0" w:after="0"/>
               <w:jc w:val="left"/>
               <w:rPr>
-                <w:rFonts w:asciiTheme="minorHAnsi" w:cstheme="minorBidi" w:eastAsiaTheme="minorEastAsia" w:hAnsiTheme="minorHAnsi"/>
+                <w:rFonts w:ascii="Calibri" w:hAnsi="Calibri" w:eastAsia="" w:cs="" w:asciiTheme="minorHAnsi" w:cstheme="minorBidi" w:eastAsiaTheme="minorEastAsia" w:hAnsiTheme="minorHAnsi"/>
                 <w:highlight w:val="none"/>
                 <w:shd w:fill="81D41A" w:val="clear"/>
               </w:rPr>
             </w:pPr>
             <w:r>
               <w:rPr>
-                <w:rFonts w:eastAsia="" w:cs="" w:cstheme="minorBidi" w:eastAsiaTheme="minorEastAsia" w:ascii="Calibri" w:hAnsi="Calibri"/>
+                <w:rFonts w:eastAsia="" w:cs="" w:ascii="Calibri" w:hAnsi="Calibri" w:cstheme="minorBidi" w:eastAsiaTheme="minorEastAsia"/>
                 <w:color w:themeColor="text1" w:val="000000"/>
                 <w:kern w:val="0"/>
                 <w:shd w:fill="81D41A" w:val="clear"/>
@@ -8716,14 +8717,14 @@
               <w:spacing w:before="0" w:after="0"/>
               <w:jc w:val="left"/>
               <w:rPr>
-                <w:rFonts w:asciiTheme="minorHAnsi" w:cstheme="minorBidi" w:eastAsiaTheme="minorEastAsia" w:hAnsiTheme="minorHAnsi"/>
+                <w:rFonts w:ascii="Calibri" w:hAnsi="Calibri" w:eastAsia="" w:cs="" w:asciiTheme="minorHAnsi" w:cstheme="minorBidi" w:eastAsiaTheme="minorEastAsia" w:hAnsiTheme="minorHAnsi"/>
                 <w:highlight w:val="none"/>
                 <w:shd w:fill="81D41A" w:val="clear"/>
               </w:rPr>
             </w:pPr>
             <w:r>
               <w:rPr>
-                <w:rFonts w:eastAsia="" w:cs="" w:cstheme="minorBidi" w:eastAsiaTheme="minorEastAsia" w:ascii="Calibri" w:hAnsi="Calibri"/>
+                <w:rFonts w:eastAsia="" w:cs="" w:ascii="Calibri" w:hAnsi="Calibri" w:cstheme="minorBidi" w:eastAsiaTheme="minorEastAsia"/>
                 <w:color w:themeColor="text1" w:val="000000"/>
                 <w:kern w:val="0"/>
                 <w:shd w:fill="81D41A" w:val="clear"/>
@@ -8936,14 +8937,14 @@
               <w:spacing w:before="0" w:after="0"/>
               <w:jc w:val="left"/>
               <w:rPr>
-                <w:rFonts w:asciiTheme="minorHAnsi" w:cstheme="minorBidi" w:eastAsiaTheme="minorEastAsia" w:hAnsiTheme="minorHAnsi"/>
+                <w:rFonts w:ascii="Calibri" w:hAnsi="Calibri" w:eastAsia="" w:cs="" w:asciiTheme="minorHAnsi" w:cstheme="minorBidi" w:eastAsiaTheme="minorEastAsia" w:hAnsiTheme="minorHAnsi"/>
                 <w:highlight w:val="none"/>
                 <w:shd w:fill="81D41A" w:val="clear"/>
               </w:rPr>
             </w:pPr>
             <w:r>
               <w:rPr>
-                <w:rFonts w:eastAsia="" w:cs="" w:cstheme="minorBidi" w:eastAsiaTheme="minorEastAsia" w:ascii="Calibri" w:hAnsi="Calibri"/>
+                <w:rFonts w:eastAsia="" w:cs="" w:ascii="Calibri" w:hAnsi="Calibri" w:cstheme="minorBidi" w:eastAsiaTheme="minorEastAsia"/>
                 <w:color w:themeColor="text1" w:val="000000"/>
                 <w:kern w:val="0"/>
                 <w:shd w:fill="81D41A" w:val="clear"/>
@@ -9155,16 +9156,16 @@
               <w:spacing w:before="0" w:after="0"/>
               <w:jc w:val="left"/>
               <w:rPr>
-                <w:rFonts w:ascii="Calibri" w:hAnsi="Calibri" w:eastAsia="" w:cs="" w:asciiTheme="minorHAnsi" w:cstheme="minorBidi" w:eastAsiaTheme="minorEastAsia" w:hAnsiTheme="minorHAnsi"/>
-                <w:color w:themeColor="text1" w:val="000000"/>
-                <w:lang w:eastAsia="es-CL"/>
-              </w:rPr>
-            </w:pPr>
-            <w:r>
-              <w:rPr>
-                <w:rFonts w:eastAsia="" w:cs="" w:ascii="Calibri" w:hAnsi="Calibri" w:asciiTheme="minorHAnsi" w:cstheme="minorBidi" w:eastAsiaTheme="minorEastAsia" w:hAnsiTheme="minorHAnsi"/>
-                <w:color w:themeColor="text1" w:val="000000"/>
-                <w:kern w:val="0"/>
+                <w:highlight w:val="none"/>
+                <w:shd w:fill="81D41A" w:val="clear"/>
+              </w:rPr>
+            </w:pPr>
+            <w:r>
+              <w:rPr>
+                <w:rFonts w:eastAsia="" w:cs="" w:ascii="Calibri" w:hAnsi="Calibri"/>
+                <w:color w:themeColor="text1" w:val="000000"/>
+                <w:kern w:val="0"/>
+                <w:shd w:fill="81D41A" w:val="clear"/>
                 <w:lang w:bidi="ar-SA"/>
               </w:rPr>
               <w:t>El texto cumple con las reglas ortografía y de redacción en todos sus apartados.</w:t>
@@ -9172,15 +9173,17 @@
             <w:r>
               <w:rPr>
                 <w:kern w:val="0"/>
+                <w:shd w:fill="81D41A" w:val="clear"/>
                 <w:lang w:bidi="ar-SA"/>
               </w:rPr>
               <w:br/>
             </w:r>
             <w:r>
               <w:rPr>
-                <w:rFonts w:eastAsia="" w:cs="" w:ascii="Calibri" w:hAnsi="Calibri" w:asciiTheme="minorHAnsi" w:cstheme="minorBidi" w:eastAsiaTheme="minorEastAsia" w:hAnsiTheme="minorHAnsi"/>
-                <w:color w:themeColor="text1" w:val="000000"/>
-                <w:kern w:val="0"/>
+                <w:rFonts w:eastAsia="" w:cs="" w:ascii="Calibri" w:hAnsi="Calibri"/>
+                <w:color w:themeColor="text1" w:val="000000"/>
+                <w:kern w:val="0"/>
+                <w:shd w:fill="81D41A" w:val="clear"/>
                 <w:lang w:bidi="ar-SA"/>
               </w:rPr>
               <w:t>Y</w:t>
@@ -9188,15 +9191,17 @@
             <w:r>
               <w:rPr>
                 <w:kern w:val="0"/>
+                <w:shd w:fill="81D41A" w:val="clear"/>
                 <w:lang w:bidi="ar-SA"/>
               </w:rPr>
               <w:br/>
             </w:r>
             <w:r>
               <w:rPr>
-                <w:rFonts w:eastAsia="" w:cs="" w:ascii="Calibri" w:hAnsi="Calibri" w:asciiTheme="minorHAnsi" w:cstheme="minorBidi" w:eastAsiaTheme="minorEastAsia" w:hAnsiTheme="minorHAnsi"/>
-                <w:color w:themeColor="text1" w:val="000000"/>
-                <w:kern w:val="0"/>
+                <w:rFonts w:eastAsia="" w:cs="" w:ascii="Calibri" w:hAnsi="Calibri"/>
+                <w:color w:themeColor="text1" w:val="000000"/>
+                <w:kern w:val="0"/>
+                <w:shd w:fill="81D41A" w:val="clear"/>
                 <w:lang w:bidi="ar-SA"/>
               </w:rPr>
               <w:t>Utilicé correctamente todas las normas de citación y referencias.</w:t>
@@ -9222,9 +9227,9 @@
               <w:spacing w:before="0" w:after="0"/>
               <w:jc w:val="left"/>
               <w:rPr>
-                <w:rFonts w:asciiTheme="minorHAnsi" w:cstheme="minorBidi" w:eastAsiaTheme="minorEastAsia" w:hAnsiTheme="minorHAnsi"/>
+                <w:rFonts w:cstheme="minorBidi" w:eastAsiaTheme="minorEastAsia"/>
                 <w:highlight w:val="none"/>
-                <w:shd w:fill="81D41A" w:val="clear"/>
+                <w:shd w:fill="auto" w:val="clear"/>
               </w:rPr>
             </w:pPr>
             <w:r>
@@ -9232,7 +9237,7 @@
                 <w:rFonts w:eastAsia="" w:cs="" w:cstheme="minorBidi" w:eastAsiaTheme="minorEastAsia" w:ascii="Calibri" w:hAnsi="Calibri"/>
                 <w:color w:themeColor="text1" w:val="000000"/>
                 <w:kern w:val="0"/>
-                <w:shd w:fill="81D41A" w:val="clear"/>
+                <w:shd w:fill="auto" w:val="clear"/>
                 <w:lang w:bidi="ar-SA"/>
               </w:rPr>
               <w:t>El texto presenta de 1 a 5 errores de ortografía, redacción o en las citas y referencias del informe.</w:t>
@@ -9407,14 +9412,14 @@
               <w:spacing w:before="0" w:after="0"/>
               <w:jc w:val="left"/>
               <w:rPr>
-                <w:rFonts w:asciiTheme="minorHAnsi" w:cstheme="minorBidi" w:eastAsiaTheme="minorEastAsia" w:hAnsiTheme="minorHAnsi"/>
+                <w:rFonts w:ascii="Calibri" w:hAnsi="Calibri" w:eastAsia="" w:cs="" w:asciiTheme="minorHAnsi" w:cstheme="minorBidi" w:eastAsiaTheme="minorEastAsia" w:hAnsiTheme="minorHAnsi"/>
                 <w:highlight w:val="none"/>
                 <w:shd w:fill="81D41A" w:val="clear"/>
               </w:rPr>
             </w:pPr>
             <w:r>
               <w:rPr>
-                <w:rFonts w:eastAsia="" w:cs="" w:cstheme="minorBidi" w:eastAsiaTheme="minorEastAsia" w:ascii="Calibri" w:hAnsi="Calibri"/>
+                <w:rFonts w:eastAsia="" w:cs="" w:ascii="Calibri" w:hAnsi="Calibri" w:cstheme="minorBidi" w:eastAsiaTheme="minorEastAsia"/>
                 <w:color w:themeColor="text1" w:val="000000"/>
                 <w:kern w:val="0"/>
                 <w:shd w:fill="81D41A" w:val="clear"/>
@@ -9627,14 +9632,14 @@
               <w:spacing w:before="0" w:after="0"/>
               <w:jc w:val="left"/>
               <w:rPr>
-                <w:rFonts w:asciiTheme="minorHAnsi" w:cstheme="minorBidi" w:eastAsiaTheme="minorEastAsia" w:hAnsiTheme="minorHAnsi"/>
+                <w:rFonts w:ascii="Calibri" w:hAnsi="Calibri" w:eastAsia="" w:cs="" w:asciiTheme="minorHAnsi" w:cstheme="minorBidi" w:eastAsiaTheme="minorEastAsia" w:hAnsiTheme="minorHAnsi"/>
                 <w:highlight w:val="none"/>
                 <w:shd w:fill="81D41A" w:val="clear"/>
               </w:rPr>
             </w:pPr>
             <w:r>
               <w:rPr>
-                <w:rFonts w:eastAsia="" w:cs="" w:cstheme="minorBidi" w:eastAsiaTheme="minorEastAsia" w:ascii="Calibri" w:hAnsi="Calibri"/>
+                <w:rFonts w:eastAsia="" w:cs="" w:ascii="Calibri" w:hAnsi="Calibri" w:cstheme="minorBidi" w:eastAsiaTheme="minorEastAsia"/>
                 <w:color w:themeColor="text1" w:val="000000"/>
                 <w:kern w:val="0"/>
                 <w:shd w:fill="81D41A" w:val="clear"/>
@@ -9885,39 +9890,6 @@
               <w:spacing w:before="0" w:after="0"/>
               <w:jc w:val="left"/>
               <w:rPr>
-                <w:rFonts w:ascii="Calibri" w:hAnsi="Calibri" w:eastAsia="Calibri" w:cs="Calibri" w:asciiTheme="minorHAnsi" w:cstheme="minorHAnsi" w:hAnsiTheme="minorHAnsi"/>
-                <w:color w:themeColor="text1" w:val="000000"/>
-              </w:rPr>
-            </w:pPr>
-            <w:r>
-              <w:rPr>
-                <w:rFonts w:cs="Calibri" w:ascii="Calibri" w:hAnsi="Calibri" w:asciiTheme="minorHAnsi" w:cstheme="minorHAnsi" w:hAnsiTheme="minorHAnsi"/>
-                <w:kern w:val="0"/>
-                <w:lang w:bidi="ar-SA"/>
-              </w:rPr>
-              <w:t>Redacta los textos en inglés siguiendo una secuencia lógica en la que todas las oraciones se conectan de manera fluida y comprensible,  utilizando en forma correcta las estructuras gramaticales y el vocabulario pertinentes al tema.</w:t>
-            </w:r>
-          </w:p>
-        </w:tc>
-        <w:tc>
-          <w:tcPr>
-            <w:tcW w:w="2126" w:type="dxa"/>
-            <w:tcBorders>
-              <w:top w:val="single" w:sz="4" w:space="0" w:color="7F7F7F"/>
-              <w:left w:val="single" w:sz="4" w:space="0" w:color="7F7F7F"/>
-              <w:bottom w:val="single" w:sz="4" w:space="0" w:color="7F7F7F"/>
-              <w:right w:val="single" w:sz="4" w:space="0" w:color="7F7F7F"/>
-            </w:tcBorders>
-            <w:vAlign w:val="center"/>
-          </w:tcPr>
-          <w:p>
-            <w:pPr>
-              <w:pStyle w:val="Normal"/>
-              <w:widowControl/>
-              <w:suppressAutoHyphens w:val="true"/>
-              <w:spacing w:before="0" w:after="0"/>
-              <w:jc w:val="left"/>
-              <w:rPr>
                 <w:rFonts w:asciiTheme="minorHAnsi" w:cstheme="minorHAnsi" w:hAnsiTheme="minorHAnsi"/>
                 <w:highlight w:val="none"/>
                 <w:shd w:fill="81D41A" w:val="clear"/>
@@ -9928,6 +9900,41 @@
                 <w:rFonts w:cs="Calibri" w:cstheme="minorHAnsi" w:ascii="Calibri" w:hAnsi="Calibri"/>
                 <w:kern w:val="0"/>
                 <w:shd w:fill="81D41A" w:val="clear"/>
+                <w:lang w:bidi="ar-SA"/>
+              </w:rPr>
+              <w:t>Redacta los textos en inglés siguiendo una secuencia lógica en la que todas las oraciones se conectan de manera fluida y comprensible,  utilizando en forma correcta las estructuras gramaticales y el vocabulario pertinentes al tema.</w:t>
+            </w:r>
+          </w:p>
+        </w:tc>
+        <w:tc>
+          <w:tcPr>
+            <w:tcW w:w="2126" w:type="dxa"/>
+            <w:tcBorders>
+              <w:top w:val="single" w:sz="4" w:space="0" w:color="7F7F7F"/>
+              <w:left w:val="single" w:sz="4" w:space="0" w:color="7F7F7F"/>
+              <w:bottom w:val="single" w:sz="4" w:space="0" w:color="7F7F7F"/>
+              <w:right w:val="single" w:sz="4" w:space="0" w:color="7F7F7F"/>
+            </w:tcBorders>
+            <w:vAlign w:val="center"/>
+          </w:tcPr>
+          <w:p>
+            <w:pPr>
+              <w:pStyle w:val="Normal"/>
+              <w:widowControl/>
+              <w:suppressAutoHyphens w:val="true"/>
+              <w:spacing w:before="0" w:after="0"/>
+              <w:jc w:val="left"/>
+              <w:rPr>
+                <w:rFonts w:cstheme="minorHAnsi"/>
+                <w:highlight w:val="none"/>
+                <w:shd w:fill="auto" w:val="clear"/>
+              </w:rPr>
+            </w:pPr>
+            <w:r>
+              <w:rPr>
+                <w:rFonts w:cs="Calibri" w:cstheme="minorHAnsi" w:ascii="Calibri" w:hAnsi="Calibri"/>
+                <w:kern w:val="0"/>
+                <w:shd w:fill="auto" w:val="clear"/>
                 <w:lang w:bidi="ar-SA"/>
               </w:rPr>
               <w:t>Redacta los textos en inglés siguiendo una secuencia lógica en la que gran parte de las oraciones se conectan de manera fluida y comprensible,  utilizando en forma correcta la mayoría de las estructuras gramaticales y el vocabulario pertinentes al tema.</w:t>
@@ -10237,7 +10244,7 @@
       <mc:AlternateContent>
         <mc:Choice Requires="wps">
           <w:drawing>
-            <wp:anchor behindDoc="1" distT="0" distB="11430" distL="0" distR="0" simplePos="0" locked="0" layoutInCell="0" allowOverlap="1" relativeHeight="27" wp14:anchorId="3CF0A8BB">
+            <wp:anchor behindDoc="1" distT="0" distB="15240" distL="0" distR="0" simplePos="0" locked="0" layoutInCell="0" allowOverlap="1" relativeHeight="27" wp14:anchorId="3CF0A8BB">
               <wp:simplePos x="0" y="0"/>
               <wp:positionH relativeFrom="rightMargin">
                 <wp:align>left</wp:align>
@@ -10329,7 +10336,7 @@
                               <w:rFonts w:cs="Arial" w:ascii="Arial" w:hAnsi="Arial"/>
                               <w:color w:themeColor="background1" w:val="FFFFFF"/>
                             </w:rPr>
-                            <w:t>8</w:t>
+                            <w:t>13</w:t>
                           </w:r>
                           <w:r>
                             <w:rPr>
@@ -10405,7 +10412,7 @@
                         <w:rFonts w:cs="Arial" w:ascii="Arial" w:hAnsi="Arial"/>
                         <w:color w:themeColor="background1" w:val="FFFFFF"/>
                       </w:rPr>
-                      <w:t>8</w:t>
+                      <w:t>13</w:t>
                     </w:r>
                     <w:r>
                       <w:rPr>
@@ -10427,7 +10434,7 @@
       <mc:AlternateContent>
         <mc:Choice Requires="wpg">
           <w:drawing>
-            <wp:anchor behindDoc="1" distT="0" distB="11430" distL="0" distR="0" simplePos="0" locked="0" layoutInCell="0" allowOverlap="1" relativeHeight="53" wp14:anchorId="0F25DB77">
+            <wp:anchor behindDoc="1" distT="0" distB="15240" distL="0" distR="0" simplePos="0" locked="0" layoutInCell="0" allowOverlap="1" relativeHeight="53" wp14:anchorId="0F25DB77">
               <wp:simplePos x="0" y="0"/>
               <wp:positionH relativeFrom="margin">
                 <wp:align>right</wp:align>
@@ -10457,7 +10464,7 @@
                       <wps:spPr>
                         <a:xfrm>
                           <a:off x="19080" y="0"/>
-                          <a:ext cx="5924520" cy="16560"/>
+                          <a:ext cx="5924520" cy="15840"/>
                         </a:xfrm>
                         <a:prstGeom prst="rect">
                           <a:avLst/>
@@ -10584,7 +10591,7 @@
         <mc:Fallback>
           <w:pict>
             <v:group id="shape_0" alt="Grupo 37" style="position:absolute;margin-left:182.15pt;margin-top:555.25pt;width:468pt;height:25.2pt" coordorigin="3643,11105" coordsize="9360,504">
-              <v:rect id="shape_0" ID="Rectángulo 38" path="m0,0l-2147483645,0l-2147483645,-2147483646l0,-2147483646xe" fillcolor="black" stroked="f" o:allowincell="f" style="position:absolute;left:3673;top:11105;width:9329;height:25;mso-wrap-style:none;v-text-anchor:middle;mso-position-horizontal:right;mso-position-horizontal-relative:margin;mso-position-vertical-relative:page">
+              <v:rect id="shape_0" ID="Rectángulo 38" path="m0,0l-2147483645,0l-2147483645,-2147483646l0,-2147483646xe" fillcolor="black" stroked="f" o:allowincell="f" style="position:absolute;left:3673;top:11105;width:9329;height:24;mso-wrap-style:none;v-text-anchor:middle;mso-position-horizontal:right;mso-position-horizontal-relative:margin;mso-position-vertical-relative:page">
                 <v:fill o:detectmouseclick="t" type="solid" color2="white"/>
                 <v:stroke color="#3465a4" weight="12600" joinstyle="miter" endcap="flat"/>
                 <w10:wrap type="square"/>
@@ -10677,7 +10684,7 @@
       <mc:AlternateContent>
         <mc:Choice Requires="wps">
           <w:drawing>
-            <wp:anchor behindDoc="1" distT="0" distB="11430" distL="0" distR="0" simplePos="0" locked="0" layoutInCell="0" allowOverlap="1" relativeHeight="27" wp14:anchorId="3CF0A8BB">
+            <wp:anchor behindDoc="1" distT="0" distB="15240" distL="0" distR="0" simplePos="0" locked="0" layoutInCell="0" allowOverlap="1" relativeHeight="27" wp14:anchorId="3CF0A8BB">
               <wp:simplePos x="0" y="0"/>
               <wp:positionH relativeFrom="rightMargin">
                 <wp:align>left</wp:align>
@@ -10769,7 +10776,7 @@
                               <w:rFonts w:cs="Arial" w:ascii="Arial" w:hAnsi="Arial"/>
                               <w:color w:themeColor="background1" w:val="FFFFFF"/>
                             </w:rPr>
-                            <w:t>8</w:t>
+                            <w:t>13</w:t>
                           </w:r>
                           <w:r>
                             <w:rPr>
@@ -10845,7 +10852,7 @@
                         <w:rFonts w:cs="Arial" w:ascii="Arial" w:hAnsi="Arial"/>
                         <w:color w:themeColor="background1" w:val="FFFFFF"/>
                       </w:rPr>
-                      <w:t>8</w:t>
+                      <w:t>13</w:t>
                     </w:r>
                     <w:r>
                       <w:rPr>
@@ -10867,7 +10874,7 @@
       <mc:AlternateContent>
         <mc:Choice Requires="wpg">
           <w:drawing>
-            <wp:anchor behindDoc="1" distT="0" distB="11430" distL="0" distR="0" simplePos="0" locked="0" layoutInCell="0" allowOverlap="1" relativeHeight="53" wp14:anchorId="0F25DB77">
+            <wp:anchor behindDoc="1" distT="0" distB="15240" distL="0" distR="0" simplePos="0" locked="0" layoutInCell="0" allowOverlap="1" relativeHeight="53" wp14:anchorId="0F25DB77">
               <wp:simplePos x="0" y="0"/>
               <wp:positionH relativeFrom="margin">
                 <wp:align>right</wp:align>
@@ -10897,7 +10904,7 @@
                       <wps:spPr>
                         <a:xfrm>
                           <a:off x="19080" y="0"/>
-                          <a:ext cx="5924520" cy="16560"/>
+                          <a:ext cx="5924520" cy="15840"/>
                         </a:xfrm>
                         <a:prstGeom prst="rect">
                           <a:avLst/>
@@ -11024,7 +11031,7 @@
         <mc:Fallback>
           <w:pict>
             <v:group id="shape_0" alt="Grupo 37" style="position:absolute;margin-left:182.15pt;margin-top:555.25pt;width:468pt;height:25.2pt" coordorigin="3643,11105" coordsize="9360,504">
-              <v:rect id="shape_0" ID="Rectángulo 38" path="m0,0l-2147483645,0l-2147483645,-2147483646l0,-2147483646xe" fillcolor="black" stroked="f" o:allowincell="f" style="position:absolute;left:3673;top:11105;width:9329;height:25;mso-wrap-style:none;v-text-anchor:middle;mso-position-horizontal:right;mso-position-horizontal-relative:margin;mso-position-vertical-relative:page">
+              <v:rect id="shape_0" ID="Rectángulo 38" path="m0,0l-2147483645,0l-2147483645,-2147483646l0,-2147483646xe" fillcolor="black" stroked="f" o:allowincell="f" style="position:absolute;left:3673;top:11105;width:9329;height:24;mso-wrap-style:none;v-text-anchor:middle;mso-position-horizontal:right;mso-position-horizontal-relative:margin;mso-position-vertical-relative:page">
                 <v:fill o:detectmouseclick="t" type="solid" color2="white"/>
                 <v:stroke color="#3465a4" weight="12600" joinstyle="miter" endcap="flat"/>
                 <w10:wrap type="square"/>
@@ -11147,18 +11154,18 @@
           <wp:effectExtent l="0" t="0" r="0" b="0"/>
           <wp:wrapTight wrapText="bothSides">
             <wp:wrapPolygon edited="0">
-              <wp:start x="7749" y="3167"/>
-              <wp:lineTo x="2201" y="5090"/>
-              <wp:lineTo x="1458" y="6379"/>
-              <wp:lineTo x="1458" y="16036"/>
-              <wp:lineTo x="7749" y="18614"/>
-              <wp:lineTo x="8675" y="18614"/>
-              <wp:lineTo x="19403" y="15402"/>
-              <wp:lineTo x="19403" y="14747"/>
-              <wp:lineTo x="20145" y="8957"/>
-              <wp:lineTo x="18666" y="5090"/>
-              <wp:lineTo x="8675" y="3167"/>
-              <wp:lineTo x="7749" y="3167"/>
+              <wp:start x="7742" y="3145"/>
+              <wp:lineTo x="2195" y="5068"/>
+              <wp:lineTo x="1452" y="6357"/>
+              <wp:lineTo x="1452" y="16014"/>
+              <wp:lineTo x="7742" y="18593"/>
+              <wp:lineTo x="8669" y="18593"/>
+              <wp:lineTo x="19397" y="15380"/>
+              <wp:lineTo x="19397" y="14725"/>
+              <wp:lineTo x="20139" y="8935"/>
+              <wp:lineTo x="18660" y="5068"/>
+              <wp:lineTo x="8669" y="3145"/>
+              <wp:lineTo x="7742" y="3145"/>
             </wp:wrapPolygon>
           </wp:wrapTight>
           <wp:docPr id="1" name="Imagen 4" descr=""/>
@@ -11234,18 +11241,18 @@
           <wp:effectExtent l="0" t="0" r="0" b="0"/>
           <wp:wrapTight wrapText="bothSides">
             <wp:wrapPolygon edited="0">
-              <wp:start x="7749" y="3167"/>
-              <wp:lineTo x="2201" y="5090"/>
-              <wp:lineTo x="1458" y="6379"/>
-              <wp:lineTo x="1458" y="16036"/>
-              <wp:lineTo x="7749" y="18614"/>
-              <wp:lineTo x="8675" y="18614"/>
-              <wp:lineTo x="19403" y="15402"/>
-              <wp:lineTo x="19403" y="14747"/>
-              <wp:lineTo x="20145" y="8957"/>
-              <wp:lineTo x="18666" y="5090"/>
-              <wp:lineTo x="8675" y="3167"/>
-              <wp:lineTo x="7749" y="3167"/>
+              <wp:start x="7742" y="3145"/>
+              <wp:lineTo x="2195" y="5068"/>
+              <wp:lineTo x="1452" y="6357"/>
+              <wp:lineTo x="1452" y="16014"/>
+              <wp:lineTo x="7742" y="18593"/>
+              <wp:lineTo x="8669" y="18593"/>
+              <wp:lineTo x="19397" y="15380"/>
+              <wp:lineTo x="19397" y="14725"/>
+              <wp:lineTo x="20139" y="8935"/>
+              <wp:lineTo x="18660" y="5068"/>
+              <wp:lineTo x="8669" y="3145"/>
+              <wp:lineTo x="7742" y="3145"/>
             </wp:wrapPolygon>
           </wp:wrapTight>
           <wp:docPr id="2" name="Imagen 4" descr=""/>

</xml_diff>